<commit_message>
Agrega la portada del informe de Clínica Los Carrera al informe Fricke
La portada (bloque gris con los datos, foto y logo Critical Power, y su
encabezado) se toma del informe de Los Carrera al crear la plantilla. Reemplaza
el cuadro de datos inicial; el índice pasa a la página 2 con los números de
página corregidos.

Co-Authored-By: Claude Opus 5.5 <noreply@anthropic.com>
</commit_message>
<xml_diff>
--- a/backend/plantillas/fricke_mantencion.docx
+++ b/backend/plantillas/fricke_mantencion.docx
@@ -4,247 +4,2438 @@
   <w:body>
     <w:p>
       <w:pPr>
-        <w:pBdr>
-          <w:top w:val="single" w:sz="4" w:space="1" w:color="D9D9D9"/>
-          <w:left w:val="single" w:sz="4" w:space="1" w:color="D9D9D9"/>
-          <w:bottom w:val="single" w:sz="4" w:space="1" w:color="D9D9D9"/>
-          <w:right w:val="single" w:sz="4" w:space="0" w:color="D9D9D9"/>
-          <w:between w:val="single" w:sz="4" w:space="1" w:color="D9D9D9"/>
-          <w:bar w:val="single" w:sz="4" w:color="auto"/>
-        </w:pBdr>
-        <w:tabs>
-          <w:tab w:val="left" w:pos="1418"/>
-          <w:tab w:val="left" w:pos="1701"/>
-          <w:tab w:val="left" w:pos="6237"/>
-          <w:tab w:val="left" w:pos="7513"/>
-          <w:tab w:val="left" w:pos="7655"/>
-        </w:tabs>
-        <w:spacing w:after="100" w:afterAutospacing="1"/>
-        <w:contextualSpacing/>
+        <w:pStyle w:val="Sinespaciado"/>
         <w:rPr>
-          <w:lang w:val="es-ES"/>
+          <w:lang w:val="es-CL"/>
         </w:rPr>
       </w:pPr>
-      <w:bookmarkStart w:id="0" w:name="_Hlk47435879"/>
-      <w:bookmarkStart w:id="1" w:name="_Toc238292986"/>
-      <w:bookmarkEnd w:id="0"/>
+      <w:bookmarkStart w:id="0" w:name="_Toc238292986"/>
       <w:r>
         <w:rPr>
-          <w:lang w:val="es-ES"/>
+          <w:noProof/>
+          <w:lang w:val="es-CL" w:eastAsia="es-CL"/>
         </w:rPr>
-        <w:t xml:space="preserve">EMPRESA </w:t>
-      </w:r>
-      <w:r>
-        <w:rPr>
-          <w:lang w:val="es-ES"/>
-        </w:rPr>
-        <w:tab/>
-        <w:t>:</w:t>
-      </w:r>
-      <w:r>
-        <w:rPr>
-          <w:lang w:val="es-ES"/>
-        </w:rPr>
-        <w:t xml:space="preserve"> </w:t>
-      </w:r>
-      <w:r>
-        <w:rPr>
-          <w:lang w:val="es-ES"/>
-        </w:rPr>
-        <w:t xml:space="preserve">{{EMPRESA}}</w:t>
-      </w:r>
-    </w:p>
-    <w:p>
-      <w:pPr>
-        <w:pBdr>
-          <w:top w:val="single" w:sz="4" w:space="1" w:color="D9D9D9"/>
-          <w:left w:val="single" w:sz="4" w:space="1" w:color="D9D9D9"/>
-          <w:bottom w:val="single" w:sz="4" w:space="1" w:color="D9D9D9"/>
-          <w:right w:val="single" w:sz="4" w:space="0" w:color="D9D9D9"/>
-          <w:between w:val="single" w:sz="4" w:space="1" w:color="D9D9D9"/>
-          <w:bar w:val="single" w:sz="4" w:color="auto"/>
-        </w:pBdr>
-        <w:tabs>
-          <w:tab w:val="left" w:pos="1418"/>
-          <w:tab w:val="left" w:pos="1701"/>
-          <w:tab w:val="left" w:pos="5387"/>
-          <w:tab w:val="left" w:pos="6237"/>
-          <w:tab w:val="left" w:pos="7513"/>
-          <w:tab w:val="left" w:pos="7655"/>
-        </w:tabs>
-        <w:spacing w:after="100" w:afterAutospacing="1"/>
-        <w:contextualSpacing/>
-        <w:rPr>
-          <w:lang w:val="es-ES"/>
-        </w:rPr>
-      </w:pPr>
-      <w:r>
-        <w:rPr>
-          <w:lang w:val="es-ES"/>
-        </w:rPr>
-        <w:t>ATENCIÓN</w:t>
-      </w:r>
-      <w:r>
-        <w:rPr>
-          <w:lang w:val="es-ES"/>
-        </w:rPr>
-        <w:tab/>
-      </w:r>
-      <w:r>
-        <w:rPr>
-          <w:lang w:val="es-ES"/>
-        </w:rPr>
-        <w:t xml:space="preserve">: </w:t>
-      </w:r>
-      <w:r>
-        <w:rPr>
-          <w:lang w:val="es-ES"/>
-        </w:rPr>
-        <w:t xml:space="preserve">{{ATENCION}}</w:t>
-      </w:r>
-    </w:p>
-    <w:p>
-      <w:pPr>
-        <w:pBdr>
-          <w:top w:val="single" w:sz="4" w:space="1" w:color="D9D9D9"/>
-          <w:left w:val="single" w:sz="4" w:space="1" w:color="D9D9D9"/>
-          <w:bottom w:val="single" w:sz="4" w:space="1" w:color="D9D9D9"/>
-          <w:right w:val="single" w:sz="4" w:space="0" w:color="D9D9D9"/>
-          <w:between w:val="single" w:sz="4" w:space="1" w:color="D9D9D9"/>
-          <w:bar w:val="single" w:sz="4" w:color="auto"/>
-        </w:pBdr>
-        <w:tabs>
-          <w:tab w:val="left" w:pos="1418"/>
-          <w:tab w:val="left" w:pos="1701"/>
-          <w:tab w:val="left" w:pos="5954"/>
-          <w:tab w:val="left" w:pos="7513"/>
-          <w:tab w:val="left" w:pos="7655"/>
-        </w:tabs>
-        <w:spacing w:after="100" w:afterAutospacing="1"/>
-        <w:contextualSpacing/>
-        <w:rPr>
-          <w:lang w:val="es-ES"/>
-        </w:rPr>
-      </w:pPr>
-      <w:r>
-        <w:rPr>
-          <w:lang w:val="es-ES"/>
-        </w:rPr>
-        <w:t>ASUNTO</w:t>
-      </w:r>
-      <w:r>
-        <w:rPr>
-          <w:lang w:val="es-ES"/>
-        </w:rPr>
-        <w:tab/>
-      </w:r>
-      <w:r>
-        <w:rPr>
-          <w:lang w:val="es-ES"/>
-        </w:rPr>
-        <w:t xml:space="preserve">: </w:t>
-      </w:r>
-      <w:r>
-        <w:rPr>
-          <w:lang w:val="es-ES"/>
-        </w:rPr>
-        <w:t xml:space="preserve">{{ASUNTO}}</w:t>
-      </w:r>
-    </w:p>
-    <w:p>
-      <w:pPr>
-        <w:pBdr>
-          <w:top w:val="single" w:sz="4" w:space="1" w:color="D9D9D9"/>
-          <w:left w:val="single" w:sz="4" w:space="1" w:color="D9D9D9"/>
-          <w:bottom w:val="single" w:sz="4" w:space="1" w:color="D9D9D9"/>
-          <w:right w:val="single" w:sz="4" w:space="0" w:color="D9D9D9"/>
-          <w:between w:val="single" w:sz="4" w:space="1" w:color="D9D9D9"/>
-          <w:bar w:val="single" w:sz="4" w:color="auto"/>
-        </w:pBdr>
-        <w:tabs>
-          <w:tab w:val="left" w:pos="1418"/>
-          <w:tab w:val="left" w:pos="1701"/>
-          <w:tab w:val="left" w:pos="5954"/>
-          <w:tab w:val="left" w:pos="7513"/>
-          <w:tab w:val="left" w:pos="7655"/>
-        </w:tabs>
-        <w:spacing w:after="100" w:afterAutospacing="1"/>
-        <w:contextualSpacing/>
-        <w:rPr>
-          <w:lang w:val="es-ES"/>
-        </w:rPr>
-      </w:pPr>
-      <w:r>
-        <w:rPr>
-          <w:lang w:val="es-ES"/>
-        </w:rPr>
-        <w:t>FECHA ASUNTO</w:t>
-      </w:r>
-      <w:r>
-        <w:rPr>
-          <w:lang w:val="es-ES"/>
-        </w:rPr>
-        <w:t xml:space="preserve">: </w:t>
-      </w:r>
-      <w:r>
-        <w:rPr>
-          <w:lang w:val="es-ES"/>
-        </w:rPr>
-        <w:t xml:space="preserve">{{FECHA_ASUNTO_TEXTO}}</w:t>
-      </w:r>
-      <w:r>
-        <w:rPr>
-          <w:lang w:val="es-ES"/>
-        </w:rPr>
-        <w:t xml:space="preserve"/>
-      </w:r>
-      <w:r>
-        <w:rPr>
-          <w:lang w:val="es-ES"/>
-        </w:rPr>
-        <w:t xml:space="preserve"/>
-      </w:r>
-      <w:r>
-        <w:rPr>
-          <w:lang w:val="es-ES"/>
-        </w:rPr>
-        <w:t xml:space="preserve"/>
-      </w:r>
-      <w:r>
-        <w:rPr>
-          <w:lang w:val="es-ES"/>
-        </w:rPr>
-        <w:t xml:space="preserve"/>
-      </w:r>
-      <w:r>
-        <w:rPr>
-          <w:lang w:val="es-ES"/>
-        </w:rPr>
-        <w:t xml:space="preserve"/>
-      </w:r>
-      <w:r>
-        <w:rPr>
-          <w:lang w:val="es-ES"/>
-        </w:rPr>
-        <w:t xml:space="preserve"/>
-      </w:r>
-      <w:r>
-        <w:rPr>
-          <w:lang w:val="es-ES"/>
-        </w:rPr>
-        <w:t xml:space="preserve"/>
-      </w:r>
-    </w:p>
-    <w:p>
-      <w:pPr>
-        <w:spacing w:after="100" w:afterAutospacing="1"/>
-        <w:rPr>
-          <w:b/>
-          <w:sz w:val="32"/>
-          <w:szCs w:val="32"/>
-          <w:lang w:val="es-ES"/>
-        </w:rPr>
-      </w:pPr>
+        <mc:AlternateContent>
+          <mc:Choice Requires="wpg">
+            <w:drawing>
+              <wp:anchor distT="0" distB="0" distL="114300" distR="114300" simplePos="0" relativeHeight="251664384" behindDoc="1" locked="0" layoutInCell="1" allowOverlap="1" wp14:anchorId="433F08D3" wp14:editId="64427193">
+                <wp:simplePos x="0" y="0"/>
+                <wp:positionH relativeFrom="page">
+                  <wp:posOffset>107315</wp:posOffset>
+                </wp:positionH>
+                <wp:positionV relativeFrom="page">
+                  <wp:posOffset>696595</wp:posOffset>
+                </wp:positionV>
+                <wp:extent cx="7560310" cy="8504555"/>
+                <wp:effectExtent l="2540" t="1270" r="0" b="0"/>
+                <wp:wrapNone/>
+                <wp:docPr id="1027" name="Group 4"/>
+                <wp:cNvGraphicFramePr>
+                  <a:graphicFrameLocks xmlns:a="http://schemas.openxmlformats.org/drawingml/2006/main"/>
+                </wp:cNvGraphicFramePr>
+                <a:graphic xmlns:a="http://schemas.openxmlformats.org/drawingml/2006/main">
+                  <a:graphicData uri="http://schemas.microsoft.com/office/word/2010/wordprocessingGroup">
+                    <wpg:wgp>
+                      <wpg:cNvGrpSpPr>
+                        <a:grpSpLocks/>
+                      </wpg:cNvGrpSpPr>
+                      <wpg:grpSpPr bwMode="auto">
+                        <a:xfrm>
+                          <a:off x="0" y="0"/>
+                          <a:ext cx="7560310" cy="8504555"/>
+                          <a:chOff x="0" y="0"/>
+                          <a:chExt cx="11906" cy="13006"/>
+                        </a:xfrm>
+                      </wpg:grpSpPr>
+                      <wpg:grpSp>
+                        <wpg:cNvPr id="1028" name="Group 5"/>
+                        <wpg:cNvGrpSpPr>
+                          <a:grpSpLocks/>
+                        </wpg:cNvGrpSpPr>
+                        <wpg:grpSpPr bwMode="auto">
+                          <a:xfrm>
+                            <a:off x="567" y="0"/>
+                            <a:ext cx="2835" cy="3685"/>
+                            <a:chOff x="567" y="0"/>
+                            <a:chExt cx="2835" cy="3685"/>
+                          </a:xfrm>
+                        </wpg:grpSpPr>
+                        <wps:wsp>
+                          <wps:cNvPr id="1029" name="Freeform 6"/>
+                          <wps:cNvSpPr>
+                            <a:spLocks/>
+                          </wps:cNvSpPr>
+                          <wps:spPr bwMode="auto">
+                            <a:xfrm>
+                              <a:off x="567" y="0"/>
+                              <a:ext cx="2835" cy="3685"/>
+                            </a:xfrm>
+                            <a:custGeom>
+                              <a:avLst/>
+                              <a:gdLst>
+                                <a:gd name="T0" fmla="+- 0 567 567"/>
+                                <a:gd name="T1" fmla="*/ T0 w 2835"/>
+                                <a:gd name="T2" fmla="*/ 3685 h 3685"/>
+                                <a:gd name="T3" fmla="+- 0 3402 567"/>
+                                <a:gd name="T4" fmla="*/ T3 w 2835"/>
+                                <a:gd name="T5" fmla="*/ 3685 h 3685"/>
+                                <a:gd name="T6" fmla="+- 0 3402 567"/>
+                                <a:gd name="T7" fmla="*/ T6 w 2835"/>
+                                <a:gd name="T8" fmla="*/ 0 h 3685"/>
+                                <a:gd name="T9" fmla="+- 0 567 567"/>
+                                <a:gd name="T10" fmla="*/ T9 w 2835"/>
+                                <a:gd name="T11" fmla="*/ 0 h 3685"/>
+                                <a:gd name="T12" fmla="+- 0 567 567"/>
+                                <a:gd name="T13" fmla="*/ T12 w 2835"/>
+                                <a:gd name="T14" fmla="*/ 3685 h 3685"/>
+                              </a:gdLst>
+                              <a:ahLst/>
+                              <a:cxnLst>
+                                <a:cxn ang="0">
+                                  <a:pos x="T1" y="T2"/>
+                                </a:cxn>
+                                <a:cxn ang="0">
+                                  <a:pos x="T4" y="T5"/>
+                                </a:cxn>
+                                <a:cxn ang="0">
+                                  <a:pos x="T7" y="T8"/>
+                                </a:cxn>
+                                <a:cxn ang="0">
+                                  <a:pos x="T10" y="T11"/>
+                                </a:cxn>
+                                <a:cxn ang="0">
+                                  <a:pos x="T13" y="T14"/>
+                                </a:cxn>
+                              </a:cxnLst>
+                              <a:rect l="0" t="0" r="r" b="b"/>
+                              <a:pathLst>
+                                <a:path w="2835" h="3685">
+                                  <a:moveTo>
+                                    <a:pt x="0" y="3685"/>
+                                  </a:moveTo>
+                                  <a:lnTo>
+                                    <a:pt x="2835" y="3685"/>
+                                  </a:lnTo>
+                                  <a:lnTo>
+                                    <a:pt x="2835" y="0"/>
+                                  </a:lnTo>
+                                  <a:lnTo>
+                                    <a:pt x="0" y="0"/>
+                                  </a:lnTo>
+                                  <a:lnTo>
+                                    <a:pt x="0" y="3685"/>
+                                  </a:lnTo>
+                                  <a:close/>
+                                </a:path>
+                              </a:pathLst>
+                            </a:custGeom>
+                            <a:solidFill>
+                              <a:srgbClr val="DCDDDE"/>
+                            </a:solidFill>
+                            <a:ln>
+                              <a:noFill/>
+                            </a:ln>
+                            <a:extLst>
+                              <a:ext uri="{91240B29-F687-4F45-9708-019B960494DF}">
+                                <a14:hiddenLine xmlns:a14="http://schemas.microsoft.com/office/drawing/2010/main" w="9525">
+                                  <a:solidFill>
+                                    <a:srgbClr val="000000"/>
+                                  </a:solidFill>
+                                  <a:round/>
+                                  <a:headEnd/>
+                                  <a:tailEnd/>
+                                </a14:hiddenLine>
+                              </a:ext>
+                            </a:extLst>
+                          </wps:spPr>
+                          <wps:bodyPr rot="0" vert="horz" wrap="square" lIns="91440" tIns="45720" rIns="91440" bIns="45720" anchor="t" anchorCtr="0" upright="1">
+                            <a:noAutofit/>
+                          </wps:bodyPr>
+                        </wps:wsp>
+                      </wpg:grpSp>
+                      <wpg:grpSp>
+                        <wpg:cNvPr id="1031" name="Group 7"/>
+                        <wpg:cNvGrpSpPr>
+                          <a:grpSpLocks/>
+                        </wpg:cNvGrpSpPr>
+                        <wpg:grpSpPr bwMode="auto">
+                          <a:xfrm>
+                            <a:off x="0" y="0"/>
+                            <a:ext cx="567" cy="3685"/>
+                            <a:chOff x="0" y="0"/>
+                            <a:chExt cx="567" cy="3685"/>
+                          </a:xfrm>
+                        </wpg:grpSpPr>
+                        <wps:wsp>
+                          <wps:cNvPr id="1032" name="Freeform 8"/>
+                          <wps:cNvSpPr>
+                            <a:spLocks/>
+                          </wps:cNvSpPr>
+                          <wps:spPr bwMode="auto">
+                            <a:xfrm>
+                              <a:off x="0" y="0"/>
+                              <a:ext cx="567" cy="3685"/>
+                            </a:xfrm>
+                            <a:custGeom>
+                              <a:avLst/>
+                              <a:gdLst>
+                                <a:gd name="T0" fmla="*/ 0 w 567"/>
+                                <a:gd name="T1" fmla="*/ 3685 h 3685"/>
+                                <a:gd name="T2" fmla="*/ 567 w 567"/>
+                                <a:gd name="T3" fmla="*/ 3685 h 3685"/>
+                                <a:gd name="T4" fmla="*/ 567 w 567"/>
+                                <a:gd name="T5" fmla="*/ 0 h 3685"/>
+                                <a:gd name="T6" fmla="*/ 0 w 567"/>
+                                <a:gd name="T7" fmla="*/ 0 h 3685"/>
+                                <a:gd name="T8" fmla="*/ 0 w 567"/>
+                                <a:gd name="T9" fmla="*/ 3685 h 3685"/>
+                              </a:gdLst>
+                              <a:ahLst/>
+                              <a:cxnLst>
+                                <a:cxn ang="0">
+                                  <a:pos x="T0" y="T1"/>
+                                </a:cxn>
+                                <a:cxn ang="0">
+                                  <a:pos x="T2" y="T3"/>
+                                </a:cxn>
+                                <a:cxn ang="0">
+                                  <a:pos x="T4" y="T5"/>
+                                </a:cxn>
+                                <a:cxn ang="0">
+                                  <a:pos x="T6" y="T7"/>
+                                </a:cxn>
+                                <a:cxn ang="0">
+                                  <a:pos x="T8" y="T9"/>
+                                </a:cxn>
+                              </a:cxnLst>
+                              <a:rect l="0" t="0" r="r" b="b"/>
+                              <a:pathLst>
+                                <a:path w="567" h="3685">
+                                  <a:moveTo>
+                                    <a:pt x="0" y="3685"/>
+                                  </a:moveTo>
+                                  <a:lnTo>
+                                    <a:pt x="567" y="3685"/>
+                                  </a:lnTo>
+                                  <a:lnTo>
+                                    <a:pt x="567" y="0"/>
+                                  </a:lnTo>
+                                  <a:lnTo>
+                                    <a:pt x="0" y="0"/>
+                                  </a:lnTo>
+                                  <a:lnTo>
+                                    <a:pt x="0" y="3685"/>
+                                  </a:lnTo>
+                                </a:path>
+                              </a:pathLst>
+                            </a:custGeom>
+                            <a:solidFill>
+                              <a:srgbClr val="BCBEC0"/>
+                            </a:solidFill>
+                            <a:ln>
+                              <a:noFill/>
+                            </a:ln>
+                            <a:extLst>
+                              <a:ext uri="{91240B29-F687-4F45-9708-019B960494DF}">
+                                <a14:hiddenLine xmlns:a14="http://schemas.microsoft.com/office/drawing/2010/main" w="9525">
+                                  <a:solidFill>
+                                    <a:srgbClr val="000000"/>
+                                  </a:solidFill>
+                                  <a:round/>
+                                  <a:headEnd/>
+                                  <a:tailEnd/>
+                                </a14:hiddenLine>
+                              </a:ext>
+                            </a:extLst>
+                          </wps:spPr>
+                          <wps:bodyPr rot="0" vert="horz" wrap="square" lIns="91440" tIns="45720" rIns="91440" bIns="45720" anchor="t" anchorCtr="0" upright="1">
+                            <a:noAutofit/>
+                          </wps:bodyPr>
+                        </wps:wsp>
+                        <pic:pic xmlns:pic="http://schemas.openxmlformats.org/drawingml/2006/picture">
+                          <pic:nvPicPr>
+                            <pic:cNvPr id="1033" name="Picture 9"/>
+                            <pic:cNvPicPr>
+                              <a:picLocks noChangeAspect="1" noChangeArrowheads="1"/>
+                            </pic:cNvPicPr>
+                          </pic:nvPicPr>
+                          <pic:blipFill>
+                            <a:blip r:embed="rIdPortada1">
+                              <a:extLst>
+                                <a:ext uri="{28A0092B-C50C-407E-A947-70E740481C1C}">
+                                  <a14:useLocalDpi xmlns:a14="http://schemas.microsoft.com/office/drawing/2010/main" val="0"/>
+                                </a:ext>
+                              </a:extLst>
+                            </a:blip>
+                            <a:srcRect/>
+                            <a:stretch>
+                              <a:fillRect/>
+                            </a:stretch>
+                          </pic:blipFill>
+                          <pic:spPr bwMode="auto">
+                            <a:xfrm>
+                              <a:off x="0" y="3685"/>
+                              <a:ext cx="11906" cy="8504"/>
+                            </a:xfrm>
+                            <a:prstGeom prst="rect">
+                              <a:avLst/>
+                            </a:prstGeom>
+                            <a:noFill/>
+                            <a:extLst>
+                              <a:ext uri="{909E8E84-426E-40DD-AFC4-6F175D3DCCD1}">
+                                <a14:hiddenFill xmlns:a14="http://schemas.microsoft.com/office/drawing/2010/main">
+                                  <a:solidFill>
+                                    <a:srgbClr val="FFFFFF"/>
+                                  </a:solidFill>
+                                </a14:hiddenFill>
+                              </a:ext>
+                            </a:extLst>
+                          </pic:spPr>
+                        </pic:pic>
+                      </wpg:grpSp>
+                      <wpg:grpSp>
+                        <wpg:cNvPr id="1034" name="Group 10"/>
+                        <wpg:cNvGrpSpPr>
+                          <a:grpSpLocks/>
+                        </wpg:cNvGrpSpPr>
+                        <wpg:grpSpPr bwMode="auto">
+                          <a:xfrm>
+                            <a:off x="426" y="11375"/>
+                            <a:ext cx="1642" cy="1627"/>
+                            <a:chOff x="426" y="11375"/>
+                            <a:chExt cx="1642" cy="1627"/>
+                          </a:xfrm>
+                        </wpg:grpSpPr>
+                        <wps:wsp>
+                          <wps:cNvPr id="1035" name="Freeform 11"/>
+                          <wps:cNvSpPr>
+                            <a:spLocks/>
+                          </wps:cNvSpPr>
+                          <wps:spPr bwMode="auto">
+                            <a:xfrm>
+                              <a:off x="426" y="11375"/>
+                              <a:ext cx="1642" cy="1627"/>
+                            </a:xfrm>
+                            <a:custGeom>
+                              <a:avLst/>
+                              <a:gdLst>
+                                <a:gd name="T0" fmla="+- 0 426 426"/>
+                                <a:gd name="T1" fmla="*/ T0 w 1642"/>
+                                <a:gd name="T2" fmla="+- 0 11375 11375"/>
+                                <a:gd name="T3" fmla="*/ 11375 h 1627"/>
+                                <a:gd name="T4" fmla="+- 0 2068 426"/>
+                                <a:gd name="T5" fmla="*/ T4 w 1642"/>
+                                <a:gd name="T6" fmla="+- 0 11375 11375"/>
+                                <a:gd name="T7" fmla="*/ 11375 h 1627"/>
+                                <a:gd name="T8" fmla="+- 0 2068 426"/>
+                                <a:gd name="T9" fmla="*/ T8 w 1642"/>
+                                <a:gd name="T10" fmla="+- 0 13002 11375"/>
+                                <a:gd name="T11" fmla="*/ 13002 h 1627"/>
+                                <a:gd name="T12" fmla="+- 0 426 426"/>
+                                <a:gd name="T13" fmla="*/ T12 w 1642"/>
+                                <a:gd name="T14" fmla="+- 0 13002 11375"/>
+                                <a:gd name="T15" fmla="*/ 13002 h 1627"/>
+                                <a:gd name="T16" fmla="+- 0 426 426"/>
+                                <a:gd name="T17" fmla="*/ T16 w 1642"/>
+                                <a:gd name="T18" fmla="+- 0 11375 11375"/>
+                                <a:gd name="T19" fmla="*/ 11375 h 1627"/>
+                              </a:gdLst>
+                              <a:ahLst/>
+                              <a:cxnLst>
+                                <a:cxn ang="0">
+                                  <a:pos x="T1" y="T3"/>
+                                </a:cxn>
+                                <a:cxn ang="0">
+                                  <a:pos x="T5" y="T7"/>
+                                </a:cxn>
+                                <a:cxn ang="0">
+                                  <a:pos x="T9" y="T11"/>
+                                </a:cxn>
+                                <a:cxn ang="0">
+                                  <a:pos x="T13" y="T15"/>
+                                </a:cxn>
+                                <a:cxn ang="0">
+                                  <a:pos x="T17" y="T19"/>
+                                </a:cxn>
+                              </a:cxnLst>
+                              <a:rect l="0" t="0" r="r" b="b"/>
+                              <a:pathLst>
+                                <a:path w="1642" h="1627">
+                                  <a:moveTo>
+                                    <a:pt x="0" y="0"/>
+                                  </a:moveTo>
+                                  <a:lnTo>
+                                    <a:pt x="1642" y="0"/>
+                                  </a:lnTo>
+                                  <a:lnTo>
+                                    <a:pt x="1642" y="1627"/>
+                                  </a:lnTo>
+                                  <a:lnTo>
+                                    <a:pt x="0" y="1627"/>
+                                  </a:lnTo>
+                                  <a:lnTo>
+                                    <a:pt x="0" y="0"/>
+                                  </a:lnTo>
+                                </a:path>
+                              </a:pathLst>
+                            </a:custGeom>
+                            <a:solidFill>
+                              <a:srgbClr val="000000"/>
+                            </a:solidFill>
+                            <a:ln>
+                              <a:noFill/>
+                            </a:ln>
+                            <a:extLst>
+                              <a:ext uri="{91240B29-F687-4F45-9708-019B960494DF}">
+                                <a14:hiddenLine xmlns:a14="http://schemas.microsoft.com/office/drawing/2010/main" w="9525">
+                                  <a:solidFill>
+                                    <a:srgbClr val="000000"/>
+                                  </a:solidFill>
+                                  <a:round/>
+                                  <a:headEnd/>
+                                  <a:tailEnd/>
+                                </a14:hiddenLine>
+                              </a:ext>
+                            </a:extLst>
+                          </wps:spPr>
+                          <wps:bodyPr rot="0" vert="horz" wrap="square" lIns="91440" tIns="45720" rIns="91440" bIns="45720" anchor="t" anchorCtr="0" upright="1">
+                            <a:noAutofit/>
+                          </wps:bodyPr>
+                        </wps:wsp>
+                      </wpg:grpSp>
+                      <wpg:grpSp>
+                        <wpg:cNvPr id="1036" name="Group 12"/>
+                        <wpg:cNvGrpSpPr>
+                          <a:grpSpLocks/>
+                        </wpg:cNvGrpSpPr>
+                        <wpg:grpSpPr bwMode="auto">
+                          <a:xfrm>
+                            <a:off x="634" y="11572"/>
+                            <a:ext cx="1246" cy="1246"/>
+                            <a:chOff x="634" y="11572"/>
+                            <a:chExt cx="1246" cy="1246"/>
+                          </a:xfrm>
+                        </wpg:grpSpPr>
+                        <wps:wsp>
+                          <wps:cNvPr id="1037" name="Freeform 13"/>
+                          <wps:cNvSpPr>
+                            <a:spLocks/>
+                          </wps:cNvSpPr>
+                          <wps:spPr bwMode="auto">
+                            <a:xfrm>
+                              <a:off x="634" y="11572"/>
+                              <a:ext cx="1246" cy="1246"/>
+                            </a:xfrm>
+                            <a:custGeom>
+                              <a:avLst/>
+                              <a:gdLst>
+                                <a:gd name="T0" fmla="+- 0 1257 634"/>
+                                <a:gd name="T1" fmla="*/ T0 w 1246"/>
+                                <a:gd name="T2" fmla="+- 0 11572 11572"/>
+                                <a:gd name="T3" fmla="*/ 11572 h 1246"/>
+                                <a:gd name="T4" fmla="+- 0 1156 634"/>
+                                <a:gd name="T5" fmla="*/ T4 w 1246"/>
+                                <a:gd name="T6" fmla="+- 0 11581 11572"/>
+                                <a:gd name="T7" fmla="*/ 11581 h 1246"/>
+                                <a:gd name="T8" fmla="+- 0 1060 634"/>
+                                <a:gd name="T9" fmla="*/ T8 w 1246"/>
+                                <a:gd name="T10" fmla="+- 0 11604 11572"/>
+                                <a:gd name="T11" fmla="*/ 11604 h 1246"/>
+                                <a:gd name="T12" fmla="+- 0 970 634"/>
+                                <a:gd name="T13" fmla="*/ T12 w 1246"/>
+                                <a:gd name="T14" fmla="+- 0 11642 11572"/>
+                                <a:gd name="T15" fmla="*/ 11642 h 1246"/>
+                                <a:gd name="T16" fmla="+- 0 889 634"/>
+                                <a:gd name="T17" fmla="*/ T16 w 1246"/>
+                                <a:gd name="T18" fmla="+- 0 11693 11572"/>
+                                <a:gd name="T19" fmla="*/ 11693 h 1246"/>
+                                <a:gd name="T20" fmla="+- 0 816 634"/>
+                                <a:gd name="T21" fmla="*/ T20 w 1246"/>
+                                <a:gd name="T22" fmla="+- 0 11755 11572"/>
+                                <a:gd name="T23" fmla="*/ 11755 h 1246"/>
+                                <a:gd name="T24" fmla="+- 0 754 634"/>
+                                <a:gd name="T25" fmla="*/ T24 w 1246"/>
+                                <a:gd name="T26" fmla="+- 0 11827 11572"/>
+                                <a:gd name="T27" fmla="*/ 11827 h 1246"/>
+                                <a:gd name="T28" fmla="+- 0 703 634"/>
+                                <a:gd name="T29" fmla="*/ T28 w 1246"/>
+                                <a:gd name="T30" fmla="+- 0 11909 11572"/>
+                                <a:gd name="T31" fmla="*/ 11909 h 1246"/>
+                                <a:gd name="T32" fmla="+- 0 665 634"/>
+                                <a:gd name="T33" fmla="*/ T32 w 1246"/>
+                                <a:gd name="T34" fmla="+- 0 11998 11572"/>
+                                <a:gd name="T35" fmla="*/ 11998 h 1246"/>
+                                <a:gd name="T36" fmla="+- 0 642 634"/>
+                                <a:gd name="T37" fmla="*/ T36 w 1246"/>
+                                <a:gd name="T38" fmla="+- 0 12094 11572"/>
+                                <a:gd name="T39" fmla="*/ 12094 h 1246"/>
+                                <a:gd name="T40" fmla="+- 0 634 634"/>
+                                <a:gd name="T41" fmla="*/ T40 w 1246"/>
+                                <a:gd name="T42" fmla="+- 0 12195 11572"/>
+                                <a:gd name="T43" fmla="*/ 12195 h 1246"/>
+                                <a:gd name="T44" fmla="+- 0 636 634"/>
+                                <a:gd name="T45" fmla="*/ T44 w 1246"/>
+                                <a:gd name="T46" fmla="+- 0 12246 11572"/>
+                                <a:gd name="T47" fmla="*/ 12246 h 1246"/>
+                                <a:gd name="T48" fmla="+- 0 652 634"/>
+                                <a:gd name="T49" fmla="*/ T48 w 1246"/>
+                                <a:gd name="T50" fmla="+- 0 12345 11572"/>
+                                <a:gd name="T51" fmla="*/ 12345 h 1246"/>
+                                <a:gd name="T52" fmla="+- 0 683 634"/>
+                                <a:gd name="T53" fmla="*/ T52 w 1246"/>
+                                <a:gd name="T54" fmla="+- 0 12438 11572"/>
+                                <a:gd name="T55" fmla="*/ 12438 h 1246"/>
+                                <a:gd name="T56" fmla="+- 0 727 634"/>
+                                <a:gd name="T57" fmla="*/ T56 w 1246"/>
+                                <a:gd name="T58" fmla="+- 0 12523 11572"/>
+                                <a:gd name="T59" fmla="*/ 12523 h 1246"/>
+                                <a:gd name="T60" fmla="+- 0 784 634"/>
+                                <a:gd name="T61" fmla="*/ T60 w 1246"/>
+                                <a:gd name="T62" fmla="+- 0 12601 11572"/>
+                                <a:gd name="T63" fmla="*/ 12601 h 1246"/>
+                                <a:gd name="T64" fmla="+- 0 851 634"/>
+                                <a:gd name="T65" fmla="*/ T64 w 1246"/>
+                                <a:gd name="T66" fmla="+- 0 12668 11572"/>
+                                <a:gd name="T67" fmla="*/ 12668 h 1246"/>
+                                <a:gd name="T68" fmla="+- 0 929 634"/>
+                                <a:gd name="T69" fmla="*/ T68 w 1246"/>
+                                <a:gd name="T70" fmla="+- 0 12725 11572"/>
+                                <a:gd name="T71" fmla="*/ 12725 h 1246"/>
+                                <a:gd name="T72" fmla="+- 0 1014 634"/>
+                                <a:gd name="T73" fmla="*/ T72 w 1246"/>
+                                <a:gd name="T74" fmla="+- 0 12769 11572"/>
+                                <a:gd name="T75" fmla="*/ 12769 h 1246"/>
+                                <a:gd name="T76" fmla="+- 0 1107 634"/>
+                                <a:gd name="T77" fmla="*/ T76 w 1246"/>
+                                <a:gd name="T78" fmla="+- 0 12800 11572"/>
+                                <a:gd name="T79" fmla="*/ 12800 h 1246"/>
+                                <a:gd name="T80" fmla="+- 0 1206 634"/>
+                                <a:gd name="T81" fmla="*/ T80 w 1246"/>
+                                <a:gd name="T82" fmla="+- 0 12816 11572"/>
+                                <a:gd name="T83" fmla="*/ 12816 h 1246"/>
+                                <a:gd name="T84" fmla="+- 0 1257 634"/>
+                                <a:gd name="T85" fmla="*/ T84 w 1246"/>
+                                <a:gd name="T86" fmla="+- 0 12818 11572"/>
+                                <a:gd name="T87" fmla="*/ 12818 h 1246"/>
+                                <a:gd name="T88" fmla="+- 0 1308 634"/>
+                                <a:gd name="T89" fmla="*/ T88 w 1246"/>
+                                <a:gd name="T90" fmla="+- 0 12816 11572"/>
+                                <a:gd name="T91" fmla="*/ 12816 h 1246"/>
+                                <a:gd name="T92" fmla="+- 0 1406 634"/>
+                                <a:gd name="T93" fmla="*/ T92 w 1246"/>
+                                <a:gd name="T94" fmla="+- 0 12800 11572"/>
+                                <a:gd name="T95" fmla="*/ 12800 h 1246"/>
+                                <a:gd name="T96" fmla="+- 0 1499 634"/>
+                                <a:gd name="T97" fmla="*/ T96 w 1246"/>
+                                <a:gd name="T98" fmla="+- 0 12769 11572"/>
+                                <a:gd name="T99" fmla="*/ 12769 h 1246"/>
+                                <a:gd name="T100" fmla="+- 0 1585 634"/>
+                                <a:gd name="T101" fmla="*/ T100 w 1246"/>
+                                <a:gd name="T102" fmla="+- 0 12725 11572"/>
+                                <a:gd name="T103" fmla="*/ 12725 h 1246"/>
+                                <a:gd name="T104" fmla="+- 0 1662 634"/>
+                                <a:gd name="T105" fmla="*/ T104 w 1246"/>
+                                <a:gd name="T106" fmla="+- 0 12668 11572"/>
+                                <a:gd name="T107" fmla="*/ 12668 h 1246"/>
+                                <a:gd name="T108" fmla="+- 0 1730 634"/>
+                                <a:gd name="T109" fmla="*/ T108 w 1246"/>
+                                <a:gd name="T110" fmla="+- 0 12601 11572"/>
+                                <a:gd name="T111" fmla="*/ 12601 h 1246"/>
+                                <a:gd name="T112" fmla="+- 0 1786 634"/>
+                                <a:gd name="T113" fmla="*/ T112 w 1246"/>
+                                <a:gd name="T114" fmla="+- 0 12523 11572"/>
+                                <a:gd name="T115" fmla="*/ 12523 h 1246"/>
+                                <a:gd name="T116" fmla="+- 0 1831 634"/>
+                                <a:gd name="T117" fmla="*/ T116 w 1246"/>
+                                <a:gd name="T118" fmla="+- 0 12438 11572"/>
+                                <a:gd name="T119" fmla="*/ 12438 h 1246"/>
+                                <a:gd name="T120" fmla="+- 0 1861 634"/>
+                                <a:gd name="T121" fmla="*/ T120 w 1246"/>
+                                <a:gd name="T122" fmla="+- 0 12345 11572"/>
+                                <a:gd name="T123" fmla="*/ 12345 h 1246"/>
+                                <a:gd name="T124" fmla="+- 0 1878 634"/>
+                                <a:gd name="T125" fmla="*/ T124 w 1246"/>
+                                <a:gd name="T126" fmla="+- 0 12246 11572"/>
+                                <a:gd name="T127" fmla="*/ 12246 h 1246"/>
+                                <a:gd name="T128" fmla="+- 0 1880 634"/>
+                                <a:gd name="T129" fmla="*/ T128 w 1246"/>
+                                <a:gd name="T130" fmla="+- 0 12195 11572"/>
+                                <a:gd name="T131" fmla="*/ 12195 h 1246"/>
+                                <a:gd name="T132" fmla="+- 0 1878 634"/>
+                                <a:gd name="T133" fmla="*/ T132 w 1246"/>
+                                <a:gd name="T134" fmla="+- 0 12144 11572"/>
+                                <a:gd name="T135" fmla="*/ 12144 h 1246"/>
+                                <a:gd name="T136" fmla="+- 0 1861 634"/>
+                                <a:gd name="T137" fmla="*/ T136 w 1246"/>
+                                <a:gd name="T138" fmla="+- 0 12046 11572"/>
+                                <a:gd name="T139" fmla="*/ 12046 h 1246"/>
+                                <a:gd name="T140" fmla="+- 0 1831 634"/>
+                                <a:gd name="T141" fmla="*/ T140 w 1246"/>
+                                <a:gd name="T142" fmla="+- 0 11953 11572"/>
+                                <a:gd name="T143" fmla="*/ 11953 h 1246"/>
+                                <a:gd name="T144" fmla="+- 0 1786 634"/>
+                                <a:gd name="T145" fmla="*/ T144 w 1246"/>
+                                <a:gd name="T146" fmla="+- 0 11867 11572"/>
+                                <a:gd name="T147" fmla="*/ 11867 h 1246"/>
+                                <a:gd name="T148" fmla="+- 0 1730 634"/>
+                                <a:gd name="T149" fmla="*/ T148 w 1246"/>
+                                <a:gd name="T150" fmla="+- 0 11790 11572"/>
+                                <a:gd name="T151" fmla="*/ 11790 h 1246"/>
+                                <a:gd name="T152" fmla="+- 0 1662 634"/>
+                                <a:gd name="T153" fmla="*/ T152 w 1246"/>
+                                <a:gd name="T154" fmla="+- 0 11722 11572"/>
+                                <a:gd name="T155" fmla="*/ 11722 h 1246"/>
+                                <a:gd name="T156" fmla="+- 0 1585 634"/>
+                                <a:gd name="T157" fmla="*/ T156 w 1246"/>
+                                <a:gd name="T158" fmla="+- 0 11666 11572"/>
+                                <a:gd name="T159" fmla="*/ 11666 h 1246"/>
+                                <a:gd name="T160" fmla="+- 0 1499 634"/>
+                                <a:gd name="T161" fmla="*/ T160 w 1246"/>
+                                <a:gd name="T162" fmla="+- 0 11621 11572"/>
+                                <a:gd name="T163" fmla="*/ 11621 h 1246"/>
+                                <a:gd name="T164" fmla="+- 0 1406 634"/>
+                                <a:gd name="T165" fmla="*/ T164 w 1246"/>
+                                <a:gd name="T166" fmla="+- 0 11590 11572"/>
+                                <a:gd name="T167" fmla="*/ 11590 h 1246"/>
+                                <a:gd name="T168" fmla="+- 0 1308 634"/>
+                                <a:gd name="T169" fmla="*/ T168 w 1246"/>
+                                <a:gd name="T170" fmla="+- 0 11574 11572"/>
+                                <a:gd name="T171" fmla="*/ 11574 h 1246"/>
+                                <a:gd name="T172" fmla="+- 0 1257 634"/>
+                                <a:gd name="T173" fmla="*/ T172 w 1246"/>
+                                <a:gd name="T174" fmla="+- 0 11572 11572"/>
+                                <a:gd name="T175" fmla="*/ 11572 h 1246"/>
+                              </a:gdLst>
+                              <a:ahLst/>
+                              <a:cxnLst>
+                                <a:cxn ang="0">
+                                  <a:pos x="T1" y="T3"/>
+                                </a:cxn>
+                                <a:cxn ang="0">
+                                  <a:pos x="T5" y="T7"/>
+                                </a:cxn>
+                                <a:cxn ang="0">
+                                  <a:pos x="T9" y="T11"/>
+                                </a:cxn>
+                                <a:cxn ang="0">
+                                  <a:pos x="T13" y="T15"/>
+                                </a:cxn>
+                                <a:cxn ang="0">
+                                  <a:pos x="T17" y="T19"/>
+                                </a:cxn>
+                                <a:cxn ang="0">
+                                  <a:pos x="T21" y="T23"/>
+                                </a:cxn>
+                                <a:cxn ang="0">
+                                  <a:pos x="T25" y="T27"/>
+                                </a:cxn>
+                                <a:cxn ang="0">
+                                  <a:pos x="T29" y="T31"/>
+                                </a:cxn>
+                                <a:cxn ang="0">
+                                  <a:pos x="T33" y="T35"/>
+                                </a:cxn>
+                                <a:cxn ang="0">
+                                  <a:pos x="T37" y="T39"/>
+                                </a:cxn>
+                                <a:cxn ang="0">
+                                  <a:pos x="T41" y="T43"/>
+                                </a:cxn>
+                                <a:cxn ang="0">
+                                  <a:pos x="T45" y="T47"/>
+                                </a:cxn>
+                                <a:cxn ang="0">
+                                  <a:pos x="T49" y="T51"/>
+                                </a:cxn>
+                                <a:cxn ang="0">
+                                  <a:pos x="T53" y="T55"/>
+                                </a:cxn>
+                                <a:cxn ang="0">
+                                  <a:pos x="T57" y="T59"/>
+                                </a:cxn>
+                                <a:cxn ang="0">
+                                  <a:pos x="T61" y="T63"/>
+                                </a:cxn>
+                                <a:cxn ang="0">
+                                  <a:pos x="T65" y="T67"/>
+                                </a:cxn>
+                                <a:cxn ang="0">
+                                  <a:pos x="T69" y="T71"/>
+                                </a:cxn>
+                                <a:cxn ang="0">
+                                  <a:pos x="T73" y="T75"/>
+                                </a:cxn>
+                                <a:cxn ang="0">
+                                  <a:pos x="T77" y="T79"/>
+                                </a:cxn>
+                                <a:cxn ang="0">
+                                  <a:pos x="T81" y="T83"/>
+                                </a:cxn>
+                                <a:cxn ang="0">
+                                  <a:pos x="T85" y="T87"/>
+                                </a:cxn>
+                                <a:cxn ang="0">
+                                  <a:pos x="T89" y="T91"/>
+                                </a:cxn>
+                                <a:cxn ang="0">
+                                  <a:pos x="T93" y="T95"/>
+                                </a:cxn>
+                                <a:cxn ang="0">
+                                  <a:pos x="T97" y="T99"/>
+                                </a:cxn>
+                                <a:cxn ang="0">
+                                  <a:pos x="T101" y="T103"/>
+                                </a:cxn>
+                                <a:cxn ang="0">
+                                  <a:pos x="T105" y="T107"/>
+                                </a:cxn>
+                                <a:cxn ang="0">
+                                  <a:pos x="T109" y="T111"/>
+                                </a:cxn>
+                                <a:cxn ang="0">
+                                  <a:pos x="T113" y="T115"/>
+                                </a:cxn>
+                                <a:cxn ang="0">
+                                  <a:pos x="T117" y="T119"/>
+                                </a:cxn>
+                                <a:cxn ang="0">
+                                  <a:pos x="T121" y="T123"/>
+                                </a:cxn>
+                                <a:cxn ang="0">
+                                  <a:pos x="T125" y="T127"/>
+                                </a:cxn>
+                                <a:cxn ang="0">
+                                  <a:pos x="T129" y="T131"/>
+                                </a:cxn>
+                                <a:cxn ang="0">
+                                  <a:pos x="T133" y="T135"/>
+                                </a:cxn>
+                                <a:cxn ang="0">
+                                  <a:pos x="T137" y="T139"/>
+                                </a:cxn>
+                                <a:cxn ang="0">
+                                  <a:pos x="T141" y="T143"/>
+                                </a:cxn>
+                                <a:cxn ang="0">
+                                  <a:pos x="T145" y="T147"/>
+                                </a:cxn>
+                                <a:cxn ang="0">
+                                  <a:pos x="T149" y="T151"/>
+                                </a:cxn>
+                                <a:cxn ang="0">
+                                  <a:pos x="T153" y="T155"/>
+                                </a:cxn>
+                                <a:cxn ang="0">
+                                  <a:pos x="T157" y="T159"/>
+                                </a:cxn>
+                                <a:cxn ang="0">
+                                  <a:pos x="T161" y="T163"/>
+                                </a:cxn>
+                                <a:cxn ang="0">
+                                  <a:pos x="T165" y="T167"/>
+                                </a:cxn>
+                                <a:cxn ang="0">
+                                  <a:pos x="T169" y="T171"/>
+                                </a:cxn>
+                                <a:cxn ang="0">
+                                  <a:pos x="T173" y="T175"/>
+                                </a:cxn>
+                              </a:cxnLst>
+                              <a:rect l="0" t="0" r="r" b="b"/>
+                              <a:pathLst>
+                                <a:path w="1246" h="1246">
+                                  <a:moveTo>
+                                    <a:pt x="623" y="0"/>
+                                  </a:moveTo>
+                                  <a:lnTo>
+                                    <a:pt x="522" y="9"/>
+                                  </a:lnTo>
+                                  <a:lnTo>
+                                    <a:pt x="426" y="32"/>
+                                  </a:lnTo>
+                                  <a:lnTo>
+                                    <a:pt x="336" y="70"/>
+                                  </a:lnTo>
+                                  <a:lnTo>
+                                    <a:pt x="255" y="121"/>
+                                  </a:lnTo>
+                                  <a:lnTo>
+                                    <a:pt x="182" y="183"/>
+                                  </a:lnTo>
+                                  <a:lnTo>
+                                    <a:pt x="120" y="255"/>
+                                  </a:lnTo>
+                                  <a:lnTo>
+                                    <a:pt x="69" y="337"/>
+                                  </a:lnTo>
+                                  <a:lnTo>
+                                    <a:pt x="31" y="426"/>
+                                  </a:lnTo>
+                                  <a:lnTo>
+                                    <a:pt x="8" y="522"/>
+                                  </a:lnTo>
+                                  <a:lnTo>
+                                    <a:pt x="0" y="623"/>
+                                  </a:lnTo>
+                                  <a:lnTo>
+                                    <a:pt x="2" y="674"/>
+                                  </a:lnTo>
+                                  <a:lnTo>
+                                    <a:pt x="18" y="773"/>
+                                  </a:lnTo>
+                                  <a:lnTo>
+                                    <a:pt x="49" y="866"/>
+                                  </a:lnTo>
+                                  <a:lnTo>
+                                    <a:pt x="93" y="951"/>
+                                  </a:lnTo>
+                                  <a:lnTo>
+                                    <a:pt x="150" y="1029"/>
+                                  </a:lnTo>
+                                  <a:lnTo>
+                                    <a:pt x="217" y="1096"/>
+                                  </a:lnTo>
+                                  <a:lnTo>
+                                    <a:pt x="295" y="1153"/>
+                                  </a:lnTo>
+                                  <a:lnTo>
+                                    <a:pt x="380" y="1197"/>
+                                  </a:lnTo>
+                                  <a:lnTo>
+                                    <a:pt x="473" y="1228"/>
+                                  </a:lnTo>
+                                  <a:lnTo>
+                                    <a:pt x="572" y="1244"/>
+                                  </a:lnTo>
+                                  <a:lnTo>
+                                    <a:pt x="623" y="1246"/>
+                                  </a:lnTo>
+                                  <a:lnTo>
+                                    <a:pt x="674" y="1244"/>
+                                  </a:lnTo>
+                                  <a:lnTo>
+                                    <a:pt x="772" y="1228"/>
+                                  </a:lnTo>
+                                  <a:lnTo>
+                                    <a:pt x="865" y="1197"/>
+                                  </a:lnTo>
+                                  <a:lnTo>
+                                    <a:pt x="951" y="1153"/>
+                                  </a:lnTo>
+                                  <a:lnTo>
+                                    <a:pt x="1028" y="1096"/>
+                                  </a:lnTo>
+                                  <a:lnTo>
+                                    <a:pt x="1096" y="1029"/>
+                                  </a:lnTo>
+                                  <a:lnTo>
+                                    <a:pt x="1152" y="951"/>
+                                  </a:lnTo>
+                                  <a:lnTo>
+                                    <a:pt x="1197" y="866"/>
+                                  </a:lnTo>
+                                  <a:lnTo>
+                                    <a:pt x="1227" y="773"/>
+                                  </a:lnTo>
+                                  <a:lnTo>
+                                    <a:pt x="1244" y="674"/>
+                                  </a:lnTo>
+                                  <a:lnTo>
+                                    <a:pt x="1246" y="623"/>
+                                  </a:lnTo>
+                                  <a:lnTo>
+                                    <a:pt x="1244" y="572"/>
+                                  </a:lnTo>
+                                  <a:lnTo>
+                                    <a:pt x="1227" y="474"/>
+                                  </a:lnTo>
+                                  <a:lnTo>
+                                    <a:pt x="1197" y="381"/>
+                                  </a:lnTo>
+                                  <a:lnTo>
+                                    <a:pt x="1152" y="295"/>
+                                  </a:lnTo>
+                                  <a:lnTo>
+                                    <a:pt x="1096" y="218"/>
+                                  </a:lnTo>
+                                  <a:lnTo>
+                                    <a:pt x="1028" y="150"/>
+                                  </a:lnTo>
+                                  <a:lnTo>
+                                    <a:pt x="951" y="94"/>
+                                  </a:lnTo>
+                                  <a:lnTo>
+                                    <a:pt x="865" y="49"/>
+                                  </a:lnTo>
+                                  <a:lnTo>
+                                    <a:pt x="772" y="18"/>
+                                  </a:lnTo>
+                                  <a:lnTo>
+                                    <a:pt x="674" y="2"/>
+                                  </a:lnTo>
+                                  <a:lnTo>
+                                    <a:pt x="623" y="0"/>
+                                  </a:lnTo>
+                                </a:path>
+                              </a:pathLst>
+                            </a:custGeom>
+                            <a:solidFill>
+                              <a:srgbClr val="6D6E71"/>
+                            </a:solidFill>
+                            <a:ln>
+                              <a:noFill/>
+                            </a:ln>
+                            <a:extLst>
+                              <a:ext uri="{91240B29-F687-4F45-9708-019B960494DF}">
+                                <a14:hiddenLine xmlns:a14="http://schemas.microsoft.com/office/drawing/2010/main" w="9525">
+                                  <a:solidFill>
+                                    <a:srgbClr val="000000"/>
+                                  </a:solidFill>
+                                  <a:round/>
+                                  <a:headEnd/>
+                                  <a:tailEnd/>
+                                </a14:hiddenLine>
+                              </a:ext>
+                            </a:extLst>
+                          </wps:spPr>
+                          <wps:bodyPr rot="0" vert="horz" wrap="square" lIns="91440" tIns="45720" rIns="91440" bIns="45720" anchor="t" anchorCtr="0" upright="1">
+                            <a:noAutofit/>
+                          </wps:bodyPr>
+                        </wps:wsp>
+                      </wpg:grpSp>
+                      <wpg:grpSp>
+                        <wpg:cNvPr id="1038" name="Group 14"/>
+                        <wpg:cNvGrpSpPr>
+                          <a:grpSpLocks/>
+                        </wpg:cNvGrpSpPr>
+                        <wpg:grpSpPr bwMode="auto">
+                          <a:xfrm>
+                            <a:off x="626" y="11571"/>
+                            <a:ext cx="1230" cy="1230"/>
+                            <a:chOff x="626" y="11571"/>
+                            <a:chExt cx="1230" cy="1230"/>
+                          </a:xfrm>
+                        </wpg:grpSpPr>
+                        <wps:wsp>
+                          <wps:cNvPr id="1039" name="Freeform 15"/>
+                          <wps:cNvSpPr>
+                            <a:spLocks/>
+                          </wps:cNvSpPr>
+                          <wps:spPr bwMode="auto">
+                            <a:xfrm>
+                              <a:off x="626" y="11571"/>
+                              <a:ext cx="1230" cy="1230"/>
+                            </a:xfrm>
+                            <a:custGeom>
+                              <a:avLst/>
+                              <a:gdLst>
+                                <a:gd name="T0" fmla="+- 0 1242 626"/>
+                                <a:gd name="T1" fmla="*/ T0 w 1230"/>
+                                <a:gd name="T2" fmla="+- 0 12802 11571"/>
+                                <a:gd name="T3" fmla="*/ 12802 h 1230"/>
+                                <a:gd name="T4" fmla="+- 0 1341 626"/>
+                                <a:gd name="T5" fmla="*/ T4 w 1230"/>
+                                <a:gd name="T6" fmla="+- 0 12794 11571"/>
+                                <a:gd name="T7" fmla="*/ 12794 h 1230"/>
+                                <a:gd name="T8" fmla="+- 0 1436 626"/>
+                                <a:gd name="T9" fmla="*/ T8 w 1230"/>
+                                <a:gd name="T10" fmla="+- 0 12770 11571"/>
+                                <a:gd name="T11" fmla="*/ 12770 h 1230"/>
+                                <a:gd name="T12" fmla="+- 0 1524 626"/>
+                                <a:gd name="T13" fmla="*/ T12 w 1230"/>
+                                <a:gd name="T14" fmla="+- 0 12733 11571"/>
+                                <a:gd name="T15" fmla="*/ 12733 h 1230"/>
+                                <a:gd name="T16" fmla="+- 0 1605 626"/>
+                                <a:gd name="T17" fmla="*/ T16 w 1230"/>
+                                <a:gd name="T18" fmla="+- 0 12683 11571"/>
+                                <a:gd name="T19" fmla="*/ 12683 h 1230"/>
+                                <a:gd name="T20" fmla="+- 0 1677 626"/>
+                                <a:gd name="T21" fmla="*/ T20 w 1230"/>
+                                <a:gd name="T22" fmla="+- 0 12622 11571"/>
+                                <a:gd name="T23" fmla="*/ 12622 h 1230"/>
+                                <a:gd name="T24" fmla="+- 0 1738 626"/>
+                                <a:gd name="T25" fmla="*/ T24 w 1230"/>
+                                <a:gd name="T26" fmla="+- 0 12550 11571"/>
+                                <a:gd name="T27" fmla="*/ 12550 h 1230"/>
+                                <a:gd name="T28" fmla="+- 0 1788 626"/>
+                                <a:gd name="T29" fmla="*/ T28 w 1230"/>
+                                <a:gd name="T30" fmla="+- 0 12469 11571"/>
+                                <a:gd name="T31" fmla="*/ 12469 h 1230"/>
+                                <a:gd name="T32" fmla="+- 0 1826 626"/>
+                                <a:gd name="T33" fmla="*/ T32 w 1230"/>
+                                <a:gd name="T34" fmla="+- 0 12381 11571"/>
+                                <a:gd name="T35" fmla="*/ 12381 h 1230"/>
+                                <a:gd name="T36" fmla="+- 0 1849 626"/>
+                                <a:gd name="T37" fmla="*/ T36 w 1230"/>
+                                <a:gd name="T38" fmla="+- 0 12286 11571"/>
+                                <a:gd name="T39" fmla="*/ 12286 h 1230"/>
+                                <a:gd name="T40" fmla="+- 0 1857 626"/>
+                                <a:gd name="T41" fmla="*/ T40 w 1230"/>
+                                <a:gd name="T42" fmla="+- 0 12186 11571"/>
+                                <a:gd name="T43" fmla="*/ 12186 h 1230"/>
+                                <a:gd name="T44" fmla="+- 0 1855 626"/>
+                                <a:gd name="T45" fmla="*/ T44 w 1230"/>
+                                <a:gd name="T46" fmla="+- 0 12136 11571"/>
+                                <a:gd name="T47" fmla="*/ 12136 h 1230"/>
+                                <a:gd name="T48" fmla="+- 0 1839 626"/>
+                                <a:gd name="T49" fmla="*/ T48 w 1230"/>
+                                <a:gd name="T50" fmla="+- 0 12039 11571"/>
+                                <a:gd name="T51" fmla="*/ 12039 h 1230"/>
+                                <a:gd name="T52" fmla="+- 0 1809 626"/>
+                                <a:gd name="T53" fmla="*/ T52 w 1230"/>
+                                <a:gd name="T54" fmla="+- 0 11947 11571"/>
+                                <a:gd name="T55" fmla="*/ 11947 h 1230"/>
+                                <a:gd name="T56" fmla="+- 0 1765 626"/>
+                                <a:gd name="T57" fmla="*/ T56 w 1230"/>
+                                <a:gd name="T58" fmla="+- 0 11862 11571"/>
+                                <a:gd name="T59" fmla="*/ 11862 h 1230"/>
+                                <a:gd name="T60" fmla="+- 0 1709 626"/>
+                                <a:gd name="T61" fmla="*/ T60 w 1230"/>
+                                <a:gd name="T62" fmla="+- 0 11786 11571"/>
+                                <a:gd name="T63" fmla="*/ 11786 h 1230"/>
+                                <a:gd name="T64" fmla="+- 0 1642 626"/>
+                                <a:gd name="T65" fmla="*/ T64 w 1230"/>
+                                <a:gd name="T66" fmla="+- 0 11719 11571"/>
+                                <a:gd name="T67" fmla="*/ 11719 h 1230"/>
+                                <a:gd name="T68" fmla="+- 0 1566 626"/>
+                                <a:gd name="T69" fmla="*/ T68 w 1230"/>
+                                <a:gd name="T70" fmla="+- 0 11663 11571"/>
+                                <a:gd name="T71" fmla="*/ 11663 h 1230"/>
+                                <a:gd name="T72" fmla="+- 0 1481 626"/>
+                                <a:gd name="T73" fmla="*/ T72 w 1230"/>
+                                <a:gd name="T74" fmla="+- 0 11620 11571"/>
+                                <a:gd name="T75" fmla="*/ 11620 h 1230"/>
+                                <a:gd name="T76" fmla="+- 0 1390 626"/>
+                                <a:gd name="T77" fmla="*/ T76 w 1230"/>
+                                <a:gd name="T78" fmla="+- 0 11589 11571"/>
+                                <a:gd name="T79" fmla="*/ 11589 h 1230"/>
+                                <a:gd name="T80" fmla="+- 0 1292 626"/>
+                                <a:gd name="T81" fmla="*/ T80 w 1230"/>
+                                <a:gd name="T82" fmla="+- 0 11573 11571"/>
+                                <a:gd name="T83" fmla="*/ 11573 h 1230"/>
+                                <a:gd name="T84" fmla="+- 0 1242 626"/>
+                                <a:gd name="T85" fmla="*/ T84 w 1230"/>
+                                <a:gd name="T86" fmla="+- 0 11571 11571"/>
+                                <a:gd name="T87" fmla="*/ 11571 h 1230"/>
+                                <a:gd name="T88" fmla="+- 0 1191 626"/>
+                                <a:gd name="T89" fmla="*/ T88 w 1230"/>
+                                <a:gd name="T90" fmla="+- 0 11573 11571"/>
+                                <a:gd name="T91" fmla="*/ 11573 h 1230"/>
+                                <a:gd name="T92" fmla="+- 0 1094 626"/>
+                                <a:gd name="T93" fmla="*/ T92 w 1230"/>
+                                <a:gd name="T94" fmla="+- 0 11589 11571"/>
+                                <a:gd name="T95" fmla="*/ 11589 h 1230"/>
+                                <a:gd name="T96" fmla="+- 0 1002 626"/>
+                                <a:gd name="T97" fmla="*/ T96 w 1230"/>
+                                <a:gd name="T98" fmla="+- 0 11620 11571"/>
+                                <a:gd name="T99" fmla="*/ 11620 h 1230"/>
+                                <a:gd name="T100" fmla="+- 0 918 626"/>
+                                <a:gd name="T101" fmla="*/ T100 w 1230"/>
+                                <a:gd name="T102" fmla="+- 0 11663 11571"/>
+                                <a:gd name="T103" fmla="*/ 11663 h 1230"/>
+                                <a:gd name="T104" fmla="+- 0 841 626"/>
+                                <a:gd name="T105" fmla="*/ T104 w 1230"/>
+                                <a:gd name="T106" fmla="+- 0 11719 11571"/>
+                                <a:gd name="T107" fmla="*/ 11719 h 1230"/>
+                                <a:gd name="T108" fmla="+- 0 775 626"/>
+                                <a:gd name="T109" fmla="*/ T108 w 1230"/>
+                                <a:gd name="T110" fmla="+- 0 11786 11571"/>
+                                <a:gd name="T111" fmla="*/ 11786 h 1230"/>
+                                <a:gd name="T112" fmla="+- 0 719 626"/>
+                                <a:gd name="T113" fmla="*/ T112 w 1230"/>
+                                <a:gd name="T114" fmla="+- 0 11862 11571"/>
+                                <a:gd name="T115" fmla="*/ 11862 h 1230"/>
+                                <a:gd name="T116" fmla="+- 0 675 626"/>
+                                <a:gd name="T117" fmla="*/ T116 w 1230"/>
+                                <a:gd name="T118" fmla="+- 0 11947 11571"/>
+                                <a:gd name="T119" fmla="*/ 11947 h 1230"/>
+                                <a:gd name="T120" fmla="+- 0 644 626"/>
+                                <a:gd name="T121" fmla="*/ T120 w 1230"/>
+                                <a:gd name="T122" fmla="+- 0 12039 11571"/>
+                                <a:gd name="T123" fmla="*/ 12039 h 1230"/>
+                                <a:gd name="T124" fmla="+- 0 628 626"/>
+                                <a:gd name="T125" fmla="*/ T124 w 1230"/>
+                                <a:gd name="T126" fmla="+- 0 12136 11571"/>
+                                <a:gd name="T127" fmla="*/ 12136 h 1230"/>
+                                <a:gd name="T128" fmla="+- 0 626 626"/>
+                                <a:gd name="T129" fmla="*/ T128 w 1230"/>
+                                <a:gd name="T130" fmla="+- 0 12186 11571"/>
+                                <a:gd name="T131" fmla="*/ 12186 h 1230"/>
+                                <a:gd name="T132" fmla="+- 0 628 626"/>
+                                <a:gd name="T133" fmla="*/ T132 w 1230"/>
+                                <a:gd name="T134" fmla="+- 0 12237 11571"/>
+                                <a:gd name="T135" fmla="*/ 12237 h 1230"/>
+                                <a:gd name="T136" fmla="+- 0 644 626"/>
+                                <a:gd name="T137" fmla="*/ T136 w 1230"/>
+                                <a:gd name="T138" fmla="+- 0 12334 11571"/>
+                                <a:gd name="T139" fmla="*/ 12334 h 1230"/>
+                                <a:gd name="T140" fmla="+- 0 675 626"/>
+                                <a:gd name="T141" fmla="*/ T140 w 1230"/>
+                                <a:gd name="T142" fmla="+- 0 12426 11571"/>
+                                <a:gd name="T143" fmla="*/ 12426 h 1230"/>
+                                <a:gd name="T144" fmla="+- 0 719 626"/>
+                                <a:gd name="T145" fmla="*/ T144 w 1230"/>
+                                <a:gd name="T146" fmla="+- 0 12511 11571"/>
+                                <a:gd name="T147" fmla="*/ 12511 h 1230"/>
+                                <a:gd name="T148" fmla="+- 0 775 626"/>
+                                <a:gd name="T149" fmla="*/ T148 w 1230"/>
+                                <a:gd name="T150" fmla="+- 0 12587 11571"/>
+                                <a:gd name="T151" fmla="*/ 12587 h 1230"/>
+                                <a:gd name="T152" fmla="+- 0 841 626"/>
+                                <a:gd name="T153" fmla="*/ T152 w 1230"/>
+                                <a:gd name="T154" fmla="+- 0 12654 11571"/>
+                                <a:gd name="T155" fmla="*/ 12654 h 1230"/>
+                                <a:gd name="T156" fmla="+- 0 918 626"/>
+                                <a:gd name="T157" fmla="*/ T156 w 1230"/>
+                                <a:gd name="T158" fmla="+- 0 12710 11571"/>
+                                <a:gd name="T159" fmla="*/ 12710 h 1230"/>
+                                <a:gd name="T160" fmla="+- 0 1002 626"/>
+                                <a:gd name="T161" fmla="*/ T160 w 1230"/>
+                                <a:gd name="T162" fmla="+- 0 12753 11571"/>
+                                <a:gd name="T163" fmla="*/ 12753 h 1230"/>
+                                <a:gd name="T164" fmla="+- 0 1094 626"/>
+                                <a:gd name="T165" fmla="*/ T164 w 1230"/>
+                                <a:gd name="T166" fmla="+- 0 12784 11571"/>
+                                <a:gd name="T167" fmla="*/ 12784 h 1230"/>
+                                <a:gd name="T168" fmla="+- 0 1191 626"/>
+                                <a:gd name="T169" fmla="*/ T168 w 1230"/>
+                                <a:gd name="T170" fmla="+- 0 12800 11571"/>
+                                <a:gd name="T171" fmla="*/ 12800 h 1230"/>
+                                <a:gd name="T172" fmla="+- 0 1242 626"/>
+                                <a:gd name="T173" fmla="*/ T172 w 1230"/>
+                                <a:gd name="T174" fmla="+- 0 12802 11571"/>
+                                <a:gd name="T175" fmla="*/ 12802 h 1230"/>
+                              </a:gdLst>
+                              <a:ahLst/>
+                              <a:cxnLst>
+                                <a:cxn ang="0">
+                                  <a:pos x="T1" y="T3"/>
+                                </a:cxn>
+                                <a:cxn ang="0">
+                                  <a:pos x="T5" y="T7"/>
+                                </a:cxn>
+                                <a:cxn ang="0">
+                                  <a:pos x="T9" y="T11"/>
+                                </a:cxn>
+                                <a:cxn ang="0">
+                                  <a:pos x="T13" y="T15"/>
+                                </a:cxn>
+                                <a:cxn ang="0">
+                                  <a:pos x="T17" y="T19"/>
+                                </a:cxn>
+                                <a:cxn ang="0">
+                                  <a:pos x="T21" y="T23"/>
+                                </a:cxn>
+                                <a:cxn ang="0">
+                                  <a:pos x="T25" y="T27"/>
+                                </a:cxn>
+                                <a:cxn ang="0">
+                                  <a:pos x="T29" y="T31"/>
+                                </a:cxn>
+                                <a:cxn ang="0">
+                                  <a:pos x="T33" y="T35"/>
+                                </a:cxn>
+                                <a:cxn ang="0">
+                                  <a:pos x="T37" y="T39"/>
+                                </a:cxn>
+                                <a:cxn ang="0">
+                                  <a:pos x="T41" y="T43"/>
+                                </a:cxn>
+                                <a:cxn ang="0">
+                                  <a:pos x="T45" y="T47"/>
+                                </a:cxn>
+                                <a:cxn ang="0">
+                                  <a:pos x="T49" y="T51"/>
+                                </a:cxn>
+                                <a:cxn ang="0">
+                                  <a:pos x="T53" y="T55"/>
+                                </a:cxn>
+                                <a:cxn ang="0">
+                                  <a:pos x="T57" y="T59"/>
+                                </a:cxn>
+                                <a:cxn ang="0">
+                                  <a:pos x="T61" y="T63"/>
+                                </a:cxn>
+                                <a:cxn ang="0">
+                                  <a:pos x="T65" y="T67"/>
+                                </a:cxn>
+                                <a:cxn ang="0">
+                                  <a:pos x="T69" y="T71"/>
+                                </a:cxn>
+                                <a:cxn ang="0">
+                                  <a:pos x="T73" y="T75"/>
+                                </a:cxn>
+                                <a:cxn ang="0">
+                                  <a:pos x="T77" y="T79"/>
+                                </a:cxn>
+                                <a:cxn ang="0">
+                                  <a:pos x="T81" y="T83"/>
+                                </a:cxn>
+                                <a:cxn ang="0">
+                                  <a:pos x="T85" y="T87"/>
+                                </a:cxn>
+                                <a:cxn ang="0">
+                                  <a:pos x="T89" y="T91"/>
+                                </a:cxn>
+                                <a:cxn ang="0">
+                                  <a:pos x="T93" y="T95"/>
+                                </a:cxn>
+                                <a:cxn ang="0">
+                                  <a:pos x="T97" y="T99"/>
+                                </a:cxn>
+                                <a:cxn ang="0">
+                                  <a:pos x="T101" y="T103"/>
+                                </a:cxn>
+                                <a:cxn ang="0">
+                                  <a:pos x="T105" y="T107"/>
+                                </a:cxn>
+                                <a:cxn ang="0">
+                                  <a:pos x="T109" y="T111"/>
+                                </a:cxn>
+                                <a:cxn ang="0">
+                                  <a:pos x="T113" y="T115"/>
+                                </a:cxn>
+                                <a:cxn ang="0">
+                                  <a:pos x="T117" y="T119"/>
+                                </a:cxn>
+                                <a:cxn ang="0">
+                                  <a:pos x="T121" y="T123"/>
+                                </a:cxn>
+                                <a:cxn ang="0">
+                                  <a:pos x="T125" y="T127"/>
+                                </a:cxn>
+                                <a:cxn ang="0">
+                                  <a:pos x="T129" y="T131"/>
+                                </a:cxn>
+                                <a:cxn ang="0">
+                                  <a:pos x="T133" y="T135"/>
+                                </a:cxn>
+                                <a:cxn ang="0">
+                                  <a:pos x="T137" y="T139"/>
+                                </a:cxn>
+                                <a:cxn ang="0">
+                                  <a:pos x="T141" y="T143"/>
+                                </a:cxn>
+                                <a:cxn ang="0">
+                                  <a:pos x="T145" y="T147"/>
+                                </a:cxn>
+                                <a:cxn ang="0">
+                                  <a:pos x="T149" y="T151"/>
+                                </a:cxn>
+                                <a:cxn ang="0">
+                                  <a:pos x="T153" y="T155"/>
+                                </a:cxn>
+                                <a:cxn ang="0">
+                                  <a:pos x="T157" y="T159"/>
+                                </a:cxn>
+                                <a:cxn ang="0">
+                                  <a:pos x="T161" y="T163"/>
+                                </a:cxn>
+                                <a:cxn ang="0">
+                                  <a:pos x="T165" y="T167"/>
+                                </a:cxn>
+                                <a:cxn ang="0">
+                                  <a:pos x="T169" y="T171"/>
+                                </a:cxn>
+                                <a:cxn ang="0">
+                                  <a:pos x="T173" y="T175"/>
+                                </a:cxn>
+                              </a:cxnLst>
+                              <a:rect l="0" t="0" r="r" b="b"/>
+                              <a:pathLst>
+                                <a:path w="1230" h="1230">
+                                  <a:moveTo>
+                                    <a:pt x="616" y="1231"/>
+                                  </a:moveTo>
+                                  <a:lnTo>
+                                    <a:pt x="715" y="1223"/>
+                                  </a:lnTo>
+                                  <a:lnTo>
+                                    <a:pt x="810" y="1199"/>
+                                  </a:lnTo>
+                                  <a:lnTo>
+                                    <a:pt x="898" y="1162"/>
+                                  </a:lnTo>
+                                  <a:lnTo>
+                                    <a:pt x="979" y="1112"/>
+                                  </a:lnTo>
+                                  <a:lnTo>
+                                    <a:pt x="1051" y="1051"/>
+                                  </a:lnTo>
+                                  <a:lnTo>
+                                    <a:pt x="1112" y="979"/>
+                                  </a:lnTo>
+                                  <a:lnTo>
+                                    <a:pt x="1162" y="898"/>
+                                  </a:lnTo>
+                                  <a:lnTo>
+                                    <a:pt x="1200" y="810"/>
+                                  </a:lnTo>
+                                  <a:lnTo>
+                                    <a:pt x="1223" y="715"/>
+                                  </a:lnTo>
+                                  <a:lnTo>
+                                    <a:pt x="1231" y="615"/>
+                                  </a:lnTo>
+                                  <a:lnTo>
+                                    <a:pt x="1229" y="565"/>
+                                  </a:lnTo>
+                                  <a:lnTo>
+                                    <a:pt x="1213" y="468"/>
+                                  </a:lnTo>
+                                  <a:lnTo>
+                                    <a:pt x="1183" y="376"/>
+                                  </a:lnTo>
+                                  <a:lnTo>
+                                    <a:pt x="1139" y="291"/>
+                                  </a:lnTo>
+                                  <a:lnTo>
+                                    <a:pt x="1083" y="215"/>
+                                  </a:lnTo>
+                                  <a:lnTo>
+                                    <a:pt x="1016" y="148"/>
+                                  </a:lnTo>
+                                  <a:lnTo>
+                                    <a:pt x="940" y="92"/>
+                                  </a:lnTo>
+                                  <a:lnTo>
+                                    <a:pt x="855" y="49"/>
+                                  </a:lnTo>
+                                  <a:lnTo>
+                                    <a:pt x="764" y="18"/>
+                                  </a:lnTo>
+                                  <a:lnTo>
+                                    <a:pt x="666" y="2"/>
+                                  </a:lnTo>
+                                  <a:lnTo>
+                                    <a:pt x="616" y="0"/>
+                                  </a:lnTo>
+                                  <a:lnTo>
+                                    <a:pt x="565" y="2"/>
+                                  </a:lnTo>
+                                  <a:lnTo>
+                                    <a:pt x="468" y="18"/>
+                                  </a:lnTo>
+                                  <a:lnTo>
+                                    <a:pt x="376" y="49"/>
+                                  </a:lnTo>
+                                  <a:lnTo>
+                                    <a:pt x="292" y="92"/>
+                                  </a:lnTo>
+                                  <a:lnTo>
+                                    <a:pt x="215" y="148"/>
+                                  </a:lnTo>
+                                  <a:lnTo>
+                                    <a:pt x="149" y="215"/>
+                                  </a:lnTo>
+                                  <a:lnTo>
+                                    <a:pt x="93" y="291"/>
+                                  </a:lnTo>
+                                  <a:lnTo>
+                                    <a:pt x="49" y="376"/>
+                                  </a:lnTo>
+                                  <a:lnTo>
+                                    <a:pt x="18" y="468"/>
+                                  </a:lnTo>
+                                  <a:lnTo>
+                                    <a:pt x="2" y="565"/>
+                                  </a:lnTo>
+                                  <a:lnTo>
+                                    <a:pt x="0" y="615"/>
+                                  </a:lnTo>
+                                  <a:lnTo>
+                                    <a:pt x="2" y="666"/>
+                                  </a:lnTo>
+                                  <a:lnTo>
+                                    <a:pt x="18" y="763"/>
+                                  </a:lnTo>
+                                  <a:lnTo>
+                                    <a:pt x="49" y="855"/>
+                                  </a:lnTo>
+                                  <a:lnTo>
+                                    <a:pt x="93" y="940"/>
+                                  </a:lnTo>
+                                  <a:lnTo>
+                                    <a:pt x="149" y="1016"/>
+                                  </a:lnTo>
+                                  <a:lnTo>
+                                    <a:pt x="215" y="1083"/>
+                                  </a:lnTo>
+                                  <a:lnTo>
+                                    <a:pt x="292" y="1139"/>
+                                  </a:lnTo>
+                                  <a:lnTo>
+                                    <a:pt x="376" y="1182"/>
+                                  </a:lnTo>
+                                  <a:lnTo>
+                                    <a:pt x="468" y="1213"/>
+                                  </a:lnTo>
+                                  <a:lnTo>
+                                    <a:pt x="565" y="1229"/>
+                                  </a:lnTo>
+                                  <a:lnTo>
+                                    <a:pt x="616" y="1231"/>
+                                  </a:lnTo>
+                                  <a:close/>
+                                </a:path>
+                              </a:pathLst>
+                            </a:custGeom>
+                            <a:noFill/>
+                            <a:ln w="14656">
+                              <a:solidFill>
+                                <a:srgbClr val="A7A9AC"/>
+                              </a:solidFill>
+                              <a:round/>
+                              <a:headEnd/>
+                              <a:tailEnd/>
+                            </a:ln>
+                            <a:extLst>
+                              <a:ext uri="{909E8E84-426E-40DD-AFC4-6F175D3DCCD1}">
+                                <a14:hiddenFill xmlns:a14="http://schemas.microsoft.com/office/drawing/2010/main">
+                                  <a:solidFill>
+                                    <a:srgbClr val="FFFFFF"/>
+                                  </a:solidFill>
+                                </a14:hiddenFill>
+                              </a:ext>
+                            </a:extLst>
+                          </wps:spPr>
+                          <wps:bodyPr rot="0" vert="horz" wrap="square" lIns="91440" tIns="45720" rIns="91440" bIns="45720" anchor="t" anchorCtr="0" upright="1">
+                            <a:noAutofit/>
+                          </wps:bodyPr>
+                        </wps:wsp>
+                      </wpg:grpSp>
+                      <wpg:grpSp>
+                        <wpg:cNvPr id="1040" name="Group 16"/>
+                        <wpg:cNvGrpSpPr>
+                          <a:grpSpLocks/>
+                        </wpg:cNvGrpSpPr>
+                        <wpg:grpSpPr bwMode="auto">
+                          <a:xfrm>
+                            <a:off x="855" y="11807"/>
+                            <a:ext cx="768" cy="768"/>
+                            <a:chOff x="855" y="11807"/>
+                            <a:chExt cx="768" cy="768"/>
+                          </a:xfrm>
+                        </wpg:grpSpPr>
+                        <wps:wsp>
+                          <wps:cNvPr id="1041" name="Freeform 17"/>
+                          <wps:cNvSpPr>
+                            <a:spLocks/>
+                          </wps:cNvSpPr>
+                          <wps:spPr bwMode="auto">
+                            <a:xfrm>
+                              <a:off x="855" y="11807"/>
+                              <a:ext cx="768" cy="768"/>
+                            </a:xfrm>
+                            <a:custGeom>
+                              <a:avLst/>
+                              <a:gdLst>
+                                <a:gd name="T0" fmla="+- 0 1239 855"/>
+                                <a:gd name="T1" fmla="*/ T0 w 768"/>
+                                <a:gd name="T2" fmla="+- 0 11807 11807"/>
+                                <a:gd name="T3" fmla="*/ 11807 h 768"/>
+                                <a:gd name="T4" fmla="+- 0 1177 855"/>
+                                <a:gd name="T5" fmla="*/ T4 w 768"/>
+                                <a:gd name="T6" fmla="+- 0 11812 11807"/>
+                                <a:gd name="T7" fmla="*/ 11812 h 768"/>
+                                <a:gd name="T8" fmla="+- 0 1118 855"/>
+                                <a:gd name="T9" fmla="*/ T8 w 768"/>
+                                <a:gd name="T10" fmla="+- 0 11827 11807"/>
+                                <a:gd name="T11" fmla="*/ 11827 h 768"/>
+                                <a:gd name="T12" fmla="+- 0 1037 855"/>
+                                <a:gd name="T13" fmla="*/ T12 w 768"/>
+                                <a:gd name="T14" fmla="+- 0 11865 11807"/>
+                                <a:gd name="T15" fmla="*/ 11865 h 768"/>
+                                <a:gd name="T16" fmla="+- 0 968 855"/>
+                                <a:gd name="T17" fmla="*/ T16 w 768"/>
+                                <a:gd name="T18" fmla="+- 0 11920 11807"/>
+                                <a:gd name="T19" fmla="*/ 11920 h 768"/>
+                                <a:gd name="T20" fmla="+- 0 913 855"/>
+                                <a:gd name="T21" fmla="*/ T20 w 768"/>
+                                <a:gd name="T22" fmla="+- 0 11989 11807"/>
+                                <a:gd name="T23" fmla="*/ 11989 h 768"/>
+                                <a:gd name="T24" fmla="+- 0 875 855"/>
+                                <a:gd name="T25" fmla="*/ T24 w 768"/>
+                                <a:gd name="T26" fmla="+- 0 12070 11807"/>
+                                <a:gd name="T27" fmla="*/ 12070 h 768"/>
+                                <a:gd name="T28" fmla="+- 0 860 855"/>
+                                <a:gd name="T29" fmla="*/ T28 w 768"/>
+                                <a:gd name="T30" fmla="+- 0 12129 11807"/>
+                                <a:gd name="T31" fmla="*/ 12129 h 768"/>
+                                <a:gd name="T32" fmla="+- 0 855 855"/>
+                                <a:gd name="T33" fmla="*/ T32 w 768"/>
+                                <a:gd name="T34" fmla="+- 0 12191 11807"/>
+                                <a:gd name="T35" fmla="*/ 12191 h 768"/>
+                                <a:gd name="T36" fmla="+- 0 856 855"/>
+                                <a:gd name="T37" fmla="*/ T36 w 768"/>
+                                <a:gd name="T38" fmla="+- 0 12223 11807"/>
+                                <a:gd name="T39" fmla="*/ 12223 h 768"/>
+                                <a:gd name="T40" fmla="+- 0 866 855"/>
+                                <a:gd name="T41" fmla="*/ T40 w 768"/>
+                                <a:gd name="T42" fmla="+- 0 12284 11807"/>
+                                <a:gd name="T43" fmla="*/ 12284 h 768"/>
+                                <a:gd name="T44" fmla="+- 0 885 855"/>
+                                <a:gd name="T45" fmla="*/ T44 w 768"/>
+                                <a:gd name="T46" fmla="+- 0 12341 11807"/>
+                                <a:gd name="T47" fmla="*/ 12341 h 768"/>
+                                <a:gd name="T48" fmla="+- 0 929 855"/>
+                                <a:gd name="T49" fmla="*/ T48 w 768"/>
+                                <a:gd name="T50" fmla="+- 0 12418 11807"/>
+                                <a:gd name="T51" fmla="*/ 12418 h 768"/>
+                                <a:gd name="T52" fmla="+- 0 989 855"/>
+                                <a:gd name="T53" fmla="*/ T52 w 768"/>
+                                <a:gd name="T54" fmla="+- 0 12483 11807"/>
+                                <a:gd name="T55" fmla="*/ 12483 h 768"/>
+                                <a:gd name="T56" fmla="+- 0 1063 855"/>
+                                <a:gd name="T57" fmla="*/ T56 w 768"/>
+                                <a:gd name="T58" fmla="+- 0 12533 11807"/>
+                                <a:gd name="T59" fmla="*/ 12533 h 768"/>
+                                <a:gd name="T60" fmla="+- 0 1147 855"/>
+                                <a:gd name="T61" fmla="*/ T60 w 768"/>
+                                <a:gd name="T62" fmla="+- 0 12564 11807"/>
+                                <a:gd name="T63" fmla="*/ 12564 h 768"/>
+                                <a:gd name="T64" fmla="+- 0 1208 855"/>
+                                <a:gd name="T65" fmla="*/ T64 w 768"/>
+                                <a:gd name="T66" fmla="+- 0 12574 11807"/>
+                                <a:gd name="T67" fmla="*/ 12574 h 768"/>
+                                <a:gd name="T68" fmla="+- 0 1239 855"/>
+                                <a:gd name="T69" fmla="*/ T68 w 768"/>
+                                <a:gd name="T70" fmla="+- 0 12575 11807"/>
+                                <a:gd name="T71" fmla="*/ 12575 h 768"/>
+                                <a:gd name="T72" fmla="+- 0 1271 855"/>
+                                <a:gd name="T73" fmla="*/ T72 w 768"/>
+                                <a:gd name="T74" fmla="+- 0 12574 11807"/>
+                                <a:gd name="T75" fmla="*/ 12574 h 768"/>
+                                <a:gd name="T76" fmla="+- 0 1302 855"/>
+                                <a:gd name="T77" fmla="*/ T76 w 768"/>
+                                <a:gd name="T78" fmla="+- 0 12570 11807"/>
+                                <a:gd name="T79" fmla="*/ 12570 h 768"/>
+                                <a:gd name="T80" fmla="+- 0 1302 855"/>
+                                <a:gd name="T81" fmla="*/ T80 w 768"/>
+                                <a:gd name="T82" fmla="+- 0 12570 11807"/>
+                                <a:gd name="T83" fmla="*/ 12570 h 768"/>
+                                <a:gd name="T84" fmla="+- 0 1239 855"/>
+                                <a:gd name="T85" fmla="*/ T84 w 768"/>
+                                <a:gd name="T86" fmla="+- 0 12570 11807"/>
+                                <a:gd name="T87" fmla="*/ 12570 h 768"/>
+                                <a:gd name="T88" fmla="+- 0 1208 855"/>
+                                <a:gd name="T89" fmla="*/ T88 w 768"/>
+                                <a:gd name="T90" fmla="+- 0 12569 11807"/>
+                                <a:gd name="T91" fmla="*/ 12569 h 768"/>
+                                <a:gd name="T92" fmla="+- 0 1148 855"/>
+                                <a:gd name="T93" fmla="*/ T92 w 768"/>
+                                <a:gd name="T94" fmla="+- 0 12559 11807"/>
+                                <a:gd name="T95" fmla="*/ 12559 h 768"/>
+                                <a:gd name="T96" fmla="+- 0 1065 855"/>
+                                <a:gd name="T97" fmla="*/ T96 w 768"/>
+                                <a:gd name="T98" fmla="+- 0 12528 11807"/>
+                                <a:gd name="T99" fmla="*/ 12528 h 768"/>
+                                <a:gd name="T100" fmla="+- 0 993 855"/>
+                                <a:gd name="T101" fmla="*/ T100 w 768"/>
+                                <a:gd name="T102" fmla="+- 0 12479 11807"/>
+                                <a:gd name="T103" fmla="*/ 12479 h 768"/>
+                                <a:gd name="T104" fmla="+- 0 934 855"/>
+                                <a:gd name="T105" fmla="*/ T104 w 768"/>
+                                <a:gd name="T106" fmla="+- 0 12415 11807"/>
+                                <a:gd name="T107" fmla="*/ 12415 h 768"/>
+                                <a:gd name="T108" fmla="+- 0 890 855"/>
+                                <a:gd name="T109" fmla="*/ T108 w 768"/>
+                                <a:gd name="T110" fmla="+- 0 12339 11807"/>
+                                <a:gd name="T111" fmla="*/ 12339 h 768"/>
+                                <a:gd name="T112" fmla="+- 0 865 855"/>
+                                <a:gd name="T113" fmla="*/ T112 w 768"/>
+                                <a:gd name="T114" fmla="+- 0 12253 11807"/>
+                                <a:gd name="T115" fmla="*/ 12253 h 768"/>
+                                <a:gd name="T116" fmla="+- 0 860 855"/>
+                                <a:gd name="T117" fmla="*/ T116 w 768"/>
+                                <a:gd name="T118" fmla="+- 0 12191 11807"/>
+                                <a:gd name="T119" fmla="*/ 12191 h 768"/>
+                                <a:gd name="T120" fmla="+- 0 861 855"/>
+                                <a:gd name="T121" fmla="*/ T120 w 768"/>
+                                <a:gd name="T122" fmla="+- 0 12160 11807"/>
+                                <a:gd name="T123" fmla="*/ 12160 h 768"/>
+                                <a:gd name="T124" fmla="+- 0 871 855"/>
+                                <a:gd name="T125" fmla="*/ T124 w 768"/>
+                                <a:gd name="T126" fmla="+- 0 12100 11807"/>
+                                <a:gd name="T127" fmla="*/ 12100 h 768"/>
+                                <a:gd name="T128" fmla="+- 0 903 855"/>
+                                <a:gd name="T129" fmla="*/ T128 w 768"/>
+                                <a:gd name="T130" fmla="+- 0 12017 11807"/>
+                                <a:gd name="T131" fmla="*/ 12017 h 768"/>
+                                <a:gd name="T132" fmla="+- 0 952 855"/>
+                                <a:gd name="T133" fmla="*/ T132 w 768"/>
+                                <a:gd name="T134" fmla="+- 0 11945 11807"/>
+                                <a:gd name="T135" fmla="*/ 11945 h 768"/>
+                                <a:gd name="T136" fmla="+- 0 1016 855"/>
+                                <a:gd name="T137" fmla="*/ T136 w 768"/>
+                                <a:gd name="T138" fmla="+- 0 11886 11807"/>
+                                <a:gd name="T139" fmla="*/ 11886 h 768"/>
+                                <a:gd name="T140" fmla="+- 0 1092 855"/>
+                                <a:gd name="T141" fmla="*/ T140 w 768"/>
+                                <a:gd name="T142" fmla="+- 0 11842 11807"/>
+                                <a:gd name="T143" fmla="*/ 11842 h 768"/>
+                                <a:gd name="T144" fmla="+- 0 1178 855"/>
+                                <a:gd name="T145" fmla="*/ T144 w 768"/>
+                                <a:gd name="T146" fmla="+- 0 11817 11807"/>
+                                <a:gd name="T147" fmla="*/ 11817 h 768"/>
+                                <a:gd name="T148" fmla="+- 0 1239 855"/>
+                                <a:gd name="T149" fmla="*/ T148 w 768"/>
+                                <a:gd name="T150" fmla="+- 0 11812 11807"/>
+                                <a:gd name="T151" fmla="*/ 11812 h 768"/>
+                                <a:gd name="T152" fmla="+- 0 1302 855"/>
+                                <a:gd name="T153" fmla="*/ T152 w 768"/>
+                                <a:gd name="T154" fmla="+- 0 11812 11807"/>
+                                <a:gd name="T155" fmla="*/ 11812 h 768"/>
+                                <a:gd name="T156" fmla="+- 0 1302 855"/>
+                                <a:gd name="T157" fmla="*/ T156 w 768"/>
+                                <a:gd name="T158" fmla="+- 0 11812 11807"/>
+                                <a:gd name="T159" fmla="*/ 11812 h 768"/>
+                                <a:gd name="T160" fmla="+- 0 1271 855"/>
+                                <a:gd name="T161" fmla="*/ T160 w 768"/>
+                                <a:gd name="T162" fmla="+- 0 11808 11807"/>
+                                <a:gd name="T163" fmla="*/ 11808 h 768"/>
+                                <a:gd name="T164" fmla="+- 0 1239 855"/>
+                                <a:gd name="T165" fmla="*/ T164 w 768"/>
+                                <a:gd name="T166" fmla="+- 0 11807 11807"/>
+                                <a:gd name="T167" fmla="*/ 11807 h 768"/>
+                              </a:gdLst>
+                              <a:ahLst/>
+                              <a:cxnLst>
+                                <a:cxn ang="0">
+                                  <a:pos x="T1" y="T3"/>
+                                </a:cxn>
+                                <a:cxn ang="0">
+                                  <a:pos x="T5" y="T7"/>
+                                </a:cxn>
+                                <a:cxn ang="0">
+                                  <a:pos x="T9" y="T11"/>
+                                </a:cxn>
+                                <a:cxn ang="0">
+                                  <a:pos x="T13" y="T15"/>
+                                </a:cxn>
+                                <a:cxn ang="0">
+                                  <a:pos x="T17" y="T19"/>
+                                </a:cxn>
+                                <a:cxn ang="0">
+                                  <a:pos x="T21" y="T23"/>
+                                </a:cxn>
+                                <a:cxn ang="0">
+                                  <a:pos x="T25" y="T27"/>
+                                </a:cxn>
+                                <a:cxn ang="0">
+                                  <a:pos x="T29" y="T31"/>
+                                </a:cxn>
+                                <a:cxn ang="0">
+                                  <a:pos x="T33" y="T35"/>
+                                </a:cxn>
+                                <a:cxn ang="0">
+                                  <a:pos x="T37" y="T39"/>
+                                </a:cxn>
+                                <a:cxn ang="0">
+                                  <a:pos x="T41" y="T43"/>
+                                </a:cxn>
+                                <a:cxn ang="0">
+                                  <a:pos x="T45" y="T47"/>
+                                </a:cxn>
+                                <a:cxn ang="0">
+                                  <a:pos x="T49" y="T51"/>
+                                </a:cxn>
+                                <a:cxn ang="0">
+                                  <a:pos x="T53" y="T55"/>
+                                </a:cxn>
+                                <a:cxn ang="0">
+                                  <a:pos x="T57" y="T59"/>
+                                </a:cxn>
+                                <a:cxn ang="0">
+                                  <a:pos x="T61" y="T63"/>
+                                </a:cxn>
+                                <a:cxn ang="0">
+                                  <a:pos x="T65" y="T67"/>
+                                </a:cxn>
+                                <a:cxn ang="0">
+                                  <a:pos x="T69" y="T71"/>
+                                </a:cxn>
+                                <a:cxn ang="0">
+                                  <a:pos x="T73" y="T75"/>
+                                </a:cxn>
+                                <a:cxn ang="0">
+                                  <a:pos x="T77" y="T79"/>
+                                </a:cxn>
+                                <a:cxn ang="0">
+                                  <a:pos x="T81" y="T83"/>
+                                </a:cxn>
+                                <a:cxn ang="0">
+                                  <a:pos x="T85" y="T87"/>
+                                </a:cxn>
+                                <a:cxn ang="0">
+                                  <a:pos x="T89" y="T91"/>
+                                </a:cxn>
+                                <a:cxn ang="0">
+                                  <a:pos x="T93" y="T95"/>
+                                </a:cxn>
+                                <a:cxn ang="0">
+                                  <a:pos x="T97" y="T99"/>
+                                </a:cxn>
+                                <a:cxn ang="0">
+                                  <a:pos x="T101" y="T103"/>
+                                </a:cxn>
+                                <a:cxn ang="0">
+                                  <a:pos x="T105" y="T107"/>
+                                </a:cxn>
+                                <a:cxn ang="0">
+                                  <a:pos x="T109" y="T111"/>
+                                </a:cxn>
+                                <a:cxn ang="0">
+                                  <a:pos x="T113" y="T115"/>
+                                </a:cxn>
+                                <a:cxn ang="0">
+                                  <a:pos x="T117" y="T119"/>
+                                </a:cxn>
+                                <a:cxn ang="0">
+                                  <a:pos x="T121" y="T123"/>
+                                </a:cxn>
+                                <a:cxn ang="0">
+                                  <a:pos x="T125" y="T127"/>
+                                </a:cxn>
+                                <a:cxn ang="0">
+                                  <a:pos x="T129" y="T131"/>
+                                </a:cxn>
+                                <a:cxn ang="0">
+                                  <a:pos x="T133" y="T135"/>
+                                </a:cxn>
+                                <a:cxn ang="0">
+                                  <a:pos x="T137" y="T139"/>
+                                </a:cxn>
+                                <a:cxn ang="0">
+                                  <a:pos x="T141" y="T143"/>
+                                </a:cxn>
+                                <a:cxn ang="0">
+                                  <a:pos x="T145" y="T147"/>
+                                </a:cxn>
+                                <a:cxn ang="0">
+                                  <a:pos x="T149" y="T151"/>
+                                </a:cxn>
+                                <a:cxn ang="0">
+                                  <a:pos x="T153" y="T155"/>
+                                </a:cxn>
+                                <a:cxn ang="0">
+                                  <a:pos x="T157" y="T159"/>
+                                </a:cxn>
+                                <a:cxn ang="0">
+                                  <a:pos x="T161" y="T163"/>
+                                </a:cxn>
+                                <a:cxn ang="0">
+                                  <a:pos x="T165" y="T167"/>
+                                </a:cxn>
+                              </a:cxnLst>
+                              <a:rect l="0" t="0" r="r" b="b"/>
+                              <a:pathLst>
+                                <a:path w="768" h="768">
+                                  <a:moveTo>
+                                    <a:pt x="384" y="0"/>
+                                  </a:moveTo>
+                                  <a:lnTo>
+                                    <a:pt x="322" y="5"/>
+                                  </a:lnTo>
+                                  <a:lnTo>
+                                    <a:pt x="263" y="20"/>
+                                  </a:lnTo>
+                                  <a:lnTo>
+                                    <a:pt x="182" y="58"/>
+                                  </a:lnTo>
+                                  <a:lnTo>
+                                    <a:pt x="113" y="113"/>
+                                  </a:lnTo>
+                                  <a:lnTo>
+                                    <a:pt x="58" y="182"/>
+                                  </a:lnTo>
+                                  <a:lnTo>
+                                    <a:pt x="20" y="263"/>
+                                  </a:lnTo>
+                                  <a:lnTo>
+                                    <a:pt x="5" y="322"/>
+                                  </a:lnTo>
+                                  <a:lnTo>
+                                    <a:pt x="0" y="384"/>
+                                  </a:lnTo>
+                                  <a:lnTo>
+                                    <a:pt x="1" y="416"/>
+                                  </a:lnTo>
+                                  <a:lnTo>
+                                    <a:pt x="11" y="477"/>
+                                  </a:lnTo>
+                                  <a:lnTo>
+                                    <a:pt x="30" y="534"/>
+                                  </a:lnTo>
+                                  <a:lnTo>
+                                    <a:pt x="74" y="611"/>
+                                  </a:lnTo>
+                                  <a:lnTo>
+                                    <a:pt x="134" y="676"/>
+                                  </a:lnTo>
+                                  <a:lnTo>
+                                    <a:pt x="208" y="726"/>
+                                  </a:lnTo>
+                                  <a:lnTo>
+                                    <a:pt x="292" y="757"/>
+                                  </a:lnTo>
+                                  <a:lnTo>
+                                    <a:pt x="353" y="767"/>
+                                  </a:lnTo>
+                                  <a:lnTo>
+                                    <a:pt x="384" y="768"/>
+                                  </a:lnTo>
+                                  <a:lnTo>
+                                    <a:pt x="416" y="767"/>
+                                  </a:lnTo>
+                                  <a:lnTo>
+                                    <a:pt x="447" y="763"/>
+                                  </a:lnTo>
+                                  <a:lnTo>
+                                    <a:pt x="384" y="763"/>
+                                  </a:lnTo>
+                                  <a:lnTo>
+                                    <a:pt x="353" y="762"/>
+                                  </a:lnTo>
+                                  <a:lnTo>
+                                    <a:pt x="293" y="752"/>
+                                  </a:lnTo>
+                                  <a:lnTo>
+                                    <a:pt x="210" y="721"/>
+                                  </a:lnTo>
+                                  <a:lnTo>
+                                    <a:pt x="138" y="672"/>
+                                  </a:lnTo>
+                                  <a:lnTo>
+                                    <a:pt x="79" y="608"/>
+                                  </a:lnTo>
+                                  <a:lnTo>
+                                    <a:pt x="35" y="532"/>
+                                  </a:lnTo>
+                                  <a:lnTo>
+                                    <a:pt x="10" y="446"/>
+                                  </a:lnTo>
+                                  <a:lnTo>
+                                    <a:pt x="5" y="384"/>
+                                  </a:lnTo>
+                                  <a:lnTo>
+                                    <a:pt x="6" y="353"/>
+                                  </a:lnTo>
+                                  <a:lnTo>
+                                    <a:pt x="16" y="293"/>
+                                  </a:lnTo>
+                                  <a:lnTo>
+                                    <a:pt x="48" y="210"/>
+                                  </a:lnTo>
+                                  <a:lnTo>
+                                    <a:pt x="97" y="138"/>
+                                  </a:lnTo>
+                                  <a:lnTo>
+                                    <a:pt x="161" y="79"/>
+                                  </a:lnTo>
+                                  <a:lnTo>
+                                    <a:pt x="237" y="35"/>
+                                  </a:lnTo>
+                                  <a:lnTo>
+                                    <a:pt x="323" y="10"/>
+                                  </a:lnTo>
+                                  <a:lnTo>
+                                    <a:pt x="384" y="5"/>
+                                  </a:lnTo>
+                                  <a:lnTo>
+                                    <a:pt x="447" y="5"/>
+                                  </a:lnTo>
+                                  <a:lnTo>
+                                    <a:pt x="416" y="1"/>
+                                  </a:lnTo>
+                                  <a:lnTo>
+                                    <a:pt x="384" y="0"/>
+                                  </a:lnTo>
+                                </a:path>
+                              </a:pathLst>
+                            </a:custGeom>
+                            <a:solidFill>
+                              <a:srgbClr val="FFFFFF"/>
+                            </a:solidFill>
+                            <a:ln>
+                              <a:noFill/>
+                            </a:ln>
+                            <a:extLst>
+                              <a:ext uri="{91240B29-F687-4F45-9708-019B960494DF}">
+                                <a14:hiddenLine xmlns:a14="http://schemas.microsoft.com/office/drawing/2010/main" w="9525">
+                                  <a:solidFill>
+                                    <a:srgbClr val="000000"/>
+                                  </a:solidFill>
+                                  <a:round/>
+                                  <a:headEnd/>
+                                  <a:tailEnd/>
+                                </a14:hiddenLine>
+                              </a:ext>
+                            </a:extLst>
+                          </wps:spPr>
+                          <wps:bodyPr rot="0" vert="horz" wrap="square" lIns="91440" tIns="45720" rIns="91440" bIns="45720" anchor="t" anchorCtr="0" upright="1">
+                            <a:noAutofit/>
+                          </wps:bodyPr>
+                        </wps:wsp>
+                        <wps:wsp>
+                          <wps:cNvPr id="1042" name="Freeform 18"/>
+                          <wps:cNvSpPr>
+                            <a:spLocks/>
+                          </wps:cNvSpPr>
+                          <wps:spPr bwMode="auto">
+                            <a:xfrm>
+                              <a:off x="855" y="11807"/>
+                              <a:ext cx="768" cy="768"/>
+                            </a:xfrm>
+                            <a:custGeom>
+                              <a:avLst/>
+                              <a:gdLst>
+                                <a:gd name="T0" fmla="+- 0 1302 855"/>
+                                <a:gd name="T1" fmla="*/ T0 w 768"/>
+                                <a:gd name="T2" fmla="+- 0 11812 11807"/>
+                                <a:gd name="T3" fmla="*/ 11812 h 768"/>
+                                <a:gd name="T4" fmla="+- 0 1239 855"/>
+                                <a:gd name="T5" fmla="*/ T4 w 768"/>
+                                <a:gd name="T6" fmla="+- 0 11812 11807"/>
+                                <a:gd name="T7" fmla="*/ 11812 h 768"/>
+                                <a:gd name="T8" fmla="+- 0 1270 855"/>
+                                <a:gd name="T9" fmla="*/ T8 w 768"/>
+                                <a:gd name="T10" fmla="+- 0 11813 11807"/>
+                                <a:gd name="T11" fmla="*/ 11813 h 768"/>
+                                <a:gd name="T12" fmla="+- 0 1301 855"/>
+                                <a:gd name="T13" fmla="*/ T12 w 768"/>
+                                <a:gd name="T14" fmla="+- 0 11817 11807"/>
+                                <a:gd name="T15" fmla="*/ 11817 h 768"/>
+                                <a:gd name="T16" fmla="+- 0 1387 855"/>
+                                <a:gd name="T17" fmla="*/ T16 w 768"/>
+                                <a:gd name="T18" fmla="+- 0 11842 11807"/>
+                                <a:gd name="T19" fmla="*/ 11842 h 768"/>
+                                <a:gd name="T20" fmla="+- 0 1463 855"/>
+                                <a:gd name="T21" fmla="*/ T20 w 768"/>
+                                <a:gd name="T22" fmla="+- 0 11886 11807"/>
+                                <a:gd name="T23" fmla="*/ 11886 h 768"/>
+                                <a:gd name="T24" fmla="+- 0 1527 855"/>
+                                <a:gd name="T25" fmla="*/ T24 w 768"/>
+                                <a:gd name="T26" fmla="+- 0 11945 11807"/>
+                                <a:gd name="T27" fmla="*/ 11945 h 768"/>
+                                <a:gd name="T28" fmla="+- 0 1576 855"/>
+                                <a:gd name="T29" fmla="*/ T28 w 768"/>
+                                <a:gd name="T30" fmla="+- 0 12017 11807"/>
+                                <a:gd name="T31" fmla="*/ 12017 h 768"/>
+                                <a:gd name="T32" fmla="+- 0 1607 855"/>
+                                <a:gd name="T33" fmla="*/ T32 w 768"/>
+                                <a:gd name="T34" fmla="+- 0 12100 11807"/>
+                                <a:gd name="T35" fmla="*/ 12100 h 768"/>
+                                <a:gd name="T36" fmla="+- 0 1617 855"/>
+                                <a:gd name="T37" fmla="*/ T36 w 768"/>
+                                <a:gd name="T38" fmla="+- 0 12160 11807"/>
+                                <a:gd name="T39" fmla="*/ 12160 h 768"/>
+                                <a:gd name="T40" fmla="+- 0 1618 855"/>
+                                <a:gd name="T41" fmla="*/ T40 w 768"/>
+                                <a:gd name="T42" fmla="+- 0 12191 11807"/>
+                                <a:gd name="T43" fmla="*/ 12191 h 768"/>
+                                <a:gd name="T44" fmla="+- 0 1617 855"/>
+                                <a:gd name="T45" fmla="*/ T44 w 768"/>
+                                <a:gd name="T46" fmla="+- 0 12222 11807"/>
+                                <a:gd name="T47" fmla="*/ 12222 h 768"/>
+                                <a:gd name="T48" fmla="+- 0 1607 855"/>
+                                <a:gd name="T49" fmla="*/ T48 w 768"/>
+                                <a:gd name="T50" fmla="+- 0 12282 11807"/>
+                                <a:gd name="T51" fmla="*/ 12282 h 768"/>
+                                <a:gd name="T52" fmla="+- 0 1576 855"/>
+                                <a:gd name="T53" fmla="*/ T52 w 768"/>
+                                <a:gd name="T54" fmla="+- 0 12365 11807"/>
+                                <a:gd name="T55" fmla="*/ 12365 h 768"/>
+                                <a:gd name="T56" fmla="+- 0 1527 855"/>
+                                <a:gd name="T57" fmla="*/ T56 w 768"/>
+                                <a:gd name="T58" fmla="+- 0 12438 11807"/>
+                                <a:gd name="T59" fmla="*/ 12438 h 768"/>
+                                <a:gd name="T60" fmla="+- 0 1463 855"/>
+                                <a:gd name="T61" fmla="*/ T60 w 768"/>
+                                <a:gd name="T62" fmla="+- 0 12497 11807"/>
+                                <a:gd name="T63" fmla="*/ 12497 h 768"/>
+                                <a:gd name="T64" fmla="+- 0 1387 855"/>
+                                <a:gd name="T65" fmla="*/ T64 w 768"/>
+                                <a:gd name="T66" fmla="+- 0 12540 11807"/>
+                                <a:gd name="T67" fmla="*/ 12540 h 768"/>
+                                <a:gd name="T68" fmla="+- 0 1301 855"/>
+                                <a:gd name="T69" fmla="*/ T68 w 768"/>
+                                <a:gd name="T70" fmla="+- 0 12565 11807"/>
+                                <a:gd name="T71" fmla="*/ 12565 h 768"/>
+                                <a:gd name="T72" fmla="+- 0 1239 855"/>
+                                <a:gd name="T73" fmla="*/ T72 w 768"/>
+                                <a:gd name="T74" fmla="+- 0 12570 11807"/>
+                                <a:gd name="T75" fmla="*/ 12570 h 768"/>
+                                <a:gd name="T76" fmla="+- 0 1302 855"/>
+                                <a:gd name="T77" fmla="*/ T76 w 768"/>
+                                <a:gd name="T78" fmla="+- 0 12570 11807"/>
+                                <a:gd name="T79" fmla="*/ 12570 h 768"/>
+                                <a:gd name="T80" fmla="+- 0 1361 855"/>
+                                <a:gd name="T81" fmla="*/ T80 w 768"/>
+                                <a:gd name="T82" fmla="+- 0 12556 11807"/>
+                                <a:gd name="T83" fmla="*/ 12556 h 768"/>
+                                <a:gd name="T84" fmla="+- 0 1442 855"/>
+                                <a:gd name="T85" fmla="*/ T84 w 768"/>
+                                <a:gd name="T86" fmla="+- 0 12518 11807"/>
+                                <a:gd name="T87" fmla="*/ 12518 h 768"/>
+                                <a:gd name="T88" fmla="+- 0 1511 855"/>
+                                <a:gd name="T89" fmla="*/ T88 w 768"/>
+                                <a:gd name="T90" fmla="+- 0 12463 11807"/>
+                                <a:gd name="T91" fmla="*/ 12463 h 768"/>
+                                <a:gd name="T92" fmla="+- 0 1566 855"/>
+                                <a:gd name="T93" fmla="*/ T92 w 768"/>
+                                <a:gd name="T94" fmla="+- 0 12394 11807"/>
+                                <a:gd name="T95" fmla="*/ 12394 h 768"/>
+                                <a:gd name="T96" fmla="+- 0 1604 855"/>
+                                <a:gd name="T97" fmla="*/ T96 w 768"/>
+                                <a:gd name="T98" fmla="+- 0 12313 11807"/>
+                                <a:gd name="T99" fmla="*/ 12313 h 768"/>
+                                <a:gd name="T100" fmla="+- 0 1619 855"/>
+                                <a:gd name="T101" fmla="*/ T100 w 768"/>
+                                <a:gd name="T102" fmla="+- 0 12254 11807"/>
+                                <a:gd name="T103" fmla="*/ 12254 h 768"/>
+                                <a:gd name="T104" fmla="+- 0 1624 855"/>
+                                <a:gd name="T105" fmla="*/ T104 w 768"/>
+                                <a:gd name="T106" fmla="+- 0 12191 11807"/>
+                                <a:gd name="T107" fmla="*/ 12191 h 768"/>
+                                <a:gd name="T108" fmla="+- 0 1622 855"/>
+                                <a:gd name="T109" fmla="*/ T108 w 768"/>
+                                <a:gd name="T110" fmla="+- 0 12160 11807"/>
+                                <a:gd name="T111" fmla="*/ 12160 h 768"/>
+                                <a:gd name="T112" fmla="+- 0 1612 855"/>
+                                <a:gd name="T113" fmla="*/ T112 w 768"/>
+                                <a:gd name="T114" fmla="+- 0 12099 11807"/>
+                                <a:gd name="T115" fmla="*/ 12099 h 768"/>
+                                <a:gd name="T116" fmla="+- 0 1593 855"/>
+                                <a:gd name="T117" fmla="*/ T116 w 768"/>
+                                <a:gd name="T118" fmla="+- 0 12042 11807"/>
+                                <a:gd name="T119" fmla="*/ 12042 h 768"/>
+                                <a:gd name="T120" fmla="+- 0 1549 855"/>
+                                <a:gd name="T121" fmla="*/ T120 w 768"/>
+                                <a:gd name="T122" fmla="+- 0 11965 11807"/>
+                                <a:gd name="T123" fmla="*/ 11965 h 768"/>
+                                <a:gd name="T124" fmla="+- 0 1489 855"/>
+                                <a:gd name="T125" fmla="*/ T124 w 768"/>
+                                <a:gd name="T126" fmla="+- 0 11900 11807"/>
+                                <a:gd name="T127" fmla="*/ 11900 h 768"/>
+                                <a:gd name="T128" fmla="+- 0 1416 855"/>
+                                <a:gd name="T129" fmla="*/ T128 w 768"/>
+                                <a:gd name="T130" fmla="+- 0 11850 11807"/>
+                                <a:gd name="T131" fmla="*/ 11850 h 768"/>
+                                <a:gd name="T132" fmla="+- 0 1332 855"/>
+                                <a:gd name="T133" fmla="*/ T132 w 768"/>
+                                <a:gd name="T134" fmla="+- 0 11818 11807"/>
+                                <a:gd name="T135" fmla="*/ 11818 h 768"/>
+                                <a:gd name="T136" fmla="+- 0 1302 855"/>
+                                <a:gd name="T137" fmla="*/ T136 w 768"/>
+                                <a:gd name="T138" fmla="+- 0 11812 11807"/>
+                                <a:gd name="T139" fmla="*/ 11812 h 768"/>
+                              </a:gdLst>
+                              <a:ahLst/>
+                              <a:cxnLst>
+                                <a:cxn ang="0">
+                                  <a:pos x="T1" y="T3"/>
+                                </a:cxn>
+                                <a:cxn ang="0">
+                                  <a:pos x="T5" y="T7"/>
+                                </a:cxn>
+                                <a:cxn ang="0">
+                                  <a:pos x="T9" y="T11"/>
+                                </a:cxn>
+                                <a:cxn ang="0">
+                                  <a:pos x="T13" y="T15"/>
+                                </a:cxn>
+                                <a:cxn ang="0">
+                                  <a:pos x="T17" y="T19"/>
+                                </a:cxn>
+                                <a:cxn ang="0">
+                                  <a:pos x="T21" y="T23"/>
+                                </a:cxn>
+                                <a:cxn ang="0">
+                                  <a:pos x="T25" y="T27"/>
+                                </a:cxn>
+                                <a:cxn ang="0">
+                                  <a:pos x="T29" y="T31"/>
+                                </a:cxn>
+                                <a:cxn ang="0">
+                                  <a:pos x="T33" y="T35"/>
+                                </a:cxn>
+                                <a:cxn ang="0">
+                                  <a:pos x="T37" y="T39"/>
+                                </a:cxn>
+                                <a:cxn ang="0">
+                                  <a:pos x="T41" y="T43"/>
+                                </a:cxn>
+                                <a:cxn ang="0">
+                                  <a:pos x="T45" y="T47"/>
+                                </a:cxn>
+                                <a:cxn ang="0">
+                                  <a:pos x="T49" y="T51"/>
+                                </a:cxn>
+                                <a:cxn ang="0">
+                                  <a:pos x="T53" y="T55"/>
+                                </a:cxn>
+                                <a:cxn ang="0">
+                                  <a:pos x="T57" y="T59"/>
+                                </a:cxn>
+                                <a:cxn ang="0">
+                                  <a:pos x="T61" y="T63"/>
+                                </a:cxn>
+                                <a:cxn ang="0">
+                                  <a:pos x="T65" y="T67"/>
+                                </a:cxn>
+                                <a:cxn ang="0">
+                                  <a:pos x="T69" y="T71"/>
+                                </a:cxn>
+                                <a:cxn ang="0">
+                                  <a:pos x="T73" y="T75"/>
+                                </a:cxn>
+                                <a:cxn ang="0">
+                                  <a:pos x="T77" y="T79"/>
+                                </a:cxn>
+                                <a:cxn ang="0">
+                                  <a:pos x="T81" y="T83"/>
+                                </a:cxn>
+                                <a:cxn ang="0">
+                                  <a:pos x="T85" y="T87"/>
+                                </a:cxn>
+                                <a:cxn ang="0">
+                                  <a:pos x="T89" y="T91"/>
+                                </a:cxn>
+                                <a:cxn ang="0">
+                                  <a:pos x="T93" y="T95"/>
+                                </a:cxn>
+                                <a:cxn ang="0">
+                                  <a:pos x="T97" y="T99"/>
+                                </a:cxn>
+                                <a:cxn ang="0">
+                                  <a:pos x="T101" y="T103"/>
+                                </a:cxn>
+                                <a:cxn ang="0">
+                                  <a:pos x="T105" y="T107"/>
+                                </a:cxn>
+                                <a:cxn ang="0">
+                                  <a:pos x="T109" y="T111"/>
+                                </a:cxn>
+                                <a:cxn ang="0">
+                                  <a:pos x="T113" y="T115"/>
+                                </a:cxn>
+                                <a:cxn ang="0">
+                                  <a:pos x="T117" y="T119"/>
+                                </a:cxn>
+                                <a:cxn ang="0">
+                                  <a:pos x="T121" y="T123"/>
+                                </a:cxn>
+                                <a:cxn ang="0">
+                                  <a:pos x="T125" y="T127"/>
+                                </a:cxn>
+                                <a:cxn ang="0">
+                                  <a:pos x="T129" y="T131"/>
+                                </a:cxn>
+                                <a:cxn ang="0">
+                                  <a:pos x="T133" y="T135"/>
+                                </a:cxn>
+                                <a:cxn ang="0">
+                                  <a:pos x="T137" y="T139"/>
+                                </a:cxn>
+                              </a:cxnLst>
+                              <a:rect l="0" t="0" r="r" b="b"/>
+                              <a:pathLst>
+                                <a:path w="768" h="768">
+                                  <a:moveTo>
+                                    <a:pt x="447" y="5"/>
+                                  </a:moveTo>
+                                  <a:lnTo>
+                                    <a:pt x="384" y="5"/>
+                                  </a:lnTo>
+                                  <a:lnTo>
+                                    <a:pt x="415" y="6"/>
+                                  </a:lnTo>
+                                  <a:lnTo>
+                                    <a:pt x="446" y="10"/>
+                                  </a:lnTo>
+                                  <a:lnTo>
+                                    <a:pt x="532" y="35"/>
+                                  </a:lnTo>
+                                  <a:lnTo>
+                                    <a:pt x="608" y="79"/>
+                                  </a:lnTo>
+                                  <a:lnTo>
+                                    <a:pt x="672" y="138"/>
+                                  </a:lnTo>
+                                  <a:lnTo>
+                                    <a:pt x="721" y="210"/>
+                                  </a:lnTo>
+                                  <a:lnTo>
+                                    <a:pt x="752" y="293"/>
+                                  </a:lnTo>
+                                  <a:lnTo>
+                                    <a:pt x="762" y="353"/>
+                                  </a:lnTo>
+                                  <a:lnTo>
+                                    <a:pt x="763" y="384"/>
+                                  </a:lnTo>
+                                  <a:lnTo>
+                                    <a:pt x="762" y="415"/>
+                                  </a:lnTo>
+                                  <a:lnTo>
+                                    <a:pt x="752" y="475"/>
+                                  </a:lnTo>
+                                  <a:lnTo>
+                                    <a:pt x="721" y="558"/>
+                                  </a:lnTo>
+                                  <a:lnTo>
+                                    <a:pt x="672" y="631"/>
+                                  </a:lnTo>
+                                  <a:lnTo>
+                                    <a:pt x="608" y="690"/>
+                                  </a:lnTo>
+                                  <a:lnTo>
+                                    <a:pt x="532" y="733"/>
+                                  </a:lnTo>
+                                  <a:lnTo>
+                                    <a:pt x="446" y="758"/>
+                                  </a:lnTo>
+                                  <a:lnTo>
+                                    <a:pt x="384" y="763"/>
+                                  </a:lnTo>
+                                  <a:lnTo>
+                                    <a:pt x="447" y="763"/>
+                                  </a:lnTo>
+                                  <a:lnTo>
+                                    <a:pt x="506" y="749"/>
+                                  </a:lnTo>
+                                  <a:lnTo>
+                                    <a:pt x="587" y="711"/>
+                                  </a:lnTo>
+                                  <a:lnTo>
+                                    <a:pt x="656" y="656"/>
+                                  </a:lnTo>
+                                  <a:lnTo>
+                                    <a:pt x="711" y="587"/>
+                                  </a:lnTo>
+                                  <a:lnTo>
+                                    <a:pt x="749" y="506"/>
+                                  </a:lnTo>
+                                  <a:lnTo>
+                                    <a:pt x="764" y="447"/>
+                                  </a:lnTo>
+                                  <a:lnTo>
+                                    <a:pt x="769" y="384"/>
+                                  </a:lnTo>
+                                  <a:lnTo>
+                                    <a:pt x="767" y="353"/>
+                                  </a:lnTo>
+                                  <a:lnTo>
+                                    <a:pt x="757" y="292"/>
+                                  </a:lnTo>
+                                  <a:lnTo>
+                                    <a:pt x="738" y="235"/>
+                                  </a:lnTo>
+                                  <a:lnTo>
+                                    <a:pt x="694" y="158"/>
+                                  </a:lnTo>
+                                  <a:lnTo>
+                                    <a:pt x="634" y="93"/>
+                                  </a:lnTo>
+                                  <a:lnTo>
+                                    <a:pt x="561" y="43"/>
+                                  </a:lnTo>
+                                  <a:lnTo>
+                                    <a:pt x="477" y="11"/>
+                                  </a:lnTo>
+                                  <a:lnTo>
+                                    <a:pt x="447" y="5"/>
+                                  </a:lnTo>
+                                </a:path>
+                              </a:pathLst>
+                            </a:custGeom>
+                            <a:solidFill>
+                              <a:srgbClr val="FFFFFF"/>
+                            </a:solidFill>
+                            <a:ln>
+                              <a:noFill/>
+                            </a:ln>
+                            <a:extLst>
+                              <a:ext uri="{91240B29-F687-4F45-9708-019B960494DF}">
+                                <a14:hiddenLine xmlns:a14="http://schemas.microsoft.com/office/drawing/2010/main" w="9525">
+                                  <a:solidFill>
+                                    <a:srgbClr val="000000"/>
+                                  </a:solidFill>
+                                  <a:round/>
+                                  <a:headEnd/>
+                                  <a:tailEnd/>
+                                </a14:hiddenLine>
+                              </a:ext>
+                            </a:extLst>
+                          </wps:spPr>
+                          <wps:bodyPr rot="0" vert="horz" wrap="square" lIns="91440" tIns="45720" rIns="91440" bIns="45720" anchor="t" anchorCtr="0" upright="1">
+                            <a:noAutofit/>
+                          </wps:bodyPr>
+                        </wps:wsp>
+                        <pic:pic xmlns:pic="http://schemas.openxmlformats.org/drawingml/2006/picture">
+                          <pic:nvPicPr>
+                            <pic:cNvPr id="1043" name="Picture 19"/>
+                            <pic:cNvPicPr>
+                              <a:picLocks noChangeAspect="1" noChangeArrowheads="1"/>
+                            </pic:cNvPicPr>
+                          </pic:nvPicPr>
+                          <pic:blipFill>
+                            <a:blip r:embed="rIdPortada2">
+                              <a:extLst>
+                                <a:ext uri="{28A0092B-C50C-407E-A947-70E740481C1C}">
+                                  <a14:useLocalDpi xmlns:a14="http://schemas.microsoft.com/office/drawing/2010/main" val="0"/>
+                                </a:ext>
+                              </a:extLst>
+                            </a:blip>
+                            <a:srcRect/>
+                            <a:stretch>
+                              <a:fillRect/>
+                            </a:stretch>
+                          </pic:blipFill>
+                          <pic:spPr bwMode="auto">
+                            <a:xfrm>
+                              <a:off x="950" y="11821"/>
+                              <a:ext cx="669" cy="704"/>
+                            </a:xfrm>
+                            <a:prstGeom prst="rect">
+                              <a:avLst/>
+                            </a:prstGeom>
+                            <a:noFill/>
+                            <a:extLst>
+                              <a:ext uri="{909E8E84-426E-40DD-AFC4-6F175D3DCCD1}">
+                                <a14:hiddenFill xmlns:a14="http://schemas.microsoft.com/office/drawing/2010/main">
+                                  <a:solidFill>
+                                    <a:srgbClr val="FFFFFF"/>
+                                  </a:solidFill>
+                                </a14:hiddenFill>
+                              </a:ext>
+                            </a:extLst>
+                          </pic:spPr>
+                        </pic:pic>
+                        <pic:pic xmlns:pic="http://schemas.openxmlformats.org/drawingml/2006/picture">
+                          <pic:nvPicPr>
+                            <pic:cNvPr id="1044" name="Picture 20"/>
+                            <pic:cNvPicPr>
+                              <a:picLocks noChangeAspect="1" noChangeArrowheads="1"/>
+                            </pic:cNvPicPr>
+                          </pic:nvPicPr>
+                          <pic:blipFill>
+                            <a:blip r:embed="rIdPortada3">
+                              <a:extLst>
+                                <a:ext uri="{28A0092B-C50C-407E-A947-70E740481C1C}">
+                                  <a14:useLocalDpi xmlns:a14="http://schemas.microsoft.com/office/drawing/2010/main" val="0"/>
+                                </a:ext>
+                              </a:extLst>
+                            </a:blip>
+                            <a:srcRect/>
+                            <a:stretch>
+                              <a:fillRect/>
+                            </a:stretch>
+                          </pic:blipFill>
+                          <pic:spPr bwMode="auto">
+                            <a:xfrm>
+                              <a:off x="749" y="11630"/>
+                              <a:ext cx="986" cy="1120"/>
+                            </a:xfrm>
+                            <a:prstGeom prst="rect">
+                              <a:avLst/>
+                            </a:prstGeom>
+                            <a:noFill/>
+                            <a:extLst>
+                              <a:ext uri="{909E8E84-426E-40DD-AFC4-6F175D3DCCD1}">
+                                <a14:hiddenFill xmlns:a14="http://schemas.microsoft.com/office/drawing/2010/main">
+                                  <a:solidFill>
+                                    <a:srgbClr val="FFFFFF"/>
+                                  </a:solidFill>
+                                </a14:hiddenFill>
+                              </a:ext>
+                            </a:extLst>
+                          </pic:spPr>
+                        </pic:pic>
+                      </wpg:grpSp>
+                    </wpg:wgp>
+                  </a:graphicData>
+                </a:graphic>
+                <wp14:sizeRelH relativeFrom="page">
+                  <wp14:pctWidth>0</wp14:pctWidth>
+                </wp14:sizeRelH>
+                <wp14:sizeRelV relativeFrom="page">
+                  <wp14:pctHeight>0</wp14:pctHeight>
+                </wp14:sizeRelV>
+              </wp:anchor>
+            </w:drawing>
+          </mc:Choice>
+          <mc:Fallback>
+            <w:pict>
+              <v:group w14:anchorId="500D44B5" id="Group 4" o:spid="_x0000_s1026" style="position:absolute;margin-left:8.45pt;margin-top:54.85pt;width:595.3pt;height:669.65pt;z-index:-251652096;mso-position-horizontal-relative:page;mso-position-vertical-relative:page" coordsize="11906,13006" o:gfxdata="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">
+                <v:group id="Group 5" o:spid="_x0000_s1027" style="position:absolute;left:567;width:2835;height:3685" coordorigin="567" coordsize="2835,3685" o:gfxdata="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">
+                  <v:shape id="Freeform 6" o:spid="_x0000_s1028" style="position:absolute;left:567;width:2835;height:3685;visibility:visible;mso-wrap-style:square;v-text-anchor:top" coordsize="2835,3685" o:gfxdata="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" path="m,3685r2835,l2835,,,,,3685xe" fillcolor="#dcddde" stroked="f">
+                    <v:path arrowok="t" o:connecttype="custom" o:connectlocs="0,3685;2835,3685;2835,0;0,0;0,3685" o:connectangles="0,0,0,0,0"/>
+                  </v:shape>
+                </v:group>
+                <v:group id="Group 7" o:spid="_x0000_s1029" style="position:absolute;width:567;height:3685" coordsize="567,3685" o:gfxdata="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">
+                  <v:shape id="Freeform 8" o:spid="_x0000_s1030" style="position:absolute;width:567;height:3685;visibility:visible;mso-wrap-style:square;v-text-anchor:top" coordsize="567,3685" o:gfxdata="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" path="m,3685r567,l567,,,,,3685e" fillcolor="#bcbec0" stroked="f">
+                    <v:path arrowok="t" o:connecttype="custom" o:connectlocs="0,3685;567,3685;567,0;0,0;0,3685" o:connectangles="0,0,0,0,0"/>
+                  </v:shape>
+                  <v:shapetype id="_x0000_t75" coordsize="21600,21600" o:spt="75" o:preferrelative="t" path="m@4@5l@4@11@9@11@9@5xe" filled="f" stroked="f">
+                    <v:stroke joinstyle="miter"/>
+                    <v:formulas>
+                      <v:f eqn="if lineDrawn pixelLineWidth 0"/>
+                      <v:f eqn="sum @0 1 0"/>
+                      <v:f eqn="sum 0 0 @1"/>
+                      <v:f eqn="prod @2 1 2"/>
+                      <v:f eqn="prod @3 21600 pixelWidth"/>
+                      <v:f eqn="prod @3 21600 pixelHeight"/>
+                      <v:f eqn="sum @0 0 1"/>
+                      <v:f eqn="prod @6 1 2"/>
+                      <v:f eqn="prod @7 21600 pixelWidth"/>
+                      <v:f eqn="sum @8 21600 0"/>
+                      <v:f eqn="prod @7 21600 pixelHeight"/>
+                      <v:f eqn="sum @10 21600 0"/>
+                    </v:formulas>
+                    <v:path o:extrusionok="f" gradientshapeok="t" o:connecttype="rect"/>
+                    <o:lock v:ext="edit" aspectratio="t"/>
+                  </v:shapetype>
+                  <v:shape id="Picture 9" o:spid="_x0000_s1031" type="#_x0000_t75" style="position:absolute;top:3685;width:11906;height:8504;visibility:visible;mso-wrap-style:square" o:gfxdata="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">
+                    <v:imagedata r:id="rIdPortada4" o:title=""/>
+                  </v:shape>
+                </v:group>
+                <v:group id="Group 10" o:spid="_x0000_s1032" style="position:absolute;left:426;top:11375;width:1642;height:1627" coordorigin="426,11375" coordsize="1642,1627" o:gfxdata="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">
+                  <v:shape id="Freeform 11" o:spid="_x0000_s1033" style="position:absolute;left:426;top:11375;width:1642;height:1627;visibility:visible;mso-wrap-style:square;v-text-anchor:top" coordsize="1642,1627" o:gfxdata="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" path="m,l1642,r,1627l,1627,,e" fillcolor="black" stroked="f">
+                    <v:path arrowok="t" o:connecttype="custom" o:connectlocs="0,11375;1642,11375;1642,13002;0,13002;0,11375" o:connectangles="0,0,0,0,0"/>
+                  </v:shape>
+                </v:group>
+                <v:group id="Group 12" o:spid="_x0000_s1034" style="position:absolute;left:634;top:11572;width:1246;height:1246" coordorigin="634,11572" coordsize="1246,1246" o:gfxdata="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">
+                  <v:shape id="Freeform 13" o:spid="_x0000_s1035" style="position:absolute;left:634;top:11572;width:1246;height:1246;visibility:visible;mso-wrap-style:square;v-text-anchor:top" coordsize="1246,1246" o:gfxdata="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" path="m623,l522,9,426,32,336,70r-81,51l182,183r-62,72l69,337,31,426,8,522,,623r2,51l18,773r31,93l93,951r57,78l217,1096r78,57l380,1197r93,31l572,1244r51,2l674,1244r98,-16l865,1197r86,-44l1028,1096r68,-67l1152,951r45,-85l1227,773r17,-99l1246,623r-2,-51l1227,474r-30,-93l1152,295r-56,-77l1028,150,951,94,865,49,772,18,674,2,623,e" fillcolor="#6d6e71" stroked="f">
+                    <v:path arrowok="t" o:connecttype="custom" o:connectlocs="623,11572;522,11581;426,11604;336,11642;255,11693;182,11755;120,11827;69,11909;31,11998;8,12094;0,12195;2,12246;18,12345;49,12438;93,12523;150,12601;217,12668;295,12725;380,12769;473,12800;572,12816;623,12818;674,12816;772,12800;865,12769;951,12725;1028,12668;1096,12601;1152,12523;1197,12438;1227,12345;1244,12246;1246,12195;1244,12144;1227,12046;1197,11953;1152,11867;1096,11790;1028,11722;951,11666;865,11621;772,11590;674,11574;623,11572" o:connectangles="0,0,0,0,0,0,0,0,0,0,0,0,0,0,0,0,0,0,0,0,0,0,0,0,0,0,0,0,0,0,0,0,0,0,0,0,0,0,0,0,0,0,0,0"/>
+                  </v:shape>
+                </v:group>
+                <v:group id="Group 14" o:spid="_x0000_s1036" style="position:absolute;left:626;top:11571;width:1230;height:1230" coordorigin="626,11571" coordsize="1230,1230" o:gfxdata="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">
+                  <v:shape id="Freeform 15" o:spid="_x0000_s1037" style="position:absolute;left:626;top:11571;width:1230;height:1230;visibility:visible;mso-wrap-style:square;v-text-anchor:top" coordsize="1230,1230" o:gfxdata="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" path="m616,1231r99,-8l810,1199r88,-37l979,1112r72,-61l1112,979r50,-81l1200,810r23,-95l1231,615r-2,-50l1213,468r-30,-92l1139,291r-56,-76l1016,148,940,92,855,49,764,18,666,2,616,,565,2,468,18,376,49,292,92r-77,56l149,215,93,291,49,376,18,468,2,565,,615r2,51l18,763r31,92l93,940r56,76l215,1083r77,56l376,1182r92,31l565,1229r51,2xe" filled="f" strokecolor="#a7a9ac" strokeweight=".40711mm">
+                    <v:path arrowok="t" o:connecttype="custom" o:connectlocs="616,12802;715,12794;810,12770;898,12733;979,12683;1051,12622;1112,12550;1162,12469;1200,12381;1223,12286;1231,12186;1229,12136;1213,12039;1183,11947;1139,11862;1083,11786;1016,11719;940,11663;855,11620;764,11589;666,11573;616,11571;565,11573;468,11589;376,11620;292,11663;215,11719;149,11786;93,11862;49,11947;18,12039;2,12136;0,12186;2,12237;18,12334;49,12426;93,12511;149,12587;215,12654;292,12710;376,12753;468,12784;565,12800;616,12802" o:connectangles="0,0,0,0,0,0,0,0,0,0,0,0,0,0,0,0,0,0,0,0,0,0,0,0,0,0,0,0,0,0,0,0,0,0,0,0,0,0,0,0,0,0,0,0"/>
+                  </v:shape>
+                </v:group>
+                <v:group id="Group 16" o:spid="_x0000_s1038" style="position:absolute;left:855;top:11807;width:768;height:768" coordorigin="855,11807" coordsize="768,768" o:gfxdata="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">
+                  <v:shape id="Freeform 17" o:spid="_x0000_s1039" style="position:absolute;left:855;top:11807;width:768;height:768;visibility:visible;mso-wrap-style:square;v-text-anchor:top" coordsize="768,768" o:gfxdata="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" path="m384,l322,5,263,20,182,58r-69,55l58,182,20,263,5,322,,384r1,32l11,477r19,57l74,611r60,65l208,726r84,31l353,767r31,1l416,767r31,-4l384,763r-31,-1l293,752,210,721,138,672,79,608,35,532,10,446,5,384,6,353,16,293,48,210,97,138,161,79,237,35,323,10,384,5r63,l416,1,384,e" stroked="f">
+                    <v:path arrowok="t" o:connecttype="custom" o:connectlocs="384,11807;322,11812;263,11827;182,11865;113,11920;58,11989;20,12070;5,12129;0,12191;1,12223;11,12284;30,12341;74,12418;134,12483;208,12533;292,12564;353,12574;384,12575;416,12574;447,12570;447,12570;384,12570;353,12569;293,12559;210,12528;138,12479;79,12415;35,12339;10,12253;5,12191;6,12160;16,12100;48,12017;97,11945;161,11886;237,11842;323,11817;384,11812;447,11812;447,11812;416,11808;384,11807" o:connectangles="0,0,0,0,0,0,0,0,0,0,0,0,0,0,0,0,0,0,0,0,0,0,0,0,0,0,0,0,0,0,0,0,0,0,0,0,0,0,0,0,0,0"/>
+                  </v:shape>
+                  <v:shape id="Freeform 18" o:spid="_x0000_s1040" style="position:absolute;left:855;top:11807;width:768;height:768;visibility:visible;mso-wrap-style:square;v-text-anchor:top" coordsize="768,768" o:gfxdata="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" path="m447,5r-63,l415,6r31,4l532,35r76,44l672,138r49,72l752,293r10,60l763,384r-1,31l752,475r-31,83l672,631r-64,59l532,733r-86,25l384,763r63,l506,749r81,-38l656,656r55,-69l749,506r15,-59l769,384r-2,-31l757,292,738,235,694,158,634,93,561,43,477,11,447,5e" stroked="f">
+                    <v:path arrowok="t" o:connecttype="custom" o:connectlocs="447,11812;384,11812;415,11813;446,11817;532,11842;608,11886;672,11945;721,12017;752,12100;762,12160;763,12191;762,12222;752,12282;721,12365;672,12438;608,12497;532,12540;446,12565;384,12570;447,12570;506,12556;587,12518;656,12463;711,12394;749,12313;764,12254;769,12191;767,12160;757,12099;738,12042;694,11965;634,11900;561,11850;477,11818;447,11812" o:connectangles="0,0,0,0,0,0,0,0,0,0,0,0,0,0,0,0,0,0,0,0,0,0,0,0,0,0,0,0,0,0,0,0,0,0,0"/>
+                  </v:shape>
+                  <v:shape id="Picture 19" o:spid="_x0000_s1041" type="#_x0000_t75" style="position:absolute;left:950;top:11821;width:669;height:704;visibility:visible;mso-wrap-style:square" o:gfxdata="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">
+                    <v:imagedata r:id="rIdPortada5" o:title=""/>
+                  </v:shape>
+                  <v:shape id="Picture 20" o:spid="_x0000_s1042" type="#_x0000_t75" style="position:absolute;left:749;top:11630;width:986;height:1120;visibility:visible;mso-wrap-style:square" o:gfxdata="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">
+                    <v:imagedata r:id="rIdPortada6" o:title=""/>
+                  </v:shape>
+                </v:group>
+                <w10:wrap anchorx="page" anchory="page"/>
+              </v:group>
+            </w:pict>
+          </mc:Fallback>
+        </mc:AlternateContent>
+      </w:r>
     </w:p>
     <w:p>
       <w:pPr>
@@ -253,8 +2444,677 @@
           <w:b/>
           <w:sz w:val="32"/>
           <w:szCs w:val="32"/>
+          <w:lang w:val="es-CL"/>
         </w:rPr>
       </w:pPr>
+    </w:p>
+    <w:tbl>
+      <w:tblPr>
+        <w:tblStyle w:val="Tablaconcuadrcula"/>
+        <w:tblpPr w:leftFromText="141" w:rightFromText="141" w:vertAnchor="page" w:horzAnchor="page" w:tblpX="2218" w:tblpY="2180"/>
+        <w:tblW w:w="5000" w:type="pct"/>
+        <w:tblBorders>
+          <w:top w:val="none" w:sz="0" w:space="0" w:color="auto"/>
+          <w:left w:val="none" w:sz="0" w:space="0" w:color="auto"/>
+          <w:bottom w:val="none" w:sz="0" w:space="0" w:color="auto"/>
+          <w:right w:val="none" w:sz="0" w:space="0" w:color="auto"/>
+          <w:insideH w:val="none" w:sz="0" w:space="0" w:color="auto"/>
+          <w:insideV w:val="none" w:sz="0" w:space="0" w:color="auto"/>
+        </w:tblBorders>
+        <w:tblLook w:val="04A0" w:firstRow="1" w:lastRow="0" w:firstColumn="1" w:lastColumn="0" w:noHBand="0" w:noVBand="1"/>
+      </w:tblPr>
+      <w:tblGrid>
+        <w:gridCol w:w="1495"/>
+        <w:gridCol w:w="7577"/>
+      </w:tblGrid>
+      <w:tr>
+        <w:trPr>
+          <w:trHeight w:val="290"/>
+        </w:trPr>
+        <w:tc>
+          <w:tcPr>
+            <w:tcW w:w="824" w:type="pct"/>
+            <w:vAlign w:val="center"/>
+          </w:tcPr>
+          <w:p>
+            <w:pPr>
+              <w:pStyle w:val="Sinespaciado"/>
+              <w:rPr>
+                <w:b/>
+                <w:lang w:val="es-CL"/>
+              </w:rPr>
+            </w:pPr>
+            <w:r>
+              <w:rPr>
+                <w:b/>
+                <w:lang w:val="es-CL"/>
+              </w:rPr>
+              <w:t>EMPRESA</w:t>
+            </w:r>
+            <w:r>
+              <w:rPr>
+                <w:rStyle w:val="Textoennegrita"/>
+                <w:b w:val="0"/>
+                <w:bCs w:val="0"/>
+                <w:sz w:val="22"/>
+                <w:szCs w:val="24"/>
+                <w:lang w:val="es-CL"/>
+              </w:rPr>
+              <w:t>:</w:t>
+            </w:r>
+          </w:p>
+        </w:tc>
+        <w:tc>
+          <w:tcPr>
+            <w:tcW w:w="4176" w:type="pct"/>
+            <w:vAlign w:val="center"/>
+          </w:tcPr>
+          <w:p>
+            <w:pPr>
+              <w:pStyle w:val="Sinespaciado"/>
+              <w:rPr>
+                <w:bCs/>
+                <w:lang w:val="es-CL"/>
+              </w:rPr>
+            </w:pPr>
+            <w:r>
+              <w:rPr>
+                <w:bCs/>
+                <w:lang w:val="es-CL"/>
+              </w:rPr>
+              <w:t xml:space="preserve">{{EMPRESA}}</w:t>
+            </w:r>
+          </w:p>
+        </w:tc>
+      </w:tr>
+      <w:tr>
+        <w:trPr>
+          <w:trHeight w:val="340"/>
+        </w:trPr>
+        <w:tc>
+          <w:tcPr>
+            <w:tcW w:w="824" w:type="pct"/>
+            <w:vAlign w:val="center"/>
+          </w:tcPr>
+          <w:p>
+            <w:pPr>
+              <w:pStyle w:val="Sinespaciado"/>
+              <w:jc w:val="left"/>
+              <w:rPr>
+                <w:b/>
+                <w:lang w:val="es-CL"/>
+              </w:rPr>
+            </w:pPr>
+            <w:r>
+              <w:rPr>
+                <w:b/>
+                <w:lang w:val="es-CL"/>
+              </w:rPr>
+              <w:t>ATENCIÓN</w:t>
+            </w:r>
+            <w:r>
+              <w:rPr>
+                <w:rStyle w:val="Textoennegrita"/>
+                <w:b w:val="0"/>
+                <w:bCs w:val="0"/>
+                <w:sz w:val="22"/>
+                <w:szCs w:val="24"/>
+                <w:lang w:val="es-CL"/>
+              </w:rPr>
+              <w:t>:</w:t>
+            </w:r>
+          </w:p>
+        </w:tc>
+        <w:tc>
+          <w:tcPr>
+            <w:tcW w:w="4176" w:type="pct"/>
+            <w:vAlign w:val="center"/>
+          </w:tcPr>
+          <w:p>
+            <w:pPr>
+              <w:pStyle w:val="Sinespaciado"/>
+              <w:rPr>
+                <w:lang w:val="es-CL"/>
+              </w:rPr>
+            </w:pPr>
+            <w:proofErr w:type="spellStart"/>
+            <w:r>
+              <w:rPr>
+                <w:lang w:val="es-CL"/>
+              </w:rPr>
+              <w:t xml:space="preserve">{{ATENCION}}</w:t>
+            </w:r>
+            <w:proofErr w:type="spellEnd"/>
+            <w:r>
+              <w:rPr>
+                <w:lang w:val="es-CL"/>
+              </w:rPr>
+              <w:t xml:space="preserve"/>
+            </w:r>
+          </w:p>
+        </w:tc>
+      </w:tr>
+      <w:tr>
+        <w:trPr>
+          <w:trHeight w:val="347"/>
+        </w:trPr>
+        <w:tc>
+          <w:tcPr>
+            <w:tcW w:w="824" w:type="pct"/>
+            <w:vAlign w:val="center"/>
+          </w:tcPr>
+          <w:p>
+            <w:pPr>
+              <w:pStyle w:val="Sinespaciado"/>
+              <w:rPr>
+                <w:b/>
+                <w:lang w:val="es-CL"/>
+              </w:rPr>
+            </w:pPr>
+            <w:r>
+              <w:rPr>
+                <w:b/>
+                <w:lang w:val="es-CL"/>
+              </w:rPr>
+              <w:t>ASUNTO</w:t>
+            </w:r>
+            <w:r>
+              <w:rPr>
+                <w:rStyle w:val="Textoennegrita"/>
+                <w:b w:val="0"/>
+                <w:bCs w:val="0"/>
+                <w:sz w:val="22"/>
+                <w:szCs w:val="24"/>
+                <w:lang w:val="es-CL"/>
+              </w:rPr>
+              <w:t>:</w:t>
+            </w:r>
+          </w:p>
+        </w:tc>
+        <w:tc>
+          <w:tcPr>
+            <w:tcW w:w="4176" w:type="pct"/>
+            <w:vAlign w:val="center"/>
+          </w:tcPr>
+          <w:p>
+            <w:pPr>
+              <w:pStyle w:val="Sinespaciado"/>
+              <w:rPr>
+                <w:lang w:val="es-CL"/>
+              </w:rPr>
+            </w:pPr>
+            <w:r>
+              <w:rPr>
+                <w:lang w:val="es-CL"/>
+              </w:rPr>
+              <w:t xml:space="preserve">{{ASUNTO}}</w:t>
+            </w:r>
+            <w:r>
+              <w:rPr>
+                <w:rFonts w:eastAsia="Calibri" w:cs="Calibri"/>
+                <w:szCs w:val="22"/>
+                <w:lang w:val="es-CL"/>
+              </w:rPr>
+              <w:t xml:space="preserve"/>
+            </w:r>
+            <w:r>
+              <w:rPr>
+                <w:rFonts w:eastAsia="Calibri" w:cs="Calibri"/>
+                <w:spacing w:val="1"/>
+                <w:szCs w:val="22"/>
+                <w:lang w:val="es-CL"/>
+              </w:rPr>
+              <w:t xml:space="preserve"/>
+            </w:r>
+            <w:r>
+              <w:rPr>
+                <w:rFonts w:eastAsia="Calibri" w:cs="Calibri"/>
+                <w:spacing w:val="2"/>
+                <w:szCs w:val="22"/>
+                <w:lang w:val="es-CL"/>
+              </w:rPr>
+              <w:t xml:space="preserve"/>
+            </w:r>
+            <w:r>
+              <w:rPr>
+                <w:rFonts w:eastAsia="Calibri" w:cs="Calibri"/>
+                <w:spacing w:val="-2"/>
+                <w:szCs w:val="22"/>
+                <w:lang w:val="es-CL"/>
+              </w:rPr>
+              <w:t xml:space="preserve"/>
+            </w:r>
+            <w:r>
+              <w:rPr>
+                <w:rFonts w:eastAsia="Calibri" w:cs="Calibri"/>
+                <w:spacing w:val="2"/>
+                <w:szCs w:val="22"/>
+                <w:lang w:val="es-CL"/>
+              </w:rPr>
+              <w:t xml:space="preserve"/>
+            </w:r>
+            <w:r>
+              <w:rPr>
+                <w:rFonts w:eastAsia="Calibri" w:cs="Calibri"/>
+                <w:szCs w:val="22"/>
+                <w:lang w:val="es-CL"/>
+              </w:rPr>
+              <w:t xml:space="preserve"/>
+            </w:r>
+            <w:r>
+              <w:rPr>
+                <w:rFonts w:eastAsia="Calibri" w:cs="Calibri"/>
+                <w:szCs w:val="22"/>
+                <w:lang w:val="es-CL"/>
+              </w:rPr>
+              <w:t xml:space="preserve"/>
+            </w:r>
+            <w:r>
+              <w:rPr>
+                <w:rFonts w:eastAsia="Calibri" w:cs="Calibri"/>
+                <w:spacing w:val="-1"/>
+                <w:szCs w:val="22"/>
+                <w:lang w:val="es-CL"/>
+              </w:rPr>
+              <w:t xml:space="preserve"/>
+            </w:r>
+            <w:r>
+              <w:rPr>
+                <w:rFonts w:eastAsia="Calibri" w:cs="Calibri"/>
+                <w:szCs w:val="22"/>
+                <w:lang w:val="es-CL"/>
+              </w:rPr>
+              <w:t xml:space="preserve"/>
+            </w:r>
+            <w:r>
+              <w:rPr>
+                <w:rFonts w:eastAsia="Calibri" w:cs="Calibri"/>
+                <w:szCs w:val="22"/>
+                <w:lang w:val="es-CL"/>
+              </w:rPr>
+              <w:t xml:space="preserve"/>
+            </w:r>
+            <w:r>
+              <w:rPr>
+                <w:rFonts w:eastAsia="Calibri" w:cs="Calibri"/>
+                <w:spacing w:val="1"/>
+                <w:szCs w:val="22"/>
+                <w:lang w:val="es-CL"/>
+              </w:rPr>
+              <w:t xml:space="preserve"/>
+            </w:r>
+            <w:r>
+              <w:rPr>
+                <w:rFonts w:eastAsia="Calibri" w:cs="Calibri"/>
+                <w:szCs w:val="22"/>
+                <w:lang w:val="es-CL"/>
+              </w:rPr>
+              <w:t xml:space="preserve"/>
+            </w:r>
+            <w:r>
+              <w:rPr>
+                <w:rFonts w:eastAsia="Calibri" w:cs="Calibri"/>
+                <w:spacing w:val="-1"/>
+                <w:szCs w:val="22"/>
+                <w:lang w:val="es-CL"/>
+              </w:rPr>
+              <w:t xml:space="preserve"/>
+            </w:r>
+            <w:r>
+              <w:rPr>
+                <w:rFonts w:eastAsia="Calibri" w:cs="Calibri"/>
+                <w:spacing w:val="-2"/>
+                <w:szCs w:val="22"/>
+                <w:lang w:val="es-CL"/>
+              </w:rPr>
+              <w:t xml:space="preserve"/>
+            </w:r>
+            <w:r>
+              <w:rPr>
+                <w:rFonts w:eastAsia="Calibri" w:cs="Calibri"/>
+                <w:spacing w:val="1"/>
+                <w:szCs w:val="22"/>
+                <w:lang w:val="es-CL"/>
+              </w:rPr>
+              <w:t xml:space="preserve"/>
+            </w:r>
+            <w:r>
+              <w:rPr>
+                <w:rFonts w:eastAsia="Calibri" w:cs="Calibri"/>
+                <w:spacing w:val="-1"/>
+                <w:szCs w:val="22"/>
+                <w:lang w:val="es-CL"/>
+              </w:rPr>
+              <w:t xml:space="preserve"/>
+            </w:r>
+            <w:r>
+              <w:rPr>
+                <w:rFonts w:eastAsia="Calibri" w:cs="Calibri"/>
+                <w:spacing w:val="2"/>
+                <w:szCs w:val="22"/>
+                <w:lang w:val="es-CL"/>
+              </w:rPr>
+              <w:t xml:space="preserve"/>
+            </w:r>
+            <w:r>
+              <w:rPr>
+                <w:rFonts w:eastAsia="Calibri" w:cs="Calibri"/>
+                <w:spacing w:val="1"/>
+                <w:szCs w:val="22"/>
+                <w:lang w:val="es-CL"/>
+              </w:rPr>
+              <w:t xml:space="preserve"/>
+            </w:r>
+            <w:r>
+              <w:rPr>
+                <w:rFonts w:eastAsia="Calibri" w:cs="Calibri"/>
+                <w:spacing w:val="2"/>
+                <w:szCs w:val="22"/>
+                <w:lang w:val="es-CL"/>
+              </w:rPr>
+              <w:t xml:space="preserve"/>
+            </w:r>
+            <w:r>
+              <w:rPr>
+                <w:rFonts w:eastAsia="Calibri" w:cs="Calibri"/>
+                <w:spacing w:val="1"/>
+                <w:szCs w:val="22"/>
+                <w:lang w:val="es-CL"/>
+              </w:rPr>
+              <w:t xml:space="preserve"/>
+            </w:r>
+            <w:r>
+              <w:rPr>
+                <w:rFonts w:eastAsia="Calibri" w:cs="Calibri"/>
+                <w:spacing w:val="-1"/>
+                <w:szCs w:val="22"/>
+                <w:lang w:val="es-CL"/>
+              </w:rPr>
+              <w:t xml:space="preserve"/>
+            </w:r>
+            <w:r>
+              <w:rPr>
+                <w:rFonts w:eastAsia="Calibri" w:cs="Calibri"/>
+                <w:spacing w:val="-2"/>
+                <w:szCs w:val="22"/>
+                <w:lang w:val="es-CL"/>
+              </w:rPr>
+              <w:t xml:space="preserve"/>
+            </w:r>
+            <w:r>
+              <w:rPr>
+                <w:rFonts w:eastAsia="Calibri" w:cs="Calibri"/>
+                <w:szCs w:val="22"/>
+                <w:lang w:val="es-CL"/>
+              </w:rPr>
+              <w:t xml:space="preserve"/>
+            </w:r>
+            <w:r>
+              <w:rPr>
+                <w:rFonts w:eastAsia="Calibri" w:cs="Calibri"/>
+                <w:szCs w:val="22"/>
+                <w:lang w:val="es-CL"/>
+              </w:rPr>
+              <w:t xml:space="preserve"/>
+            </w:r>
+            <w:r>
+              <w:rPr>
+                <w:rFonts w:eastAsia="Calibri" w:cs="Calibri"/>
+                <w:spacing w:val="-1"/>
+                <w:szCs w:val="22"/>
+                <w:lang w:val="es-CL"/>
+              </w:rPr>
+              <w:t xml:space="preserve"/>
+            </w:r>
+            <w:r>
+              <w:rPr>
+                <w:rFonts w:eastAsia="Calibri" w:cs="Calibri"/>
+                <w:szCs w:val="22"/>
+                <w:lang w:val="es-CL"/>
+              </w:rPr>
+              <w:t xml:space="preserve"/>
+            </w:r>
+            <w:r>
+              <w:rPr>
+                <w:rFonts w:eastAsia="Calibri" w:cs="Calibri"/>
+                <w:spacing w:val="1"/>
+                <w:szCs w:val="22"/>
+                <w:lang w:val="es-CL"/>
+              </w:rPr>
+              <w:t xml:space="preserve"/>
+            </w:r>
+            <w:r>
+              <w:rPr>
+                <w:rFonts w:eastAsia="Calibri" w:cs="Calibri"/>
+                <w:spacing w:val="-1"/>
+                <w:szCs w:val="22"/>
+                <w:lang w:val="es-CL"/>
+              </w:rPr>
+              <w:t xml:space="preserve"/>
+            </w:r>
+            <w:r>
+              <w:rPr>
+                <w:rFonts w:eastAsia="Calibri" w:cs="Calibri"/>
+                <w:spacing w:val="-2"/>
+                <w:szCs w:val="22"/>
+                <w:lang w:val="es-CL"/>
+              </w:rPr>
+              <w:t xml:space="preserve"/>
+            </w:r>
+            <w:r>
+              <w:rPr>
+                <w:rFonts w:eastAsia="Calibri" w:cs="Calibri"/>
+                <w:spacing w:val="2"/>
+                <w:szCs w:val="22"/>
+                <w:lang w:val="es-CL"/>
+              </w:rPr>
+              <w:t xml:space="preserve"/>
+            </w:r>
+            <w:r>
+              <w:rPr>
+                <w:rFonts w:eastAsia="Calibri" w:cs="Calibri"/>
+                <w:spacing w:val="1"/>
+                <w:szCs w:val="22"/>
+                <w:lang w:val="es-CL"/>
+              </w:rPr>
+              <w:t xml:space="preserve"/>
+            </w:r>
+            <w:r>
+              <w:rPr>
+                <w:rFonts w:eastAsia="Calibri" w:cs="Calibri"/>
+                <w:spacing w:val="-1"/>
+                <w:szCs w:val="22"/>
+                <w:lang w:val="es-CL"/>
+              </w:rPr>
+              <w:t xml:space="preserve"/>
+            </w:r>
+            <w:r>
+              <w:rPr>
+                <w:rFonts w:eastAsia="Calibri" w:cs="Calibri"/>
+                <w:spacing w:val="-1"/>
+                <w:szCs w:val="22"/>
+                <w:lang w:val="es-CL"/>
+              </w:rPr>
+              <w:t xml:space="preserve"/>
+            </w:r>
+          </w:p>
+        </w:tc>
+      </w:tr>
+      <w:tr>
+        <w:trPr>
+          <w:trHeight w:val="540"/>
+        </w:trPr>
+        <w:tc>
+          <w:tcPr>
+            <w:tcW w:w="824" w:type="pct"/>
+            <w:vAlign w:val="center"/>
+          </w:tcPr>
+          <w:p>
+            <w:pPr>
+              <w:pStyle w:val="Sinespaciado"/>
+              <w:rPr>
+                <w:b/>
+                <w:lang w:val="es-CL"/>
+              </w:rPr>
+            </w:pPr>
+            <w:r>
+              <w:rPr>
+                <w:b/>
+                <w:lang w:val="es-CL"/>
+              </w:rPr>
+              <w:t>FECHA</w:t>
+            </w:r>
+            <w:r>
+              <w:rPr>
+                <w:rStyle w:val="Textoennegrita"/>
+                <w:b w:val="0"/>
+                <w:bCs w:val="0"/>
+                <w:sz w:val="22"/>
+                <w:szCs w:val="24"/>
+                <w:lang w:val="es-CL"/>
+              </w:rPr>
+              <w:t>:</w:t>
+            </w:r>
+          </w:p>
+        </w:tc>
+        <w:tc>
+          <w:tcPr>
+            <w:tcW w:w="4176" w:type="pct"/>
+            <w:vAlign w:val="center"/>
+          </w:tcPr>
+          <w:p>
+            <w:pPr>
+              <w:pStyle w:val="Sinespaciado"/>
+              <w:rPr>
+                <w:lang w:val="es-CL"/>
+              </w:rPr>
+            </w:pPr>
+            <w:r>
+              <w:rPr>
+                <w:lang w:val="es-CL"/>
+              </w:rPr>
+              <w:t xml:space="preserve">{{FECHA_PORTADA}}</w:t>
+            </w:r>
+            <w:r>
+              <w:rPr>
+                <w:lang w:val="es-CL"/>
+              </w:rPr>
+              <w:t xml:space="preserve"/>
+            </w:r>
+            <w:r>
+              <w:rPr>
+                <w:lang w:val="es-CL"/>
+              </w:rPr>
+              <w:t xml:space="preserve"/>
+            </w:r>
+            <w:r>
+              <w:rPr>
+                <w:lang w:val="es-CL"/>
+              </w:rPr>
+              <w:t xml:space="preserve"/>
+            </w:r>
+            <w:r>
+              <w:rPr>
+                <w:lang w:val="es-CL"/>
+              </w:rPr>
+              <w:t xml:space="preserve"/>
+            </w:r>
+          </w:p>
+        </w:tc>
+      </w:tr>
+      <w:tr>
+        <w:trPr>
+          <w:trHeight w:val="540"/>
+        </w:trPr>
+        <w:tc>
+          <w:tcPr>
+            <w:tcW w:w="824" w:type="pct"/>
+            <w:vAlign w:val="center"/>
+          </w:tcPr>
+          <w:p>
+            <w:pPr>
+              <w:pStyle w:val="Sinespaciado"/>
+              <w:rPr>
+                <w:rStyle w:val="Textoennegrita"/>
+                <w:bCs w:val="0"/>
+                <w:sz w:val="22"/>
+                <w:szCs w:val="22"/>
+                <w:lang w:val="es-CL"/>
+              </w:rPr>
+            </w:pPr>
+            <w:proofErr w:type="spellStart"/>
+            <w:r>
+              <w:rPr>
+                <w:rStyle w:val="Textoennegrita"/>
+                <w:bCs w:val="0"/>
+                <w:sz w:val="22"/>
+                <w:szCs w:val="22"/>
+                <w:lang w:val="es-CL"/>
+              </w:rPr>
+              <w:t>N°</w:t>
+            </w:r>
+            <w:proofErr w:type="spellEnd"/>
+            <w:r>
+              <w:rPr>
+                <w:rStyle w:val="Textoennegrita"/>
+                <w:bCs w:val="0"/>
+                <w:sz w:val="22"/>
+                <w:szCs w:val="22"/>
+                <w:lang w:val="es-CL"/>
+              </w:rPr>
+              <w:t xml:space="preserve"> INFORME</w:t>
+            </w:r>
+          </w:p>
+        </w:tc>
+        <w:tc>
+          <w:tcPr>
+            <w:tcW w:w="4176" w:type="pct"/>
+            <w:vAlign w:val="center"/>
+          </w:tcPr>
+          <w:p>
+            <w:pPr>
+              <w:pStyle w:val="Sinespaciado"/>
+              <w:rPr>
+                <w:szCs w:val="22"/>
+                <w:lang w:val="es-CL"/>
+              </w:rPr>
+            </w:pPr>
+            <w:r>
+              <w:rPr>
+                <w:szCs w:val="22"/>
+                <w:lang w:val="es-CL"/>
+              </w:rPr>
+              <w:t xml:space="preserve">4SAT010</w:t>
+            </w:r>
+            <w:r>
+              <w:rPr>
+                <w:szCs w:val="22"/>
+                <w:lang w:val="es-CL"/>
+              </w:rPr>
+              <w:t xml:space="preserve"/>
+            </w:r>
+            <w:r>
+              <w:rPr>
+                <w:szCs w:val="22"/>
+                <w:lang w:val="es-CL"/>
+              </w:rPr>
+              <w:t xml:space="preserve"/>
+            </w:r>
+            <w:r>
+              <w:rPr>
+                <w:szCs w:val="22"/>
+                <w:lang w:val="es-CL"/>
+              </w:rPr>
+              <w:t xml:space="preserve"/>
+            </w:r>
+          </w:p>
+        </w:tc>
+      </w:tr>
+    </w:tbl>
+    <w:p>
+      <w:r>
+        <w:br w:type="page"/>
+      </w:r>
     </w:p>
     <w:p>
       <w:pPr>
@@ -372,7 +3232,7 @@
         <w:rPr>
           <w:noProof/>
         </w:rPr>
-        <w:t>2</w:t>
+        <w:t>3</w:t>
       </w:r>
       <w:r>
         <w:rPr>
@@ -445,7 +3305,7 @@
         <w:rPr>
           <w:noProof/>
         </w:rPr>
-        <w:t>2</w:t>
+        <w:t>3</w:t>
       </w:r>
       <w:r>
         <w:rPr>
@@ -518,7 +3378,7 @@
         <w:rPr>
           <w:noProof/>
         </w:rPr>
-        <w:t>3</w:t>
+        <w:t>4</w:t>
       </w:r>
       <w:r>
         <w:rPr>
@@ -591,7 +3451,7 @@
         <w:rPr>
           <w:noProof/>
         </w:rPr>
-        <w:t>4</w:t>
+        <w:t>5</w:t>
       </w:r>
       <w:r>
         <w:rPr>
@@ -664,7 +3524,7 @@
         <w:rPr>
           <w:noProof/>
         </w:rPr>
-        <w:t>6</w:t>
+        <w:t>7</w:t>
       </w:r>
       <w:r>
         <w:rPr>
@@ -3168,10 +6028,13 @@
     </w:p>
     <w:sectPr>
       <w:headerReference w:type="default" r:id="rId13"/>
+      <w:headerReference w:type="first" r:id="rIdPortadaEncabezado"/>
+      <w:footerReference w:type="first" r:id="rId14"/>
       <w:footerReference w:type="default" r:id="rId14"/>
       <w:pgSz w:w="12242" w:h="15842" w:code="119"/>
       <w:pgMar w:top="1985" w:right="1469" w:bottom="851" w:left="1701" w:header="397" w:footer="0" w:gutter="0"/>
       <w:cols w:space="708"/>
+      <w:titlePg/>
       <w:docGrid w:linePitch="272"/>
     </w:sectPr>
   </w:body>
@@ -4052,6 +6915,229 @@
 </w:hdr>
 </file>
 
+<file path=word/header_portada.xml><?xml version="1.0" encoding="utf-8"?>
+<w:hdr xmlns:wpc="http://schemas.microsoft.com/office/word/2010/wordprocessingCanvas" xmlns:cx="http://schemas.microsoft.com/office/drawing/2014/chartex" xmlns:cx1="http://schemas.microsoft.com/office/drawing/2015/9/8/chartex" xmlns:cx2="http://schemas.microsoft.com/office/drawing/2015/10/21/chartex" xmlns:cx3="http://schemas.microsoft.com/office/drawing/2016/5/9/chartex" xmlns:cx4="http://schemas.microsoft.com/office/drawing/2016/5/10/chartex" xmlns:cx5="http://schemas.microsoft.com/office/drawing/2016/5/11/chartex" xmlns:cx6="http://schemas.microsoft.com/office/drawing/2016/5/12/chartex" xmlns:cx7="http://schemas.microsoft.com/office/drawing/2016/5/13/chartex" xmlns:cx8="http://schemas.microsoft.com/office/drawing/2016/5/14/chartex" xmlns:mc="http://schemas.openxmlformats.org/markup-compatibility/2006" xmlns:aink="http://schemas.microsoft.com/office/drawing/2016/ink" xmlns:am3d="http://schemas.microsoft.com/office/drawing/2017/model3d" xmlns:o="urn:schemas-microsoft-com:office:office" xmlns:oel="http://schemas.microsoft.com/office/2019/extlst" xmlns:r="http://schemas.openxmlformats.org/officeDocument/2006/relationships" xmlns:m="http://schemas.openxmlformats.org/officeDocument/2006/math" xmlns:v="urn:schemas-microsoft-com:vml" xmlns:wp14="http://schemas.microsoft.com/office/word/2010/wordprocessingDrawing" xmlns:wp="http://schemas.openxmlformats.org/drawingml/2006/wordprocessingDrawing" xmlns:w10="urn:schemas-microsoft-com:office:word" xmlns:w="http://schemas.openxmlformats.org/wordprocessingml/2006/main" xmlns:w14="http://schemas.microsoft.com/office/word/2010/wordml" xmlns:w15="http://schemas.microsoft.com/office/word/2012/wordml" xmlns:w16cex="http://schemas.microsoft.com/office/word/2018/wordml/cex" xmlns:w16cid="http://schemas.microsoft.com/office/word/2016/wordml/cid" xmlns:w16="http://schemas.microsoft.com/office/word/2018/wordml" xmlns:w16du="http://schemas.microsoft.com/office/word/2023/wordml/word16du" xmlns:w16sdtdh="http://schemas.microsoft.com/office/word/2020/wordml/sdtdatahash" xmlns:w16se="http://schemas.microsoft.com/office/word/2015/wordml/symex" xmlns:wpg="http://schemas.microsoft.com/office/word/2010/wordprocessingGroup" xmlns:wpi="http://schemas.microsoft.com/office/word/2010/wordprocessingInk" xmlns:wne="http://schemas.microsoft.com/office/word/2006/wordml" xmlns:wps="http://schemas.microsoft.com/office/word/2010/wordprocessingShape" mc:Ignorable="w14 w15 w16se w16cid w16 w16cex w16sdtdh w16du wp14">
+  <w:p>
+    <w:pPr>
+      <w:pStyle w:val="Encabezado"/>
+    </w:pPr>
+    <w:r>
+      <w:rPr>
+        <w:noProof/>
+        <w:lang w:val="es-CL" w:eastAsia="es-CL"/>
+      </w:rPr>
+      <mc:AlternateContent>
+        <mc:Choice Requires="wps">
+          <w:drawing>
+            <wp:anchor distT="0" distB="0" distL="114300" distR="114300" simplePos="0" relativeHeight="251660288" behindDoc="0" locked="0" layoutInCell="1" allowOverlap="1" wp14:anchorId="5535A0C3" wp14:editId="05652D83">
+              <wp:simplePos x="0" y="0"/>
+              <wp:positionH relativeFrom="margin">
+                <wp:posOffset>-697230</wp:posOffset>
+              </wp:positionH>
+              <wp:positionV relativeFrom="page">
+                <wp:posOffset>232410</wp:posOffset>
+              </wp:positionV>
+              <wp:extent cx="3729990" cy="397510"/>
+              <wp:effectExtent l="0" t="0" r="22860" b="21590"/>
+              <wp:wrapNone/>
+              <wp:docPr id="3002" name="Cuadro de texto 3"/>
+              <wp:cNvGraphicFramePr>
+                <a:graphicFrameLocks xmlns:a="http://schemas.openxmlformats.org/drawingml/2006/main"/>
+              </wp:cNvGraphicFramePr>
+              <a:graphic xmlns:a="http://schemas.openxmlformats.org/drawingml/2006/main">
+                <a:graphicData uri="http://schemas.microsoft.com/office/word/2010/wordprocessingShape">
+                  <wps:wsp>
+                    <wps:cNvSpPr txBox="1">
+                      <a:spLocks noChangeArrowheads="1"/>
+                    </wps:cNvSpPr>
+                    <wps:spPr bwMode="auto">
+                      <a:xfrm>
+                        <a:off x="0" y="0"/>
+                        <a:ext cx="3729990" cy="397510"/>
+                      </a:xfrm>
+                      <a:prstGeom prst="rect">
+                        <a:avLst/>
+                      </a:prstGeom>
+                      <a:solidFill>
+                        <a:schemeClr val="lt1">
+                          <a:lumMod val="100000"/>
+                          <a:lumOff val="0"/>
+                        </a:schemeClr>
+                      </a:solidFill>
+                      <a:ln w="6350">
+                        <a:solidFill>
+                          <a:schemeClr val="bg1">
+                            <a:lumMod val="100000"/>
+                            <a:lumOff val="0"/>
+                          </a:schemeClr>
+                        </a:solidFill>
+                        <a:miter lim="800000"/>
+                        <a:headEnd/>
+                        <a:tailEnd/>
+                      </a:ln>
+                    </wps:spPr>
+                    <wps:txbx>
+                      <w:txbxContent>
+                        <w:p>
+                          <w:pPr>
+                            <w:pBdr>
+                              <w:top w:val="single" w:sz="4" w:space="1" w:color="auto"/>
+                              <w:bottom w:val="single" w:sz="4" w:space="1" w:color="auto"/>
+                            </w:pBdr>
+                            <w:spacing w:line="240" w:lineRule="auto"/>
+                            <w:jc w:val="center"/>
+                            <w:rPr>
+                              <w:rFonts w:ascii="Arial Narrow" w:hAnsi="Arial Narrow"/>
+                              <w:sz w:val="36"/>
+                              <w:szCs w:val="36"/>
+                              <w:lang w:val="es-CL"/>
+                            </w:rPr>
+                          </w:pPr>
+                          <w:r>
+                            <w:rPr>
+                              <w:rFonts w:ascii="Arial Narrow" w:hAnsi="Arial Narrow"/>
+                              <w:sz w:val="36"/>
+                              <w:szCs w:val="36"/>
+                              <w:lang w:val="es-CL"/>
+                            </w:rPr>
+                            <w:t>REPORTE TÉCNICO DE MANTENCIÓN</w:t>
+                          </w:r>
+                        </w:p>
+                      </w:txbxContent>
+                    </wps:txbx>
+                    <wps:bodyPr rot="0" vert="horz" wrap="square" lIns="91440" tIns="45720" rIns="91440" bIns="45720" anchor="t" anchorCtr="0" upright="1">
+                      <a:noAutofit/>
+                    </wps:bodyPr>
+                  </wps:wsp>
+                </a:graphicData>
+              </a:graphic>
+              <wp14:sizeRelH relativeFrom="page">
+                <wp14:pctWidth>0</wp14:pctWidth>
+              </wp14:sizeRelH>
+              <wp14:sizeRelV relativeFrom="page">
+                <wp14:pctHeight>0</wp14:pctHeight>
+              </wp14:sizeRelV>
+            </wp:anchor>
+          </w:drawing>
+        </mc:Choice>
+        <mc:Fallback>
+          <w:pict>
+            <v:shapetype w14:anchorId="5535A0C3" id="_x0000_t202" coordsize="21600,21600" o:spt="202" path="m,l,21600r21600,l21600,xe">
+              <v:stroke joinstyle="miter"/>
+              <v:path gradientshapeok="t" o:connecttype="rect"/>
+            </v:shapetype>
+            <v:shape id="Cuadro de texto 3" o:spid="_x0000_s1028" type="#_x0000_t202" style="position:absolute;left:0;text-align:left;margin-left:-54.9pt;margin-top:18.3pt;width:293.7pt;height:31.3pt;z-index:251660288;visibility:visible;mso-wrap-style:square;mso-width-percent:0;mso-height-percent:0;mso-wrap-distance-left:9pt;mso-wrap-distance-top:0;mso-wrap-distance-right:9pt;mso-wrap-distance-bottom:0;mso-position-horizontal:absolute;mso-position-horizontal-relative:margin;mso-position-vertical:absolute;mso-position-vertical-relative:page;mso-width-percent:0;mso-height-percent:0;mso-width-relative:page;mso-height-relative:page;v-text-anchor:top" o:gfxdata="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" fillcolor="white [3201]" strokecolor="white [3212]" strokeweight=".5pt">
+              <v:textbox>
+                <w:txbxContent>
+                  <w:p>
+                    <w:pPr>
+                      <w:pBdr>
+                        <w:top w:val="single" w:sz="4" w:space="1" w:color="auto"/>
+                        <w:bottom w:val="single" w:sz="4" w:space="1" w:color="auto"/>
+                      </w:pBdr>
+                      <w:spacing w:line="240" w:lineRule="auto"/>
+                      <w:jc w:val="center"/>
+                      <w:rPr>
+                        <w:rFonts w:ascii="Arial Narrow" w:hAnsi="Arial Narrow"/>
+                        <w:sz w:val="36"/>
+                        <w:szCs w:val="36"/>
+                        <w:lang w:val="es-CL"/>
+                      </w:rPr>
+                    </w:pPr>
+                    <w:r>
+                      <w:rPr>
+                        <w:rFonts w:ascii="Arial Narrow" w:hAnsi="Arial Narrow"/>
+                        <w:sz w:val="36"/>
+                        <w:szCs w:val="36"/>
+                        <w:lang w:val="es-CL"/>
+                      </w:rPr>
+                      <w:t>REPORTE TÉCNICO DE MANTENCIÓN</w:t>
+                    </w:r>
+                  </w:p>
+                </w:txbxContent>
+              </v:textbox>
+              <w10:wrap anchorx="margin" anchory="margin"/>
+            </v:shape>
+          </w:pict>
+        </mc:Fallback>
+      </mc:AlternateContent>
+    </w:r>
+    <w:r>
+      <w:rPr>
+        <w:noProof/>
+        <w:lang w:val="es-CL" w:eastAsia="es-CL"/>
+      </w:rPr>
+      <w:drawing>
+        <wp:anchor distT="0" distB="0" distL="114300" distR="114300" simplePos="0" relativeHeight="251659264" behindDoc="0" locked="0" layoutInCell="1" allowOverlap="1" wp14:anchorId="158FB7CF" wp14:editId="458B4309">
+          <wp:simplePos x="0" y="0"/>
+          <wp:positionH relativeFrom="margin">
+            <wp:posOffset>4236085</wp:posOffset>
+          </wp:positionH>
+          <wp:positionV relativeFrom="page">
+            <wp:posOffset>188595</wp:posOffset>
+          </wp:positionV>
+          <wp:extent cx="1664335" cy="464185"/>
+          <wp:effectExtent l="19050" t="0" r="0" b="0"/>
+          <wp:wrapNone/>
+          <wp:docPr id="2013" name="Imagen 230"/>
+          <wp:cNvGraphicFramePr>
+            <a:graphicFrameLocks xmlns:a="http://schemas.openxmlformats.org/drawingml/2006/main" noChangeAspect="1"/>
+          </wp:cNvGraphicFramePr>
+          <a:graphic xmlns:a="http://schemas.openxmlformats.org/drawingml/2006/main">
+            <a:graphicData uri="http://schemas.openxmlformats.org/drawingml/2006/picture">
+              <pic:pic xmlns:pic="http://schemas.openxmlformats.org/drawingml/2006/picture">
+                <pic:nvPicPr>
+                  <pic:cNvPr id="2000" name="Imagen 230"/>
+                  <pic:cNvPicPr>
+                    <a:picLocks noChangeAspect="1" noChangeArrowheads="1"/>
+                  </pic:cNvPicPr>
+                </pic:nvPicPr>
+                <pic:blipFill>
+                  <a:blip r:embed="rId1"/>
+                  <a:srcRect/>
+                  <a:stretch>
+                    <a:fillRect/>
+                  </a:stretch>
+                </pic:blipFill>
+                <pic:spPr bwMode="auto">
+                  <a:xfrm>
+                    <a:off x="0" y="0"/>
+                    <a:ext cx="1664335" cy="464185"/>
+                  </a:xfrm>
+                  <a:prstGeom prst="rect">
+                    <a:avLst/>
+                  </a:prstGeom>
+                  <a:noFill/>
+                  <a:ln w="9525">
+                    <a:noFill/>
+                    <a:miter lim="800000"/>
+                    <a:headEnd/>
+                    <a:tailEnd/>
+                  </a:ln>
+                </pic:spPr>
+              </pic:pic>
+            </a:graphicData>
+          </a:graphic>
+        </wp:anchor>
+      </w:drawing>
+    </w:r>
+  </w:p>
+  <w:p>
+    <w:pPr>
+      <w:pStyle w:val="Encabezado"/>
+    </w:pPr>
+  </w:p>
+  <w:p>
+    <w:pPr>
+      <w:pStyle w:val="Encabezado"/>
+    </w:pPr>
+    <w:r>
+      <w:tab/>
+    </w:r>
+  </w:p>
+</w:hdr>
+</file>
+
 <file path=word/numbering.xml><?xml version="1.0" encoding="utf-8"?>
 <w:numbering xmlns:wpc="http://schemas.microsoft.com/office/word/2010/wordprocessingCanvas" xmlns:cx="http://schemas.microsoft.com/office/drawing/2014/chartex" xmlns:cx1="http://schemas.microsoft.com/office/drawing/2015/9/8/chartex" xmlns:cx2="http://schemas.microsoft.com/office/drawing/2015/10/21/chartex" xmlns:cx3="http://schemas.microsoft.com/office/drawing/2016/5/9/chartex" xmlns:cx4="http://schemas.microsoft.com/office/drawing/2016/5/10/chartex" xmlns:cx5="http://schemas.microsoft.com/office/drawing/2016/5/11/chartex" xmlns:cx6="http://schemas.microsoft.com/office/drawing/2016/5/12/chartex" xmlns:cx7="http://schemas.microsoft.com/office/drawing/2016/5/13/chartex" xmlns:cx8="http://schemas.microsoft.com/office/drawing/2016/5/14/chartex" xmlns:mc="http://schemas.openxmlformats.org/markup-compatibility/2006" xmlns:aink="http://schemas.microsoft.com/office/drawing/2016/ink" xmlns:am3d="http://schemas.microsoft.com/office/drawing/2017/model3d" xmlns:o="urn:schemas-microsoft-com:office:office" xmlns:r="http://schemas.openxmlformats.org/officeDocument/2006/relationships" xmlns:m="http://schemas.openxmlformats.org/officeDocument/2006/math" xmlns:v="urn:schemas-microsoft-com:vml" xmlns:wp14="http://schemas.microsoft.com/office/word/2010/wordprocessingDrawing" xmlns:wp="http://schemas.openxmlformats.org/drawingml/2006/wordprocessingDrawing" xmlns:w10="urn:schemas-microsoft-com:office:word" xmlns:w="http://schemas.openxmlformats.org/wordprocessingml/2006/main" xmlns:w14="http://schemas.microsoft.com/office/word/2010/wordml" xmlns:w15="http://schemas.microsoft.com/office/word/2012/wordml" xmlns:w16cex="http://schemas.microsoft.com/office/word/2018/wordml/cex" xmlns:w16cid="http://schemas.microsoft.com/office/word/2016/wordml/cid" xmlns:w16="http://schemas.microsoft.com/office/word/2018/wordml" xmlns:w16se="http://schemas.microsoft.com/office/word/2015/wordml/symex" xmlns:wpg="http://schemas.microsoft.com/office/word/2010/wordprocessingGroup" xmlns:wpi="http://schemas.microsoft.com/office/word/2010/wordprocessingInk" xmlns:wne="http://schemas.microsoft.com/office/word/2006/wordml" xmlns:wps="http://schemas.microsoft.com/office/word/2010/wordprocessingShape" mc:Ignorable="w14 w15 w16se w16cid w16 w16cex wp14">
   <w:abstractNum w:abstractNumId="0" w15:restartNumberingAfterBreak="0">

</xml_diff>

<commit_message>
Agrega el título de sección a la página de la hoja de trabajo
La leyenda centrada pasa a ser la sección 6 "Registro de hoja de trabajo",
con el mismo estilo de título que las demás y su línea en el índice.

Co-Authored-By: Claude Opus 5.5 <noreply@anthropic.com>
</commit_message>
<xml_diff>
--- a/backend/plantillas/fricke_mantencion.docx
+++ b/backend/plantillas/fricke_mantencion.docx
@@ -3535,6 +3535,79 @@
     </w:p>
     <w:p>
       <w:pPr>
+        <w:pStyle w:val="TDC1"/>
+        <w:rPr>
+          <w:rFonts w:asciiTheme="minorHAnsi" w:eastAsiaTheme="minorEastAsia" w:hAnsiTheme="minorHAnsi" w:cstheme="minorBidi"/>
+          <w:noProof/>
+          <w:szCs w:val="22"/>
+          <w:lang w:val="es-CL" w:eastAsia="es-CL"/>
+        </w:rPr>
+      </w:pPr>
+      <w:r>
+        <w:rPr>
+          <w:noProof/>
+        </w:rPr>
+        <w:t>6</w:t>
+      </w:r>
+      <w:r>
+        <w:rPr>
+          <w:rFonts w:asciiTheme="minorHAnsi" w:eastAsiaTheme="minorEastAsia" w:hAnsiTheme="minorHAnsi" w:cstheme="minorBidi"/>
+          <w:noProof/>
+          <w:szCs w:val="22"/>
+          <w:lang w:val="es-CL" w:eastAsia="es-CL"/>
+        </w:rPr>
+        <w:tab/>
+      </w:r>
+      <w:r>
+        <w:rPr>
+          <w:noProof/>
+        </w:rPr>
+        <w:t>Registro de hoja de trabajo</w:t>
+      </w:r>
+      <w:r>
+        <w:rPr>
+          <w:noProof/>
+        </w:rPr>
+        <w:tab/>
+      </w:r>
+      <w:r>
+        <w:rPr>
+          <w:noProof/>
+        </w:rPr>
+        <w:fldChar w:fldCharType="begin"/>
+      </w:r>
+      <w:r>
+        <w:rPr>
+          <w:noProof/>
+        </w:rPr>
+        <w:instrText xml:space="preserve"> PAGEREF _TocHojaTrabajo \h </w:instrText>
+      </w:r>
+      <w:r>
+        <w:rPr>
+          <w:noProof/>
+        </w:rPr>
+      </w:r>
+      <w:r>
+        <w:rPr>
+          <w:noProof/>
+        </w:rPr>
+        <w:fldChar w:fldCharType="separate"/>
+      </w:r>
+      <w:r>
+        <w:rPr>
+          <w:noProof/>
+        </w:rPr>
+        <w:t>8</w:t>
+      </w:r>
+      <w:r>
+        <w:rPr>
+          <w:noProof/>
+        </w:rPr>
+        <w:fldChar w:fldCharType="end"/>
+      </w:r>
+    </w:p>
+    <w:p>
+      <w:pPr>
         <w:tabs>
           <w:tab w:val="left" w:pos="1418"/>
           <w:tab w:val="left" w:pos="1701"/>
@@ -5912,15 +5985,13 @@
     </w:p>
     <w:p>
       <w:pPr>
-        <w:jc w:val="center"/>
-      </w:pPr>
-      <w:r>
-        <w:lastRenderedPageBreak/>
-        <w:t>Registro de Hoja de Trabajo de Asistencia Técnica</w:t>
-      </w:r>
-      <w:r>
-        <w:t>.</w:t>
-      </w:r>
+        <w:pStyle w:val="Ttulo1"/>
+      </w:pPr>
+      <w:bookmarkStart w:id="900" w:name="_TocHojaTrabajo"/>
+      <w:r>
+        <w:t>Registro de hoja de trabajo</w:t>
+      </w:r>
+      <w:bookmarkEnd w:id="900"/>
     </w:p>
     <w:p>
       <w:pPr>

</xml_diff>

<commit_message>
Agrega la sección Registro de baterías y su tabla de colores en el formulario
- Nueva sección 4 "Registro de baterías" (tablas tomadas del informe de
  Los Carrera) con el índice y las secciones siguientes renumeradas.
- En el paso Datos, réplica editable de la tabla Pass/Warning/Fail con las
  medidas estándar por defecto; el total Pass se calcula solo.
- El script de la plantilla respeta tablas anidadas.

Co-Authored-By: Claude Opus 5.5 <noreply@anthropic.com>
</commit_message>
<xml_diff>
--- a/backend/plantillas/fricke_mantencion.docx
+++ b/backend/plantillas/fricke_mantencion.docx
@@ -3416,7 +3416,7 @@
         <w:rPr>
           <w:noProof/>
         </w:rPr>
-        <w:t>Rutina de Servicio de Mantención Preventiva</w:t>
+        <w:t>Registro de baterías</w:t>
       </w:r>
       <w:r>
         <w:rPr>
@@ -3434,7 +3434,7 @@
         <w:rPr>
           <w:noProof/>
         </w:rPr>
-        <w:instrText xml:space="preserve"> PAGEREF _Toc59616377 \h </w:instrText>
+        <w:instrText xml:space="preserve"> PAGEREF _TocBaterias \h </w:instrText>
       </w:r>
       <w:r>
         <w:rPr>
@@ -3489,7 +3489,7 @@
         <w:rPr>
           <w:noProof/>
         </w:rPr>
-        <w:t>Registro fotográfico</w:t>
+        <w:t>Rutina de Servicio de Mantención Preventiva</w:t>
       </w:r>
       <w:r>
         <w:rPr>
@@ -3507,7 +3507,7 @@
         <w:rPr>
           <w:noProof/>
         </w:rPr>
-        <w:instrText xml:space="preserve"> PAGEREF _Toc59616378 \h </w:instrText>
+        <w:instrText xml:space="preserve"> PAGEREF _Toc59616377 \h </w:instrText>
       </w:r>
       <w:r>
         <w:rPr>
@@ -3524,7 +3524,7 @@
         <w:rPr>
           <w:noProof/>
         </w:rPr>
-        <w:t>7</w:t>
+        <w:t>6</w:t>
       </w:r>
       <w:r>
         <w:rPr>
@@ -3562,7 +3562,7 @@
         <w:rPr>
           <w:noProof/>
         </w:rPr>
-        <w:t>Registro de hoja de trabajo</w:t>
+        <w:t>Registro fotográfico</w:t>
       </w:r>
       <w:r>
         <w:rPr>
@@ -3580,7 +3580,7 @@
         <w:rPr>
           <w:noProof/>
         </w:rPr>
-        <w:instrText xml:space="preserve"> PAGEREF _TocHojaTrabajo \h </w:instrText>
+        <w:instrText xml:space="preserve"> PAGEREF _Toc59616378 \h </w:instrText>
       </w:r>
       <w:r>
         <w:rPr>
@@ -3598,6 +3598,79 @@
           <w:noProof/>
         </w:rPr>
         <w:t>8</w:t>
+      </w:r>
+      <w:r>
+        <w:rPr>
+          <w:noProof/>
+        </w:rPr>
+        <w:fldChar w:fldCharType="end"/>
+      </w:r>
+    </w:p>
+    <w:p>
+      <w:pPr>
+        <w:pStyle w:val="TDC1"/>
+        <w:rPr>
+          <w:rFonts w:asciiTheme="minorHAnsi" w:eastAsiaTheme="minorEastAsia" w:hAnsiTheme="minorHAnsi" w:cstheme="minorBidi"/>
+          <w:noProof/>
+          <w:szCs w:val="22"/>
+          <w:lang w:val="es-CL" w:eastAsia="es-CL"/>
+        </w:rPr>
+      </w:pPr>
+      <w:r>
+        <w:rPr>
+          <w:noProof/>
+        </w:rPr>
+        <w:t>7</w:t>
+      </w:r>
+      <w:r>
+        <w:rPr>
+          <w:rFonts w:asciiTheme="minorHAnsi" w:eastAsiaTheme="minorEastAsia" w:hAnsiTheme="minorHAnsi" w:cstheme="minorBidi"/>
+          <w:noProof/>
+          <w:szCs w:val="22"/>
+          <w:lang w:val="es-CL" w:eastAsia="es-CL"/>
+        </w:rPr>
+        <w:tab/>
+      </w:r>
+      <w:r>
+        <w:rPr>
+          <w:noProof/>
+        </w:rPr>
+        <w:t>Registro de hoja de trabajo</w:t>
+      </w:r>
+      <w:r>
+        <w:rPr>
+          <w:noProof/>
+        </w:rPr>
+        <w:tab/>
+      </w:r>
+      <w:r>
+        <w:rPr>
+          <w:noProof/>
+        </w:rPr>
+        <w:fldChar w:fldCharType="begin"/>
+      </w:r>
+      <w:r>
+        <w:rPr>
+          <w:noProof/>
+        </w:rPr>
+        <w:instrText xml:space="preserve"> PAGEREF _TocHojaTrabajo \h </w:instrText>
+      </w:r>
+      <w:r>
+        <w:rPr>
+          <w:noProof/>
+        </w:rPr>
+      </w:r>
+      <w:r>
+        <w:rPr>
+          <w:noProof/>
+        </w:rPr>
+        <w:fldChar w:fldCharType="separate"/>
+      </w:r>
+      <w:r>
+        <w:rPr>
+          <w:noProof/>
+        </w:rPr>
+        <w:t>9</w:t>
       </w:r>
       <w:r>
         <w:rPr>
@@ -5172,6 +5245,1661 @@
         <w:spacing w:after="0" w:line="240" w:lineRule="auto"/>
         <w:jc w:val="left"/>
       </w:pPr>
+      <w:r>
+        <w:br w:type="page"/>
+      </w:r>
+    </w:p>
+    <w:p>
+      <w:pPr>
+        <w:pStyle w:val="Ttulo1"/>
+      </w:pPr>
+      <w:bookmarkStart w:id="901" w:name="_TocBaterias"/>
+      <w:r>
+        <w:t>Registro de baterías</w:t>
+      </w:r>
+      <w:bookmarkEnd w:id="901"/>
+    </w:p>
+    <w:tbl>
+      <w:tblPr>
+        <w:tblW w:w="0" w:type="auto"/>
+        <w:tblBorders>
+          <w:top w:val="nil"/>
+          <w:left w:val="nil"/>
+          <w:bottom w:val="nil"/>
+          <w:right w:val="nil"/>
+        </w:tblBorders>
+        <w:tblCellMar>
+          <w:left w:w="0" w:type="dxa"/>
+          <w:right w:w="0" w:type="dxa"/>
+        </w:tblCellMar>
+        <w:tblLook w:val="0000" w:firstRow="0" w:lastRow="0" w:firstColumn="0" w:lastColumn="0" w:noHBand="0" w:noVBand="0"/>
+      </w:tblPr>
+      <w:tblGrid>
+        <w:gridCol w:w="181"/>
+        <w:gridCol w:w="8870"/>
+        <w:gridCol w:w="21"/>
+      </w:tblGrid>
+      <w:tr>
+        <w:tc>
+          <w:tcPr>
+            <w:tcW w:w="215" w:type="dxa"/>
+            <w:vMerge w:val="restart"/>
+          </w:tcPr>
+          <w:tbl>
+            <w:tblPr>
+              <w:tblW w:w="5000" w:type="pct"/>
+              <w:tblCellMar>
+                <w:left w:w="0" w:type="dxa"/>
+                <w:right w:w="0" w:type="dxa"/>
+              </w:tblCellMar>
+              <w:tblLook w:val="0000" w:firstRow="0" w:lastRow="0" w:firstColumn="0" w:lastColumn="0" w:noHBand="0" w:noVBand="0"/>
+            </w:tblPr>
+            <w:tblGrid>
+              <w:gridCol w:w="181"/>
+            </w:tblGrid>
+            <w:tr>
+              <w:trPr>
+                <w:trHeight w:val="4299"/>
+              </w:trPr>
+              <w:tc>
+                <w:tcPr>
+                  <w:tcW w:w="5000" w:type="pct"/>
+                  <w:shd w:val="clear" w:color="auto" w:fill="3F52AF"/>
+                  <w:tcMar>
+                    <w:top w:w="0" w:type="dxa"/>
+                    <w:left w:w="0" w:type="dxa"/>
+                    <w:bottom w:w="0" w:type="dxa"/>
+                    <w:right w:w="0" w:type="dxa"/>
+                  </w:tcMar>
+                </w:tcPr>
+                <w:p>
+                  <w:pPr>
+                    <w:spacing w:after="0" w:line="240" w:lineRule="auto"/>
+                  </w:pPr>
+                </w:p>
+              </w:tc>
+            </w:tr>
+          </w:tbl>
+          <w:p>
+            <w:pPr>
+              <w:spacing w:after="0" w:line="240" w:lineRule="auto"/>
+            </w:pPr>
+          </w:p>
+        </w:tc>
+        <w:tc>
+          <w:tcPr>
+            <w:tcW w:w="9762" w:type="dxa"/>
+            <w:gridSpan w:val="2"/>
+          </w:tcPr>
+          <w:tbl>
+            <w:tblPr>
+              <w:tblW w:w="0" w:type="auto"/>
+              <w:tblBorders>
+                <w:top w:val="nil"/>
+                <w:left w:val="nil"/>
+                <w:bottom w:val="nil"/>
+                <w:right w:val="nil"/>
+              </w:tblBorders>
+              <w:tblCellMar>
+                <w:left w:w="0" w:type="dxa"/>
+                <w:right w:w="0" w:type="dxa"/>
+              </w:tblCellMar>
+              <w:tblLook w:val="0000" w:firstRow="0" w:lastRow="0" w:firstColumn="0" w:lastColumn="0" w:noHBand="0" w:noVBand="0"/>
+            </w:tblPr>
+            <w:tblGrid>
+              <w:gridCol w:w="1988"/>
+              <w:gridCol w:w="6885"/>
+            </w:tblGrid>
+            <w:tr>
+              <w:trPr>
+                <w:trHeight w:val="262"/>
+              </w:trPr>
+              <w:tc>
+                <w:tcPr>
+                  <w:tcW w:w="2128" w:type="dxa"/>
+                  <w:tcBorders>
+                    <w:top w:val="single" w:sz="7" w:space="0" w:color="D3D3D3"/>
+                    <w:left w:val="single" w:sz="7" w:space="0" w:color="D3D3D3"/>
+                    <w:bottom w:val="single" w:sz="7" w:space="0" w:color="D3D3D3"/>
+                    <w:right w:val="single" w:sz="7" w:space="0" w:color="D3D3D3"/>
+                  </w:tcBorders>
+                  <w:shd w:val="clear" w:color="auto" w:fill="3F52AF"/>
+                  <w:tcMar>
+                    <w:top w:w="39" w:type="dxa"/>
+                    <w:left w:w="39" w:type="dxa"/>
+                    <w:bottom w:w="39" w:type="dxa"/>
+                    <w:right w:w="39" w:type="dxa"/>
+                  </w:tcMar>
+                </w:tcPr>
+                <w:p>
+                  <w:pPr>
+                    <w:spacing w:after="0" w:line="240" w:lineRule="auto"/>
+                  </w:pPr>
+                  <w:proofErr w:type="spellStart"/>
+                  <w:r>
+                    <w:rPr>
+                      <w:rFonts w:ascii="Segoe UI" w:eastAsia="Segoe UI" w:hAnsi="Segoe UI"/>
+                      <w:color w:val="FFFFFF"/>
+                      <w:sz w:val="16"/>
+                    </w:rPr>
+                    <w:t>Profile</w:t>
+                  </w:r>
+                  <w:proofErr w:type="spellEnd"/>
+                  <w:r>
+                    <w:rPr>
+                      <w:rFonts w:ascii="Segoe UI" w:eastAsia="Segoe UI" w:hAnsi="Segoe UI"/>
+                      <w:color w:val="FFFFFF"/>
+                      <w:sz w:val="16"/>
+                    </w:rPr>
+                    <w:t xml:space="preserve"> </w:t>
+                  </w:r>
+                  <w:proofErr w:type="spellStart"/>
+                  <w:r>
+                    <w:rPr>
+                      <w:rFonts w:ascii="Segoe UI" w:eastAsia="Segoe UI" w:hAnsi="Segoe UI"/>
+                      <w:color w:val="FFFFFF"/>
+                      <w:sz w:val="16"/>
+                    </w:rPr>
+                    <w:t>Information</w:t>
+                  </w:r>
+                  <w:proofErr w:type="spellEnd"/>
+                </w:p>
+              </w:tc>
+              <w:tc>
+                <w:tcPr>
+                  <w:tcW w:w="7656" w:type="dxa"/>
+                  <w:tcBorders>
+                    <w:top w:val="single" w:sz="7" w:space="0" w:color="D3D3D3"/>
+                    <w:left w:val="single" w:sz="7" w:space="0" w:color="D3D3D3"/>
+                    <w:bottom w:val="single" w:sz="7" w:space="0" w:color="D3D3D3"/>
+                    <w:right w:val="single" w:sz="7" w:space="0" w:color="D3D3D3"/>
+                  </w:tcBorders>
+                  <w:shd w:val="clear" w:color="auto" w:fill="3F52AF"/>
+                  <w:tcMar>
+                    <w:top w:w="39" w:type="dxa"/>
+                    <w:left w:w="39" w:type="dxa"/>
+                    <w:bottom w:w="39" w:type="dxa"/>
+                    <w:right w:w="39" w:type="dxa"/>
+                  </w:tcMar>
+                </w:tcPr>
+                <w:p>
+                  <w:pPr>
+                    <w:spacing w:after="0" w:line="240" w:lineRule="auto"/>
+                  </w:pPr>
+                </w:p>
+              </w:tc>
+            </w:tr>
+            <w:tr>
+              <w:trPr>
+                <w:trHeight w:val="262"/>
+              </w:trPr>
+              <w:tc>
+                <w:tcPr>
+                  <w:tcW w:w="2128" w:type="dxa"/>
+                  <w:tcBorders>
+                    <w:top w:val="single" w:sz="7" w:space="0" w:color="D3D3D3"/>
+                    <w:left w:val="single" w:sz="7" w:space="0" w:color="D3D3D3"/>
+                    <w:bottom w:val="single" w:sz="7" w:space="0" w:color="D3D3D3"/>
+                    <w:right w:val="single" w:sz="7" w:space="0" w:color="D3D3D3"/>
+                  </w:tcBorders>
+                  <w:tcMar>
+                    <w:top w:w="39" w:type="dxa"/>
+                    <w:left w:w="39" w:type="dxa"/>
+                    <w:bottom w:w="39" w:type="dxa"/>
+                    <w:right w:w="39" w:type="dxa"/>
+                  </w:tcMar>
+                </w:tcPr>
+                <w:p>
+                  <w:pPr>
+                    <w:spacing w:after="0" w:line="240" w:lineRule="auto"/>
+                  </w:pPr>
+                  <w:proofErr w:type="spellStart"/>
+                  <w:r>
+                    <w:rPr>
+                      <w:rFonts w:ascii="Segoe UI" w:eastAsia="Segoe UI" w:hAnsi="Segoe UI"/>
+                      <w:color w:val="000000"/>
+                      <w:sz w:val="16"/>
+                    </w:rPr>
+                    <w:t>Profile</w:t>
+                  </w:r>
+                  <w:proofErr w:type="spellEnd"/>
+                  <w:r>
+                    <w:rPr>
+                      <w:rFonts w:ascii="Segoe UI" w:eastAsia="Segoe UI" w:hAnsi="Segoe UI"/>
+                      <w:color w:val="000000"/>
+                      <w:sz w:val="16"/>
+                    </w:rPr>
+                    <w:t xml:space="preserve"> </w:t>
+                  </w:r>
+                  <w:proofErr w:type="spellStart"/>
+                  <w:r>
+                    <w:rPr>
+                      <w:rFonts w:ascii="Segoe UI" w:eastAsia="Segoe UI" w:hAnsi="Segoe UI"/>
+                      <w:color w:val="000000"/>
+                      <w:sz w:val="16"/>
+                    </w:rPr>
+                    <w:t>Number</w:t>
+                  </w:r>
+                  <w:proofErr w:type="spellEnd"/>
+                </w:p>
+              </w:tc>
+              <w:tc>
+                <w:tcPr>
+                  <w:tcW w:w="7656" w:type="dxa"/>
+                  <w:tcBorders>
+                    <w:top w:val="single" w:sz="7" w:space="0" w:color="D3D3D3"/>
+                    <w:left w:val="single" w:sz="7" w:space="0" w:color="D3D3D3"/>
+                    <w:bottom w:val="single" w:sz="7" w:space="0" w:color="D3D3D3"/>
+                    <w:right w:val="single" w:sz="7" w:space="0" w:color="D3D3D3"/>
+                  </w:tcBorders>
+                  <w:shd w:val="clear" w:color="auto" w:fill="auto"/>
+                  <w:tcMar>
+                    <w:top w:w="39" w:type="dxa"/>
+                    <w:left w:w="39" w:type="dxa"/>
+                    <w:bottom w:w="39" w:type="dxa"/>
+                    <w:right w:w="39" w:type="dxa"/>
+                  </w:tcMar>
+                </w:tcPr>
+                <w:p>
+                  <w:pPr>
+                    <w:spacing w:after="0" w:line="240" w:lineRule="auto"/>
+                    <w:rPr>
+                      <w:sz w:val="16"/>
+                      <w:szCs w:val="16"/>
+                    </w:rPr>
+                  </w:pPr>
+                  <w:r>
+                    <w:rPr>
+                      <w:rFonts w:ascii="Segoe UI" w:eastAsia="Segoe UI" w:hAnsi="Segoe UI"/>
+                      <w:color w:val="000000"/>
+                      <w:sz w:val="16"/>
+                      <w:szCs w:val="16"/>
+                    </w:rPr>
+                    <w:t xml:space="preserve">- {{BAT_PERFIL}}</w:t>
+                  </w:r>
+                  <w:r>
+                    <w:rPr>
+                      <w:rFonts w:ascii="Segoe UI" w:eastAsia="Segoe UI" w:hAnsi="Segoe UI"/>
+                      <w:color w:val="000000"/>
+                      <w:sz w:val="16"/>
+                      <w:szCs w:val="16"/>
+                    </w:rPr>
+                    <w:t xml:space="preserve"/>
+                  </w:r>
+                </w:p>
+              </w:tc>
+            </w:tr>
+            <w:tr>
+              <w:trPr>
+                <w:trHeight w:val="262"/>
+              </w:trPr>
+              <w:tc>
+                <w:tcPr>
+                  <w:tcW w:w="2128" w:type="dxa"/>
+                  <w:tcBorders>
+                    <w:top w:val="single" w:sz="7" w:space="0" w:color="D3D3D3"/>
+                    <w:left w:val="single" w:sz="7" w:space="0" w:color="D3D3D3"/>
+                    <w:bottom w:val="single" w:sz="7" w:space="0" w:color="D3D3D3"/>
+                    <w:right w:val="single" w:sz="7" w:space="0" w:color="D3D3D3"/>
+                  </w:tcBorders>
+                  <w:tcMar>
+                    <w:top w:w="39" w:type="dxa"/>
+                    <w:left w:w="39" w:type="dxa"/>
+                    <w:bottom w:w="39" w:type="dxa"/>
+                    <w:right w:w="39" w:type="dxa"/>
+                  </w:tcMar>
+                </w:tcPr>
+                <w:p>
+                  <w:pPr>
+                    <w:spacing w:after="0" w:line="240" w:lineRule="auto"/>
+                  </w:pPr>
+                  <w:proofErr w:type="spellStart"/>
+                  <w:r>
+                    <w:rPr>
+                      <w:rFonts w:ascii="Segoe UI" w:eastAsia="Segoe UI" w:hAnsi="Segoe UI"/>
+                      <w:color w:val="000000"/>
+                      <w:sz w:val="16"/>
+                    </w:rPr>
+                    <w:t>Location</w:t>
+                  </w:r>
+                  <w:proofErr w:type="spellEnd"/>
+                  <w:r>
+                    <w:rPr>
+                      <w:rFonts w:ascii="Segoe UI" w:eastAsia="Segoe UI" w:hAnsi="Segoe UI"/>
+                      <w:color w:val="000000"/>
+                      <w:sz w:val="16"/>
+                    </w:rPr>
+                    <w:t xml:space="preserve"> </w:t>
+                  </w:r>
+                  <w:proofErr w:type="spellStart"/>
+                  <w:r>
+                    <w:rPr>
+                      <w:rFonts w:ascii="Segoe UI" w:eastAsia="Segoe UI" w:hAnsi="Segoe UI"/>
+                      <w:color w:val="000000"/>
+                      <w:sz w:val="16"/>
+                    </w:rPr>
+                    <w:t>Information</w:t>
+                  </w:r>
+                  <w:proofErr w:type="spellEnd"/>
+                </w:p>
+              </w:tc>
+              <w:tc>
+                <w:tcPr>
+                  <w:tcW w:w="7656" w:type="dxa"/>
+                  <w:tcBorders>
+                    <w:top w:val="single" w:sz="7" w:space="0" w:color="D3D3D3"/>
+                    <w:left w:val="single" w:sz="7" w:space="0" w:color="D3D3D3"/>
+                    <w:bottom w:val="single" w:sz="7" w:space="0" w:color="D3D3D3"/>
+                    <w:right w:val="single" w:sz="7" w:space="0" w:color="D3D3D3"/>
+                  </w:tcBorders>
+                  <w:shd w:val="clear" w:color="auto" w:fill="auto"/>
+                  <w:tcMar>
+                    <w:top w:w="39" w:type="dxa"/>
+                    <w:left w:w="39" w:type="dxa"/>
+                    <w:bottom w:w="39" w:type="dxa"/>
+                    <w:right w:w="39" w:type="dxa"/>
+                  </w:tcMar>
+                </w:tcPr>
+                <w:p>
+                  <w:pPr>
+                    <w:pStyle w:val="Prrafodelista"/>
+                    <w:spacing w:after="0" w:line="240" w:lineRule="auto"/>
+                    <w:ind w:left="102" w:hanging="102"/>
+                    <w:rPr>
+                      <w:sz w:val="16"/>
+                      <w:szCs w:val="16"/>
+                    </w:rPr>
+                  </w:pPr>
+                  <w:r>
+                    <w:rPr>
+                      <w:rFonts w:ascii="Segoe UI" w:eastAsia="Segoe UI" w:hAnsi="Segoe UI"/>
+                      <w:color w:val="000000"/>
+                      <w:sz w:val="16"/>
+                      <w:szCs w:val="16"/>
+                    </w:rPr>
+                    <w:t xml:space="preserve">- {{BAT_UBICACION}}</w:t>
+                  </w:r>
+                </w:p>
+              </w:tc>
+            </w:tr>
+            <w:tr>
+              <w:trPr>
+                <w:trHeight w:val="262"/>
+              </w:trPr>
+              <w:tc>
+                <w:tcPr>
+                  <w:tcW w:w="2128" w:type="dxa"/>
+                  <w:tcBorders>
+                    <w:top w:val="single" w:sz="7" w:space="0" w:color="D3D3D3"/>
+                    <w:left w:val="single" w:sz="7" w:space="0" w:color="D3D3D3"/>
+                    <w:bottom w:val="single" w:sz="7" w:space="0" w:color="D3D3D3"/>
+                    <w:right w:val="single" w:sz="7" w:space="0" w:color="D3D3D3"/>
+                  </w:tcBorders>
+                  <w:tcMar>
+                    <w:top w:w="39" w:type="dxa"/>
+                    <w:left w:w="39" w:type="dxa"/>
+                    <w:bottom w:w="39" w:type="dxa"/>
+                    <w:right w:w="39" w:type="dxa"/>
+                  </w:tcMar>
+                </w:tcPr>
+                <w:p>
+                  <w:pPr>
+                    <w:spacing w:after="0" w:line="240" w:lineRule="auto"/>
+                  </w:pPr>
+                  <w:proofErr w:type="spellStart"/>
+                  <w:r>
+                    <w:rPr>
+                      <w:rFonts w:ascii="Segoe UI" w:eastAsia="Segoe UI" w:hAnsi="Segoe UI"/>
+                      <w:color w:val="000000"/>
+                      <w:sz w:val="16"/>
+                    </w:rPr>
+                    <w:t>Device</w:t>
+                  </w:r>
+                  <w:proofErr w:type="spellEnd"/>
+                  <w:r>
+                    <w:rPr>
+                      <w:rFonts w:ascii="Segoe UI" w:eastAsia="Segoe UI" w:hAnsi="Segoe UI"/>
+                      <w:color w:val="000000"/>
+                      <w:sz w:val="16"/>
+                    </w:rPr>
+                    <w:t xml:space="preserve"> </w:t>
+                  </w:r>
+                  <w:proofErr w:type="spellStart"/>
+                  <w:r>
+                    <w:rPr>
+                      <w:rFonts w:ascii="Segoe UI" w:eastAsia="Segoe UI" w:hAnsi="Segoe UI"/>
+                      <w:color w:val="000000"/>
+                      <w:sz w:val="16"/>
+                    </w:rPr>
+                    <w:t>Information</w:t>
+                  </w:r>
+                  <w:proofErr w:type="spellEnd"/>
+                </w:p>
+              </w:tc>
+              <w:tc>
+                <w:tcPr>
+                  <w:tcW w:w="7656" w:type="dxa"/>
+                  <w:tcBorders>
+                    <w:top w:val="single" w:sz="7" w:space="0" w:color="D3D3D3"/>
+                    <w:left w:val="single" w:sz="7" w:space="0" w:color="D3D3D3"/>
+                    <w:bottom w:val="single" w:sz="7" w:space="0" w:color="D3D3D3"/>
+                    <w:right w:val="single" w:sz="7" w:space="0" w:color="D3D3D3"/>
+                  </w:tcBorders>
+                  <w:shd w:val="clear" w:color="auto" w:fill="auto"/>
+                  <w:tcMar>
+                    <w:top w:w="39" w:type="dxa"/>
+                    <w:left w:w="39" w:type="dxa"/>
+                    <w:bottom w:w="39" w:type="dxa"/>
+                    <w:right w:w="39" w:type="dxa"/>
+                  </w:tcMar>
+                </w:tcPr>
+                <w:p>
+                  <w:pPr>
+                    <w:spacing w:after="0" w:line="240" w:lineRule="auto"/>
+                    <w:rPr>
+                      <w:sz w:val="16"/>
+                      <w:szCs w:val="16"/>
+                    </w:rPr>
+                  </w:pPr>
+                  <w:r>
+                    <w:rPr>
+                      <w:rFonts w:ascii="Segoe UI" w:eastAsia="Segoe UI" w:hAnsi="Segoe UI"/>
+                      <w:color w:val="000000"/>
+                      <w:sz w:val="16"/>
+                      <w:szCs w:val="16"/>
+                    </w:rPr>
+                    <w:t xml:space="preserve">- {{MODELO_BATERIAS}}</w:t>
+                  </w:r>
+                  <w:r>
+                    <w:rPr>
+                      <w:rFonts w:ascii="Segoe UI" w:eastAsia="Segoe UI" w:hAnsi="Segoe UI"/>
+                      <w:color w:val="000000"/>
+                      <w:sz w:val="16"/>
+                      <w:szCs w:val="16"/>
+                    </w:rPr>
+                    <w:t xml:space="preserve"/>
+                  </w:r>
+                </w:p>
+              </w:tc>
+            </w:tr>
+            <w:tr>
+              <w:trPr>
+                <w:trHeight w:val="262"/>
+              </w:trPr>
+              <w:tc>
+                <w:tcPr>
+                  <w:tcW w:w="2128" w:type="dxa"/>
+                  <w:tcBorders>
+                    <w:top w:val="single" w:sz="7" w:space="0" w:color="D3D3D3"/>
+                    <w:left w:val="single" w:sz="7" w:space="0" w:color="D3D3D3"/>
+                    <w:bottom w:val="single" w:sz="7" w:space="0" w:color="D3D3D3"/>
+                    <w:right w:val="single" w:sz="7" w:space="0" w:color="D3D3D3"/>
+                  </w:tcBorders>
+                  <w:tcMar>
+                    <w:top w:w="39" w:type="dxa"/>
+                    <w:left w:w="39" w:type="dxa"/>
+                    <w:bottom w:w="39" w:type="dxa"/>
+                    <w:right w:w="39" w:type="dxa"/>
+                  </w:tcMar>
+                </w:tcPr>
+                <w:p>
+                  <w:pPr>
+                    <w:spacing w:after="0" w:line="240" w:lineRule="auto"/>
+                  </w:pPr>
+                  <w:proofErr w:type="spellStart"/>
+                  <w:r>
+                    <w:rPr>
+                      <w:rFonts w:ascii="Segoe UI" w:eastAsia="Segoe UI" w:hAnsi="Segoe UI"/>
+                      <w:color w:val="000000"/>
+                      <w:sz w:val="16"/>
+                    </w:rPr>
+                    <w:t>Battery</w:t>
+                  </w:r>
+                  <w:proofErr w:type="spellEnd"/>
+                  <w:r>
+                    <w:rPr>
+                      <w:rFonts w:ascii="Segoe UI" w:eastAsia="Segoe UI" w:hAnsi="Segoe UI"/>
+                      <w:color w:val="000000"/>
+                      <w:sz w:val="16"/>
+                    </w:rPr>
+                    <w:t xml:space="preserve"> </w:t>
+                  </w:r>
+                  <w:proofErr w:type="spellStart"/>
+                  <w:r>
+                    <w:rPr>
+                      <w:rFonts w:ascii="Segoe UI" w:eastAsia="Segoe UI" w:hAnsi="Segoe UI"/>
+                      <w:color w:val="000000"/>
+                      <w:sz w:val="16"/>
+                    </w:rPr>
+                    <w:t>Number</w:t>
+                  </w:r>
+                  <w:proofErr w:type="spellEnd"/>
+                </w:p>
+              </w:tc>
+              <w:tc>
+                <w:tcPr>
+                  <w:tcW w:w="7656" w:type="dxa"/>
+                  <w:tcBorders>
+                    <w:top w:val="single" w:sz="7" w:space="0" w:color="D3D3D3"/>
+                    <w:left w:val="single" w:sz="7" w:space="0" w:color="D3D3D3"/>
+                    <w:bottom w:val="single" w:sz="7" w:space="0" w:color="D3D3D3"/>
+                    <w:right w:val="single" w:sz="7" w:space="0" w:color="D3D3D3"/>
+                  </w:tcBorders>
+                  <w:shd w:val="clear" w:color="auto" w:fill="auto"/>
+                  <w:tcMar>
+                    <w:top w:w="39" w:type="dxa"/>
+                    <w:left w:w="39" w:type="dxa"/>
+                    <w:bottom w:w="39" w:type="dxa"/>
+                    <w:right w:w="39" w:type="dxa"/>
+                  </w:tcMar>
+                </w:tcPr>
+                <w:p>
+                  <w:pPr>
+                    <w:spacing w:after="0" w:line="240" w:lineRule="auto"/>
+                    <w:rPr>
+                      <w:sz w:val="16"/>
+                      <w:szCs w:val="16"/>
+                    </w:rPr>
+                  </w:pPr>
+                  <w:r>
+                    <w:rPr>
+                      <w:sz w:val="16"/>
+                      <w:szCs w:val="16"/>
+                    </w:rPr>
+                    <w:t xml:space="preserve">- {{CANT_BATERIAS}}</w:t>
+                  </w:r>
+                  <w:r>
+                    <w:rPr>
+                      <w:sz w:val="16"/>
+                      <w:szCs w:val="16"/>
+                    </w:rPr>
+                    <w:t xml:space="preserve"/>
+                  </w:r>
+                </w:p>
+              </w:tc>
+            </w:tr>
+            <w:tr>
+              <w:trPr>
+                <w:trHeight w:val="262"/>
+              </w:trPr>
+              <w:tc>
+                <w:tcPr>
+                  <w:tcW w:w="2128" w:type="dxa"/>
+                  <w:tcBorders>
+                    <w:top w:val="single" w:sz="7" w:space="0" w:color="D3D3D3"/>
+                    <w:left w:val="single" w:sz="7" w:space="0" w:color="D3D3D3"/>
+                    <w:bottom w:val="single" w:sz="7" w:space="0" w:color="D3D3D3"/>
+                    <w:right w:val="single" w:sz="7" w:space="0" w:color="D3D3D3"/>
+                  </w:tcBorders>
+                  <w:tcMar>
+                    <w:top w:w="39" w:type="dxa"/>
+                    <w:left w:w="39" w:type="dxa"/>
+                    <w:bottom w:w="39" w:type="dxa"/>
+                    <w:right w:w="39" w:type="dxa"/>
+                  </w:tcMar>
+                </w:tcPr>
+                <w:p>
+                  <w:pPr>
+                    <w:spacing w:after="0" w:line="240" w:lineRule="auto"/>
+                  </w:pPr>
+                  <w:r>
+                    <w:rPr>
+                      <w:rFonts w:ascii="Segoe UI" w:eastAsia="Segoe UI" w:hAnsi="Segoe UI"/>
+                      <w:color w:val="000000"/>
+                      <w:sz w:val="16"/>
+                    </w:rPr>
+                    <w:t>Data</w:t>
+                  </w:r>
+                </w:p>
+              </w:tc>
+              <w:tc>
+                <w:tcPr>
+                  <w:tcW w:w="7656" w:type="dxa"/>
+                  <w:tcBorders>
+                    <w:top w:val="single" w:sz="7" w:space="0" w:color="D3D3D3"/>
+                    <w:left w:val="single" w:sz="7" w:space="0" w:color="D3D3D3"/>
+                    <w:bottom w:val="single" w:sz="7" w:space="0" w:color="D3D3D3"/>
+                    <w:right w:val="single" w:sz="7" w:space="0" w:color="D3D3D3"/>
+                  </w:tcBorders>
+                  <w:shd w:val="clear" w:color="auto" w:fill="auto"/>
+                  <w:tcMar>
+                    <w:top w:w="39" w:type="dxa"/>
+                    <w:left w:w="39" w:type="dxa"/>
+                    <w:bottom w:w="39" w:type="dxa"/>
+                    <w:right w:w="39" w:type="dxa"/>
+                  </w:tcMar>
+                </w:tcPr>
+                <w:p>
+                  <w:pPr>
+                    <w:spacing w:after="0" w:line="240" w:lineRule="auto"/>
+                    <w:rPr>
+                      <w:sz w:val="16"/>
+                      <w:szCs w:val="16"/>
+                    </w:rPr>
+                  </w:pPr>
+                  <w:r>
+                    <w:rPr>
+                      <w:rFonts w:ascii="Segoe UI" w:eastAsia="Segoe UI" w:hAnsi="Segoe UI"/>
+                      <w:color w:val="000000"/>
+                      <w:sz w:val="16"/>
+                      <w:szCs w:val="16"/>
+                    </w:rPr>
+                    <w:t xml:space="preserve">- {{ANIO_BATERIAS}}</w:t>
+                  </w:r>
+                  <w:r>
+                    <w:rPr>
+                      <w:rFonts w:ascii="Segoe UI" w:eastAsia="Segoe UI" w:hAnsi="Segoe UI"/>
+                      <w:color w:val="000000"/>
+                      <w:sz w:val="16"/>
+                      <w:szCs w:val="16"/>
+                    </w:rPr>
+                    <w:t xml:space="preserve"/>
+                  </w:r>
+                </w:p>
+              </w:tc>
+            </w:tr>
+          </w:tbl>
+          <w:p>
+            <w:pPr>
+              <w:spacing w:after="0" w:line="240" w:lineRule="auto"/>
+            </w:pPr>
+          </w:p>
+        </w:tc>
+      </w:tr>
+      <w:tr>
+        <w:trPr>
+          <w:trHeight w:val="56"/>
+        </w:trPr>
+        <w:tc>
+          <w:tcPr>
+            <w:tcW w:w="215" w:type="dxa"/>
+            <w:vMerge/>
+          </w:tcPr>
+          <w:p>
+            <w:pPr>
+              <w:spacing w:after="0" w:line="240" w:lineRule="auto"/>
+            </w:pPr>
+          </w:p>
+        </w:tc>
+        <w:tc>
+          <w:tcPr>
+            <w:tcW w:w="9762" w:type="dxa"/>
+          </w:tcPr>
+          <w:p>
+            <w:pPr>
+              <w:spacing w:after="0" w:line="240" w:lineRule="auto"/>
+            </w:pPr>
+          </w:p>
+        </w:tc>
+        <w:tc>
+          <w:tcPr>
+            <w:tcW w:w="22" w:type="dxa"/>
+          </w:tcPr>
+          <w:p>
+            <w:pPr>
+              <w:spacing w:after="0" w:line="240" w:lineRule="auto"/>
+            </w:pPr>
+          </w:p>
+        </w:tc>
+      </w:tr>
+      <w:tr>
+        <w:tc>
+          <w:tcPr>
+            <w:tcW w:w="215" w:type="dxa"/>
+            <w:vMerge/>
+          </w:tcPr>
+          <w:p>
+            <w:pPr>
+              <w:spacing w:after="0" w:line="240" w:lineRule="auto"/>
+            </w:pPr>
+          </w:p>
+        </w:tc>
+        <w:tc>
+          <w:tcPr>
+            <w:tcW w:w="9762" w:type="dxa"/>
+            <w:gridSpan w:val="2"/>
+          </w:tcPr>
+          <w:tbl>
+            <w:tblPr>
+              <w:tblW w:w="5000" w:type="pct"/>
+              <w:tblBorders>
+                <w:top w:val="nil"/>
+                <w:left w:val="nil"/>
+                <w:bottom w:val="nil"/>
+                <w:right w:val="nil"/>
+              </w:tblBorders>
+              <w:tblCellMar>
+                <w:left w:w="0" w:type="dxa"/>
+                <w:right w:w="0" w:type="dxa"/>
+              </w:tblCellMar>
+              <w:tblLook w:val="0000" w:firstRow="0" w:lastRow="0" w:firstColumn="0" w:lastColumn="0" w:noHBand="0" w:noVBand="0"/>
+            </w:tblPr>
+            <w:tblGrid>
+              <w:gridCol w:w="2512"/>
+              <w:gridCol w:w="2025"/>
+              <w:gridCol w:w="1191"/>
+              <w:gridCol w:w="1136"/>
+              <w:gridCol w:w="2009"/>
+            </w:tblGrid>
+            <w:tr>
+              <w:trPr>
+                <w:trHeight w:val="20"/>
+              </w:trPr>
+              <w:tc>
+                <w:tcPr>
+                  <w:tcW w:w="1416" w:type="pct"/>
+                  <w:tcBorders>
+                    <w:top w:val="single" w:sz="7" w:space="0" w:color="D3D3D3"/>
+                    <w:left w:val="single" w:sz="7" w:space="0" w:color="D3D3D3"/>
+                    <w:bottom w:val="single" w:sz="7" w:space="0" w:color="D3D3D3"/>
+                    <w:right w:val="single" w:sz="7" w:space="0" w:color="D3D3D3"/>
+                  </w:tcBorders>
+                  <w:shd w:val="clear" w:color="auto" w:fill="3F52AF"/>
+                  <w:tcMar>
+                    <w:top w:w="39" w:type="dxa"/>
+                    <w:left w:w="39" w:type="dxa"/>
+                    <w:bottom w:w="39" w:type="dxa"/>
+                    <w:right w:w="39" w:type="dxa"/>
+                  </w:tcMar>
+                </w:tcPr>
+                <w:p>
+                  <w:pPr>
+                    <w:spacing w:after="0" w:line="240" w:lineRule="auto"/>
+                    <w:jc w:val="left"/>
+                  </w:pPr>
+                  <w:proofErr w:type="spellStart"/>
+                  <w:r>
+                    <w:rPr>
+                      <w:rFonts w:ascii="Segoe UI" w:eastAsia="Segoe UI" w:hAnsi="Segoe UI"/>
+                      <w:color w:val="FFFFFF"/>
+                      <w:sz w:val="16"/>
+                    </w:rPr>
+                    <w:t>Judgement</w:t>
+                  </w:r>
+                  <w:proofErr w:type="spellEnd"/>
+                </w:p>
+              </w:tc>
+              <w:tc>
+                <w:tcPr>
+                  <w:tcW w:w="1141" w:type="pct"/>
+                  <w:tcBorders>
+                    <w:top w:val="single" w:sz="7" w:space="0" w:color="D3D3D3"/>
+                    <w:left w:val="single" w:sz="7" w:space="0" w:color="D3D3D3"/>
+                    <w:bottom w:val="single" w:sz="7" w:space="0" w:color="D3D3D3"/>
+                    <w:right w:val="single" w:sz="7" w:space="0" w:color="D3D3D3"/>
+                  </w:tcBorders>
+                  <w:shd w:val="clear" w:color="auto" w:fill="3F52AF"/>
+                  <w:tcMar>
+                    <w:top w:w="39" w:type="dxa"/>
+                    <w:left w:w="39" w:type="dxa"/>
+                    <w:bottom w:w="39" w:type="dxa"/>
+                    <w:right w:w="39" w:type="dxa"/>
+                  </w:tcMar>
+                </w:tcPr>
+                <w:p>
+                  <w:pPr>
+                    <w:spacing w:after="0" w:line="240" w:lineRule="auto"/>
+                    <w:jc w:val="left"/>
+                    <w:rPr>
+                      <w:color w:val="FFFFFF"/>
+                    </w:rPr>
+                  </w:pPr>
+                  <w:proofErr w:type="spellStart"/>
+                  <w:r>
+                    <w:rPr>
+                      <w:rFonts w:ascii="Segoe UI" w:eastAsia="Segoe UI" w:hAnsi="Segoe UI"/>
+                      <w:color w:val="FFFFFF"/>
+                      <w:sz w:val="16"/>
+                    </w:rPr>
+                    <w:t>M</w:t>
+                  </w:r>
+                  <w:r>
+                    <w:rPr>
+                      <w:rFonts w:ascii="Segoe UI" w:eastAsia="Segoe UI" w:hAnsi="Segoe UI"/>
+                      <w:color w:val="FFFFFF"/>
+                      <w:sz w:val="16"/>
+                    </w:rPr>
+                    <w:t>easurement</w:t>
+                  </w:r>
+                  <w:proofErr w:type="spellEnd"/>
+                </w:p>
+              </w:tc>
+              <w:tc>
+                <w:tcPr>
+                  <w:tcW w:w="671" w:type="pct"/>
+                  <w:tcBorders>
+                    <w:top w:val="single" w:sz="7" w:space="0" w:color="D3D3D3"/>
+                    <w:left w:val="single" w:sz="7" w:space="0" w:color="D3D3D3"/>
+                    <w:bottom w:val="single" w:sz="7" w:space="0" w:color="D3D3D3"/>
+                    <w:right w:val="single" w:sz="7" w:space="0" w:color="D3D3D3"/>
+                  </w:tcBorders>
+                  <w:shd w:val="clear" w:color="auto" w:fill="3F52AF"/>
+                  <w:tcMar>
+                    <w:top w:w="39" w:type="dxa"/>
+                    <w:left w:w="39" w:type="dxa"/>
+                    <w:bottom w:w="39" w:type="dxa"/>
+                    <w:right w:w="39" w:type="dxa"/>
+                  </w:tcMar>
+                </w:tcPr>
+                <w:p>
+                  <w:pPr>
+                    <w:spacing w:after="0" w:line="240" w:lineRule="auto"/>
+                    <w:ind w:left="25"/>
+                    <w:jc w:val="left"/>
+                  </w:pPr>
+                  <w:proofErr w:type="spellStart"/>
+                  <w:r>
+                    <w:rPr>
+                      <w:rFonts w:ascii="Segoe UI" w:eastAsia="Segoe UI" w:hAnsi="Segoe UI"/>
+                      <w:color w:val="FFFFFF"/>
+                      <w:sz w:val="16"/>
+                    </w:rPr>
+                    <w:t>Resistance</w:t>
+                  </w:r>
+                  <w:proofErr w:type="spellEnd"/>
+                </w:p>
+              </w:tc>
+              <w:tc>
+                <w:tcPr>
+                  <w:tcW w:w="640" w:type="pct"/>
+                  <w:tcBorders>
+                    <w:top w:val="single" w:sz="7" w:space="0" w:color="D3D3D3"/>
+                    <w:left w:val="single" w:sz="7" w:space="0" w:color="D3D3D3"/>
+                    <w:bottom w:val="single" w:sz="7" w:space="0" w:color="D3D3D3"/>
+                    <w:right w:val="single" w:sz="7" w:space="0" w:color="D3D3D3"/>
+                  </w:tcBorders>
+                  <w:shd w:val="clear" w:color="auto" w:fill="3F52AF"/>
+                  <w:tcMar>
+                    <w:top w:w="39" w:type="dxa"/>
+                    <w:left w:w="39" w:type="dxa"/>
+                    <w:bottom w:w="39" w:type="dxa"/>
+                    <w:right w:w="39" w:type="dxa"/>
+                  </w:tcMar>
+                </w:tcPr>
+                <w:p>
+                  <w:pPr>
+                    <w:spacing w:after="0" w:line="240" w:lineRule="auto"/>
+                    <w:jc w:val="left"/>
+                  </w:pPr>
+                  <w:r>
+                    <w:rPr>
+                      <w:rFonts w:ascii="Segoe UI" w:eastAsia="Segoe UI" w:hAnsi="Segoe UI"/>
+                      <w:color w:val="FFFFFF"/>
+                      <w:sz w:val="16"/>
+                    </w:rPr>
+                    <w:t>Total</w:t>
+                  </w:r>
+                </w:p>
+              </w:tc>
+              <w:tc>
+                <w:tcPr>
+                  <w:tcW w:w="1133" w:type="pct"/>
+                  <w:tcBorders>
+                    <w:top w:val="single" w:sz="7" w:space="0" w:color="D3D3D3"/>
+                    <w:left w:val="single" w:sz="7" w:space="0" w:color="D3D3D3"/>
+                    <w:bottom w:val="single" w:sz="7" w:space="0" w:color="D3D3D3"/>
+                    <w:right w:val="single" w:sz="7" w:space="0" w:color="D3D3D3"/>
+                  </w:tcBorders>
+                  <w:shd w:val="clear" w:color="auto" w:fill="3F52AF"/>
+                  <w:tcMar>
+                    <w:top w:w="39" w:type="dxa"/>
+                    <w:left w:w="39" w:type="dxa"/>
+                    <w:bottom w:w="39" w:type="dxa"/>
+                    <w:right w:w="39" w:type="dxa"/>
+                  </w:tcMar>
+                </w:tcPr>
+                <w:p>
+                  <w:pPr>
+                    <w:spacing w:after="0" w:line="240" w:lineRule="auto"/>
+                    <w:jc w:val="left"/>
+                  </w:pPr>
+                  <w:proofErr w:type="spellStart"/>
+                  <w:r>
+                    <w:rPr>
+                      <w:rFonts w:ascii="Segoe UI" w:eastAsia="Segoe UI" w:hAnsi="Segoe UI"/>
+                      <w:color w:val="FFFFFF"/>
+                      <w:sz w:val="16"/>
+                    </w:rPr>
+                    <w:t>B</w:t>
+                  </w:r>
+                  <w:r>
+                    <w:rPr>
+                      <w:rFonts w:ascii="Segoe UI" w:eastAsia="Segoe UI" w:hAnsi="Segoe UI"/>
+                      <w:color w:val="FFFFFF"/>
+                      <w:sz w:val="16"/>
+                    </w:rPr>
+                    <w:t>attery</w:t>
+                  </w:r>
+                  <w:proofErr w:type="spellEnd"/>
+                  <w:r>
+                    <w:rPr>
+                      <w:rFonts w:ascii="Segoe UI" w:eastAsia="Segoe UI" w:hAnsi="Segoe UI"/>
+                      <w:color w:val="FFFFFF"/>
+                      <w:sz w:val="16"/>
+                    </w:rPr>
+                    <w:t xml:space="preserve"> </w:t>
+                  </w:r>
+                  <w:proofErr w:type="gramStart"/>
+                  <w:r>
+                    <w:rPr>
+                      <w:rFonts w:ascii="Segoe UI" w:eastAsia="Segoe UI" w:hAnsi="Segoe UI"/>
+                      <w:color w:val="FFFFFF"/>
+                      <w:sz w:val="16"/>
+                    </w:rPr>
+                    <w:t>status</w:t>
+                  </w:r>
+                  <w:proofErr w:type="gramEnd"/>
+                </w:p>
+              </w:tc>
+            </w:tr>
+            <w:tr>
+              <w:trPr>
+                <w:trHeight w:val="20"/>
+              </w:trPr>
+              <w:tc>
+                <w:tcPr>
+                  <w:tcW w:w="1416" w:type="pct"/>
+                  <w:tcBorders>
+                    <w:top w:val="single" w:sz="7" w:space="0" w:color="D3D3D3"/>
+                    <w:left w:val="single" w:sz="7" w:space="0" w:color="D3D3D3"/>
+                    <w:bottom w:val="single" w:sz="7" w:space="0" w:color="D3D3D3"/>
+                    <w:right w:val="single" w:sz="7" w:space="0" w:color="D3D3D3"/>
+                  </w:tcBorders>
+                  <w:shd w:val="clear" w:color="auto" w:fill="00B050"/>
+                  <w:tcMar>
+                    <w:top w:w="39" w:type="dxa"/>
+                    <w:left w:w="39" w:type="dxa"/>
+                    <w:bottom w:w="39" w:type="dxa"/>
+                    <w:right w:w="39" w:type="dxa"/>
+                  </w:tcMar>
+                </w:tcPr>
+                <w:p>
+                  <w:pPr>
+                    <w:spacing w:after="0" w:line="240" w:lineRule="auto"/>
+                    <w:rPr>
+                      <w:rFonts w:ascii="Segoe UI" w:hAnsi="Segoe UI" w:cs="Segoe UI"/>
+                    </w:rPr>
+                  </w:pPr>
+                  <w:r>
+                    <w:rPr>
+                      <w:rFonts w:ascii="Segoe UI" w:eastAsia="Segoe UI" w:hAnsi="Segoe UI" w:cs="Segoe UI"/>
+                      <w:color w:val="000000"/>
+                      <w:sz w:val="16"/>
+                    </w:rPr>
+                    <w:t xml:space="preserve">Pass </w:t>
+                  </w:r>
+                </w:p>
+              </w:tc>
+              <w:tc>
+                <w:tcPr>
+                  <w:tcW w:w="1141" w:type="pct"/>
+                  <w:tcBorders>
+                    <w:top w:val="single" w:sz="7" w:space="0" w:color="D3D3D3"/>
+                    <w:left w:val="single" w:sz="7" w:space="0" w:color="D3D3D3"/>
+                    <w:bottom w:val="single" w:sz="7" w:space="0" w:color="D3D3D3"/>
+                    <w:right w:val="single" w:sz="7" w:space="0" w:color="D3D3D3"/>
+                  </w:tcBorders>
+                  <w:tcMar>
+                    <w:top w:w="39" w:type="dxa"/>
+                    <w:left w:w="39" w:type="dxa"/>
+                    <w:bottom w:w="39" w:type="dxa"/>
+                    <w:right w:w="39" w:type="dxa"/>
+                  </w:tcMar>
+                </w:tcPr>
+                <w:p>
+                  <w:pPr>
+                    <w:spacing w:after="0" w:line="240" w:lineRule="auto"/>
+                    <w:rPr>
+                      <w:rFonts w:ascii="Segoe UI" w:hAnsi="Segoe UI" w:cs="Segoe UI"/>
+                    </w:rPr>
+                  </w:pPr>
+                  <w:proofErr w:type="spellStart"/>
+                  <w:r>
+                    <w:rPr>
+                      <w:rFonts w:ascii="Segoe UI" w:eastAsia="Segoe UI" w:hAnsi="Segoe UI" w:cs="Segoe UI"/>
+                      <w:color w:val="000000"/>
+                      <w:sz w:val="16"/>
+                    </w:rPr>
+                    <w:t>Resistance</w:t>
+                  </w:r>
+                  <w:proofErr w:type="spellEnd"/>
+                  <w:r>
+                    <w:rPr>
+                      <w:rFonts w:ascii="Segoe UI" w:eastAsia="Segoe UI" w:hAnsi="Segoe UI" w:cs="Segoe UI"/>
+                      <w:color w:val="000000"/>
+                      <w:sz w:val="16"/>
+                    </w:rPr>
+                    <w:t xml:space="preserve"> </w:t>
+                  </w:r>
+                </w:p>
+              </w:tc>
+              <w:tc>
+                <w:tcPr>
+                  <w:tcW w:w="671" w:type="pct"/>
+                  <w:tcBorders>
+                    <w:top w:val="single" w:sz="7" w:space="0" w:color="D3D3D3"/>
+                    <w:left w:val="single" w:sz="7" w:space="0" w:color="D3D3D3"/>
+                    <w:bottom w:val="single" w:sz="7" w:space="0" w:color="D3D3D3"/>
+                    <w:right w:val="single" w:sz="7" w:space="0" w:color="D3D3D3"/>
+                  </w:tcBorders>
+                  <w:tcMar>
+                    <w:top w:w="39" w:type="dxa"/>
+                    <w:left w:w="39" w:type="dxa"/>
+                    <w:bottom w:w="39" w:type="dxa"/>
+                    <w:right w:w="39" w:type="dxa"/>
+                  </w:tcMar>
+                </w:tcPr>
+                <w:p>
+                  <w:pPr>
+                    <w:spacing w:after="0" w:line="240" w:lineRule="auto"/>
+                    <w:jc w:val="center"/>
+                    <w:rPr>
+                      <w:rFonts w:ascii="Segoe UI" w:eastAsia="Segoe UI" w:hAnsi="Segoe UI" w:cs="Segoe UI"/>
+                      <w:color w:val="000000"/>
+                      <w:sz w:val="16"/>
+                    </w:rPr>
+                  </w:pPr>
+                  <w:r>
+                    <w:rPr>
+                      <w:rFonts w:ascii="Segoe UI" w:eastAsia="Segoe UI" w:hAnsi="Segoe UI" w:cs="Segoe UI"/>
+                      <w:color w:val="000000"/>
+                      <w:sz w:val="16"/>
+                    </w:rPr>
+                    <w:t xml:space="preserve">{{BAT_RES_PASS}} </w:t>
+                  </w:r>
+                  <w:r>
+                    <w:rPr>
+                      <w:rFonts w:ascii="Segoe UI" w:eastAsia="Segoe UI" w:hAnsi="Segoe UI" w:cs="Segoe UI"/>
+                      <w:color w:val="000000"/>
+                      <w:sz w:val="16"/>
+                    </w:rPr>
+                    <w:t>m</w:t>
+                  </w:r>
+                  <w:r>
+                    <w:rPr>
+                      <w:rFonts w:ascii="Segoe UI" w:hAnsi="Segoe UI" w:cs="Segoe UI"/>
+                    </w:rPr>
+                    <w:t xml:space="preserve"> </w:t>
+                  </w:r>
+                  <w:r>
+                    <w:rPr>
+                      <w:rFonts w:ascii="Segoe UI" w:eastAsia="Segoe UI" w:hAnsi="Segoe UI" w:cs="Segoe UI"/>
+                      <w:color w:val="000000"/>
+                      <w:sz w:val="16"/>
+                    </w:rPr>
+                    <w:t>Ω</w:t>
+                  </w:r>
+                </w:p>
+              </w:tc>
+              <w:tc>
+                <w:tcPr>
+                  <w:tcW w:w="640" w:type="pct"/>
+                  <w:tcBorders>
+                    <w:top w:val="single" w:sz="7" w:space="0" w:color="D3D3D3"/>
+                    <w:left w:val="single" w:sz="7" w:space="0" w:color="D3D3D3"/>
+                    <w:bottom w:val="single" w:sz="7" w:space="0" w:color="D3D3D3"/>
+                    <w:right w:val="single" w:sz="7" w:space="0" w:color="D3D3D3"/>
+                  </w:tcBorders>
+                  <w:tcMar>
+                    <w:top w:w="39" w:type="dxa"/>
+                    <w:left w:w="39" w:type="dxa"/>
+                    <w:bottom w:w="39" w:type="dxa"/>
+                    <w:right w:w="39" w:type="dxa"/>
+                  </w:tcMar>
+                </w:tcPr>
+                <w:p>
+                  <w:pPr>
+                    <w:jc w:val="center"/>
+                    <w:rPr>
+                      <w:rFonts w:ascii="Segoe UI" w:hAnsi="Segoe UI" w:cs="Segoe UI"/>
+                      <w:sz w:val="16"/>
+                      <w:szCs w:val="16"/>
+                    </w:rPr>
+                  </w:pPr>
+                  <w:r>
+                    <w:rPr>
+                      <w:rFonts w:ascii="Segoe UI" w:hAnsi="Segoe UI" w:cs="Segoe UI"/>
+                      <w:sz w:val="16"/>
+                      <w:szCs w:val="16"/>
+                    </w:rPr>
+                    <w:t xml:space="preserve">{{BAT_TOTAL_PASS}}</w:t>
+                  </w:r>
+                </w:p>
+              </w:tc>
+              <w:tc>
+                <w:tcPr>
+                  <w:tcW w:w="1133" w:type="pct"/>
+                  <w:tcBorders>
+                    <w:top w:val="single" w:sz="7" w:space="0" w:color="D3D3D3"/>
+                    <w:left w:val="single" w:sz="7" w:space="0" w:color="D3D3D3"/>
+                    <w:bottom w:val="single" w:sz="7" w:space="0" w:color="D3D3D3"/>
+                    <w:right w:val="single" w:sz="7" w:space="0" w:color="D3D3D3"/>
+                  </w:tcBorders>
+                  <w:tcMar>
+                    <w:top w:w="39" w:type="dxa"/>
+                    <w:left w:w="39" w:type="dxa"/>
+                    <w:bottom w:w="39" w:type="dxa"/>
+                    <w:right w:w="39" w:type="dxa"/>
+                  </w:tcMar>
+                </w:tcPr>
+                <w:p>
+                  <w:pPr>
+                    <w:jc w:val="center"/>
+                    <w:rPr>
+                      <w:rFonts w:ascii="Segoe UI" w:hAnsi="Segoe UI" w:cs="Segoe UI"/>
+                    </w:rPr>
+                  </w:pPr>
+                  <w:r>
+                    <w:rPr>
+                      <w:rFonts w:ascii="Segoe UI" w:eastAsia="Segoe UI" w:hAnsi="Segoe UI" w:cs="Segoe UI"/>
+                      <w:color w:val="000000"/>
+                      <w:sz w:val="16"/>
+                    </w:rPr>
+                    <w:t>Normal</w:t>
+                  </w:r>
+                </w:p>
+              </w:tc>
+            </w:tr>
+            <w:tr>
+              <w:trPr>
+                <w:trHeight w:val="20"/>
+              </w:trPr>
+              <w:tc>
+                <w:tcPr>
+                  <w:tcW w:w="1416" w:type="pct"/>
+                  <w:tcBorders>
+                    <w:top w:val="single" w:sz="7" w:space="0" w:color="D3D3D3"/>
+                    <w:left w:val="single" w:sz="7" w:space="0" w:color="D3D3D3"/>
+                    <w:bottom w:val="single" w:sz="7" w:space="0" w:color="D3D3D3"/>
+                    <w:right w:val="single" w:sz="7" w:space="0" w:color="D3D3D3"/>
+                  </w:tcBorders>
+                  <w:shd w:val="clear" w:color="auto" w:fill="FFFF00"/>
+                  <w:tcMar>
+                    <w:top w:w="39" w:type="dxa"/>
+                    <w:left w:w="39" w:type="dxa"/>
+                    <w:bottom w:w="39" w:type="dxa"/>
+                    <w:right w:w="39" w:type="dxa"/>
+                  </w:tcMar>
+                </w:tcPr>
+                <w:p>
+                  <w:pPr>
+                    <w:spacing w:after="0" w:line="240" w:lineRule="auto"/>
+                    <w:rPr>
+                      <w:rFonts w:ascii="Segoe UI" w:hAnsi="Segoe UI" w:cs="Segoe UI"/>
+                    </w:rPr>
+                  </w:pPr>
+                  <w:proofErr w:type="spellStart"/>
+                  <w:r>
+                    <w:rPr>
+                      <w:rFonts w:ascii="Segoe UI" w:eastAsia="Segoe UI" w:hAnsi="Segoe UI" w:cs="Segoe UI"/>
+                      <w:color w:val="000000"/>
+                      <w:sz w:val="16"/>
+                    </w:rPr>
+                    <w:t>Warning</w:t>
+                  </w:r>
+                  <w:proofErr w:type="spellEnd"/>
+                  <w:r>
+                    <w:rPr>
+                      <w:rFonts w:ascii="Segoe UI" w:eastAsia="Segoe UI" w:hAnsi="Segoe UI" w:cs="Segoe UI"/>
+                      <w:color w:val="000000"/>
+                      <w:sz w:val="16"/>
+                    </w:rPr>
+                    <w:t xml:space="preserve"> (20%&lt;30% Desviación)</w:t>
+                  </w:r>
+                </w:p>
+              </w:tc>
+              <w:tc>
+                <w:tcPr>
+                  <w:tcW w:w="1141" w:type="pct"/>
+                  <w:tcBorders>
+                    <w:top w:val="single" w:sz="7" w:space="0" w:color="D3D3D3"/>
+                    <w:left w:val="single" w:sz="7" w:space="0" w:color="D3D3D3"/>
+                    <w:bottom w:val="single" w:sz="7" w:space="0" w:color="D3D3D3"/>
+                    <w:right w:val="single" w:sz="7" w:space="0" w:color="D3D3D3"/>
+                  </w:tcBorders>
+                  <w:tcMar>
+                    <w:top w:w="39" w:type="dxa"/>
+                    <w:left w:w="39" w:type="dxa"/>
+                    <w:bottom w:w="39" w:type="dxa"/>
+                    <w:right w:w="39" w:type="dxa"/>
+                  </w:tcMar>
+                </w:tcPr>
+                <w:p>
+                  <w:pPr>
+                    <w:spacing w:after="0" w:line="240" w:lineRule="auto"/>
+                    <w:rPr>
+                      <w:rFonts w:ascii="Segoe UI" w:hAnsi="Segoe UI" w:cs="Segoe UI"/>
+                    </w:rPr>
+                  </w:pPr>
+                  <w:proofErr w:type="spellStart"/>
+                  <w:r>
+                    <w:rPr>
+                      <w:rFonts w:ascii="Segoe UI" w:eastAsia="Segoe UI" w:hAnsi="Segoe UI" w:cs="Segoe UI"/>
+                      <w:color w:val="000000"/>
+                      <w:sz w:val="16"/>
+                    </w:rPr>
+                    <w:t>Resistance</w:t>
+                  </w:r>
+                  <w:proofErr w:type="spellEnd"/>
+                </w:p>
+              </w:tc>
+              <w:tc>
+                <w:tcPr>
+                  <w:tcW w:w="671" w:type="pct"/>
+                  <w:tcBorders>
+                    <w:top w:val="single" w:sz="7" w:space="0" w:color="D3D3D3"/>
+                    <w:left w:val="single" w:sz="7" w:space="0" w:color="D3D3D3"/>
+                    <w:bottom w:val="single" w:sz="7" w:space="0" w:color="D3D3D3"/>
+                    <w:right w:val="single" w:sz="7" w:space="0" w:color="D3D3D3"/>
+                  </w:tcBorders>
+                  <w:shd w:val="clear" w:color="auto" w:fill="FFFFFF"/>
+                  <w:tcMar>
+                    <w:top w:w="39" w:type="dxa"/>
+                    <w:left w:w="39" w:type="dxa"/>
+                    <w:bottom w:w="39" w:type="dxa"/>
+                    <w:right w:w="39" w:type="dxa"/>
+                  </w:tcMar>
+                </w:tcPr>
+                <w:p>
+                  <w:pPr>
+                    <w:spacing w:after="0" w:line="240" w:lineRule="auto"/>
+                    <w:jc w:val="center"/>
+                    <w:rPr>
+                      <w:rFonts w:ascii="Segoe UI" w:eastAsia="Segoe UI" w:hAnsi="Segoe UI" w:cs="Segoe UI"/>
+                      <w:color w:val="000000"/>
+                      <w:sz w:val="16"/>
+                    </w:rPr>
+                  </w:pPr>
+                  <w:r>
+                    <w:rPr>
+                      <w:rFonts w:ascii="Segoe UI" w:eastAsia="Segoe UI" w:hAnsi="Segoe UI" w:cs="Segoe UI"/>
+                      <w:color w:val="000000"/>
+                      <w:sz w:val="16"/>
+                    </w:rPr>
+                    <w:t xml:space="preserve">{{BAT_RES_WARNING}} </w:t>
+                  </w:r>
+                  <w:r>
+                    <w:rPr>
+                      <w:rFonts w:ascii="Segoe UI" w:eastAsia="Segoe UI" w:hAnsi="Segoe UI" w:cs="Segoe UI"/>
+                      <w:color w:val="000000"/>
+                      <w:sz w:val="16"/>
+                    </w:rPr>
+                    <w:t>m</w:t>
+                  </w:r>
+                  <w:r>
+                    <w:rPr>
+                      <w:rFonts w:ascii="Segoe UI" w:hAnsi="Segoe UI" w:cs="Segoe UI"/>
+                    </w:rPr>
+                    <w:t xml:space="preserve"> </w:t>
+                  </w:r>
+                  <w:r>
+                    <w:rPr>
+                      <w:rFonts w:ascii="Segoe UI" w:eastAsia="Segoe UI" w:hAnsi="Segoe UI" w:cs="Segoe UI"/>
+                      <w:color w:val="000000"/>
+                      <w:sz w:val="16"/>
+                    </w:rPr>
+                    <w:t>Ω</w:t>
+                  </w:r>
+                </w:p>
+              </w:tc>
+              <w:tc>
+                <w:tcPr>
+                  <w:tcW w:w="640" w:type="pct"/>
+                  <w:tcBorders>
+                    <w:top w:val="single" w:sz="7" w:space="0" w:color="D3D3D3"/>
+                    <w:left w:val="single" w:sz="7" w:space="0" w:color="D3D3D3"/>
+                    <w:bottom w:val="single" w:sz="7" w:space="0" w:color="D3D3D3"/>
+                    <w:right w:val="single" w:sz="7" w:space="0" w:color="D3D3D3"/>
+                  </w:tcBorders>
+                  <w:shd w:val="clear" w:color="auto" w:fill="FFFFFF"/>
+                  <w:tcMar>
+                    <w:top w:w="39" w:type="dxa"/>
+                    <w:left w:w="39" w:type="dxa"/>
+                    <w:bottom w:w="39" w:type="dxa"/>
+                    <w:right w:w="39" w:type="dxa"/>
+                  </w:tcMar>
+                </w:tcPr>
+                <w:p>
+                  <w:pPr>
+                    <w:jc w:val="center"/>
+                    <w:rPr>
+                      <w:rFonts w:ascii="Segoe UI" w:hAnsi="Segoe UI" w:cs="Segoe UI"/>
+                      <w:sz w:val="16"/>
+                      <w:szCs w:val="16"/>
+                    </w:rPr>
+                  </w:pPr>
+                  <w:r>
+                    <w:rPr>
+                      <w:rFonts w:ascii="Segoe UI" w:hAnsi="Segoe UI" w:cs="Segoe UI"/>
+                      <w:sz w:val="16"/>
+                      <w:szCs w:val="16"/>
+                    </w:rPr>
+                    <w:t xml:space="preserve">{{BAT_TOTAL_WARNING}}</w:t>
+                  </w:r>
+                </w:p>
+              </w:tc>
+              <w:tc>
+                <w:tcPr>
+                  <w:tcW w:w="1133" w:type="pct"/>
+                  <w:tcBorders>
+                    <w:top w:val="single" w:sz="7" w:space="0" w:color="D3D3D3"/>
+                    <w:left w:val="single" w:sz="7" w:space="0" w:color="D3D3D3"/>
+                    <w:bottom w:val="single" w:sz="7" w:space="0" w:color="D3D3D3"/>
+                    <w:right w:val="single" w:sz="7" w:space="0" w:color="D3D3D3"/>
+                  </w:tcBorders>
+                  <w:shd w:val="clear" w:color="auto" w:fill="FFFFFF"/>
+                  <w:tcMar>
+                    <w:top w:w="39" w:type="dxa"/>
+                    <w:left w:w="39" w:type="dxa"/>
+                    <w:bottom w:w="39" w:type="dxa"/>
+                    <w:right w:w="39" w:type="dxa"/>
+                  </w:tcMar>
+                </w:tcPr>
+                <w:p>
+                  <w:pPr>
+                    <w:jc w:val="center"/>
+                    <w:rPr>
+                      <w:rFonts w:ascii="Segoe UI" w:hAnsi="Segoe UI" w:cs="Segoe UI"/>
+                    </w:rPr>
+                  </w:pPr>
+                  <w:r>
+                    <w:rPr>
+                      <w:rFonts w:ascii="Segoe UI" w:eastAsia="Segoe UI" w:hAnsi="Segoe UI" w:cs="Segoe UI"/>
+                      <w:color w:val="000000"/>
+                      <w:sz w:val="16"/>
+                    </w:rPr>
+                    <w:t>Con Desviación</w:t>
+                  </w:r>
+                </w:p>
+              </w:tc>
+            </w:tr>
+            <w:tr>
+              <w:trPr>
+                <w:trHeight w:val="20"/>
+              </w:trPr>
+              <w:tc>
+                <w:tcPr>
+                  <w:tcW w:w="1416" w:type="pct"/>
+                  <w:tcBorders>
+                    <w:top w:val="single" w:sz="7" w:space="0" w:color="D3D3D3"/>
+                    <w:left w:val="single" w:sz="7" w:space="0" w:color="D3D3D3"/>
+                    <w:bottom w:val="single" w:sz="7" w:space="0" w:color="D3D3D3"/>
+                    <w:right w:val="single" w:sz="7" w:space="0" w:color="D3D3D3"/>
+                  </w:tcBorders>
+                  <w:shd w:val="clear" w:color="auto" w:fill="FF0000"/>
+                  <w:tcMar>
+                    <w:top w:w="39" w:type="dxa"/>
+                    <w:left w:w="39" w:type="dxa"/>
+                    <w:bottom w:w="39" w:type="dxa"/>
+                    <w:right w:w="39" w:type="dxa"/>
+                  </w:tcMar>
+                </w:tcPr>
+                <w:p>
+                  <w:pPr>
+                    <w:spacing w:after="0" w:line="240" w:lineRule="auto"/>
+                    <w:rPr>
+                      <w:rFonts w:ascii="Segoe UI" w:hAnsi="Segoe UI" w:cs="Segoe UI"/>
+                    </w:rPr>
+                  </w:pPr>
+                  <w:proofErr w:type="spellStart"/>
+                  <w:r>
+                    <w:rPr>
+                      <w:rFonts w:ascii="Segoe UI" w:eastAsia="Segoe UI" w:hAnsi="Segoe UI" w:cs="Segoe UI"/>
+                      <w:color w:val="000000"/>
+                      <w:sz w:val="16"/>
+                    </w:rPr>
+                    <w:t>Fail</w:t>
+                  </w:r>
+                  <w:proofErr w:type="spellEnd"/>
+                  <w:r>
+                    <w:rPr>
+                      <w:rFonts w:ascii="Segoe UI" w:eastAsia="Segoe UI" w:hAnsi="Segoe UI" w:cs="Segoe UI"/>
+                      <w:color w:val="000000"/>
+                      <w:sz w:val="16"/>
+                    </w:rPr>
+                    <w:t xml:space="preserve"> (&gt;30% Desviación)</w:t>
+                  </w:r>
+                </w:p>
+              </w:tc>
+              <w:tc>
+                <w:tcPr>
+                  <w:tcW w:w="1141" w:type="pct"/>
+                  <w:tcBorders>
+                    <w:top w:val="single" w:sz="7" w:space="0" w:color="D3D3D3"/>
+                    <w:left w:val="single" w:sz="7" w:space="0" w:color="D3D3D3"/>
+                    <w:bottom w:val="single" w:sz="7" w:space="0" w:color="D3D3D3"/>
+                    <w:right w:val="single" w:sz="7" w:space="0" w:color="D3D3D3"/>
+                  </w:tcBorders>
+                  <w:tcMar>
+                    <w:top w:w="39" w:type="dxa"/>
+                    <w:left w:w="39" w:type="dxa"/>
+                    <w:bottom w:w="39" w:type="dxa"/>
+                    <w:right w:w="39" w:type="dxa"/>
+                  </w:tcMar>
+                </w:tcPr>
+                <w:p>
+                  <w:pPr>
+                    <w:spacing w:after="0" w:line="240" w:lineRule="auto"/>
+                    <w:rPr>
+                      <w:rFonts w:ascii="Segoe UI" w:hAnsi="Segoe UI" w:cs="Segoe UI"/>
+                    </w:rPr>
+                  </w:pPr>
+                  <w:proofErr w:type="spellStart"/>
+                  <w:r>
+                    <w:rPr>
+                      <w:rFonts w:ascii="Segoe UI" w:eastAsia="Segoe UI" w:hAnsi="Segoe UI" w:cs="Segoe UI"/>
+                      <w:color w:val="000000"/>
+                      <w:sz w:val="16"/>
+                    </w:rPr>
+                    <w:t>Resistance</w:t>
+                  </w:r>
+                  <w:proofErr w:type="spellEnd"/>
+                </w:p>
+              </w:tc>
+              <w:tc>
+                <w:tcPr>
+                  <w:tcW w:w="671" w:type="pct"/>
+                  <w:tcBorders>
+                    <w:top w:val="single" w:sz="7" w:space="0" w:color="D3D3D3"/>
+                    <w:left w:val="single" w:sz="7" w:space="0" w:color="D3D3D3"/>
+                    <w:bottom w:val="single" w:sz="7" w:space="0" w:color="D3D3D3"/>
+                    <w:right w:val="single" w:sz="7" w:space="0" w:color="D3D3D3"/>
+                  </w:tcBorders>
+                  <w:shd w:val="clear" w:color="auto" w:fill="FFFFFF"/>
+                  <w:tcMar>
+                    <w:top w:w="39" w:type="dxa"/>
+                    <w:left w:w="39" w:type="dxa"/>
+                    <w:bottom w:w="39" w:type="dxa"/>
+                    <w:right w:w="39" w:type="dxa"/>
+                  </w:tcMar>
+                </w:tcPr>
+                <w:p>
+                  <w:pPr>
+                    <w:spacing w:after="0" w:line="240" w:lineRule="auto"/>
+                    <w:jc w:val="center"/>
+                    <w:rPr>
+                      <w:rFonts w:ascii="Segoe UI" w:eastAsia="Segoe UI" w:hAnsi="Segoe UI" w:cs="Segoe UI"/>
+                      <w:color w:val="000000"/>
+                      <w:sz w:val="16"/>
+                    </w:rPr>
+                  </w:pPr>
+                  <w:r>
+                    <w:rPr>
+                      <w:rFonts w:ascii="Segoe UI" w:eastAsia="Segoe UI" w:hAnsi="Segoe UI" w:cs="Segoe UI"/>
+                      <w:color w:val="000000"/>
+                      <w:sz w:val="16"/>
+                    </w:rPr>
+                    <w:t xml:space="preserve">{{BAT_RES_FAIL}} </w:t>
+                  </w:r>
+                  <w:r>
+                    <w:rPr>
+                      <w:rFonts w:ascii="Segoe UI" w:eastAsia="Segoe UI" w:hAnsi="Segoe UI" w:cs="Segoe UI"/>
+                      <w:color w:val="000000"/>
+                      <w:sz w:val="16"/>
+                    </w:rPr>
+                    <w:t>m</w:t>
+                  </w:r>
+                  <w:r>
+                    <w:rPr>
+                      <w:rFonts w:ascii="Segoe UI" w:hAnsi="Segoe UI" w:cs="Segoe UI"/>
+                    </w:rPr>
+                    <w:t xml:space="preserve"> </w:t>
+                  </w:r>
+                  <w:r>
+                    <w:rPr>
+                      <w:rFonts w:ascii="Segoe UI" w:eastAsia="Segoe UI" w:hAnsi="Segoe UI" w:cs="Segoe UI"/>
+                      <w:color w:val="000000"/>
+                      <w:sz w:val="16"/>
+                    </w:rPr>
+                    <w:t>Ω</w:t>
+                  </w:r>
+                </w:p>
+              </w:tc>
+              <w:tc>
+                <w:tcPr>
+                  <w:tcW w:w="640" w:type="pct"/>
+                  <w:tcBorders>
+                    <w:top w:val="single" w:sz="7" w:space="0" w:color="D3D3D3"/>
+                    <w:left w:val="single" w:sz="7" w:space="0" w:color="D3D3D3"/>
+                    <w:bottom w:val="single" w:sz="7" w:space="0" w:color="D3D3D3"/>
+                    <w:right w:val="single" w:sz="7" w:space="0" w:color="D3D3D3"/>
+                  </w:tcBorders>
+                  <w:shd w:val="clear" w:color="auto" w:fill="FFFFFF"/>
+                  <w:tcMar>
+                    <w:top w:w="39" w:type="dxa"/>
+                    <w:left w:w="39" w:type="dxa"/>
+                    <w:bottom w:w="39" w:type="dxa"/>
+                    <w:right w:w="39" w:type="dxa"/>
+                  </w:tcMar>
+                </w:tcPr>
+                <w:p>
+                  <w:pPr>
+                    <w:jc w:val="center"/>
+                    <w:rPr>
+                      <w:rFonts w:ascii="Segoe UI" w:hAnsi="Segoe UI" w:cs="Segoe UI"/>
+                      <w:sz w:val="16"/>
+                      <w:szCs w:val="16"/>
+                    </w:rPr>
+                  </w:pPr>
+                  <w:r>
+                    <w:rPr>
+                      <w:rFonts w:ascii="Segoe UI" w:hAnsi="Segoe UI" w:cs="Segoe UI"/>
+                      <w:sz w:val="16"/>
+                      <w:szCs w:val="16"/>
+                    </w:rPr>
+                    <w:t xml:space="preserve">{{BAT_TOTAL_FAIL}}</w:t>
+                  </w:r>
+                </w:p>
+              </w:tc>
+              <w:tc>
+                <w:tcPr>
+                  <w:tcW w:w="1133" w:type="pct"/>
+                  <w:tcBorders>
+                    <w:top w:val="single" w:sz="7" w:space="0" w:color="D3D3D3"/>
+                    <w:left w:val="single" w:sz="7" w:space="0" w:color="D3D3D3"/>
+                    <w:bottom w:val="single" w:sz="7" w:space="0" w:color="D3D3D3"/>
+                    <w:right w:val="single" w:sz="7" w:space="0" w:color="D3D3D3"/>
+                  </w:tcBorders>
+                  <w:shd w:val="clear" w:color="auto" w:fill="FFFFFF"/>
+                  <w:tcMar>
+                    <w:top w:w="39" w:type="dxa"/>
+                    <w:left w:w="39" w:type="dxa"/>
+                    <w:bottom w:w="39" w:type="dxa"/>
+                    <w:right w:w="39" w:type="dxa"/>
+                  </w:tcMar>
+                </w:tcPr>
+                <w:p>
+                  <w:pPr>
+                    <w:jc w:val="center"/>
+                    <w:rPr>
+                      <w:rFonts w:ascii="Segoe UI" w:hAnsi="Segoe UI" w:cs="Segoe UI"/>
+                    </w:rPr>
+                  </w:pPr>
+                  <w:r>
+                    <w:rPr>
+                      <w:rFonts w:ascii="Segoe UI" w:eastAsia="Segoe UI" w:hAnsi="Segoe UI" w:cs="Segoe UI"/>
+                      <w:color w:val="000000"/>
+                      <w:sz w:val="16"/>
+                    </w:rPr>
+                    <w:t>Degradadas</w:t>
+                  </w:r>
+                </w:p>
+              </w:tc>
+            </w:tr>
+          </w:tbl>
+          <w:p>
+            <w:pPr>
+              <w:spacing w:after="0" w:line="240" w:lineRule="auto"/>
+            </w:pPr>
+          </w:p>
+        </w:tc>
+      </w:tr>
+      <w:tr>
+        <w:trPr>
+          <w:trHeight w:val="113"/>
+        </w:trPr>
+        <w:tc>
+          <w:tcPr>
+            <w:tcW w:w="215" w:type="dxa"/>
+          </w:tcPr>
+          <w:p>
+            <w:pPr>
+              <w:spacing w:after="0" w:line="240" w:lineRule="auto"/>
+            </w:pPr>
+          </w:p>
+        </w:tc>
+        <w:tc>
+          <w:tcPr>
+            <w:tcW w:w="9762" w:type="dxa"/>
+          </w:tcPr>
+          <w:p>
+            <w:pPr>
+              <w:spacing w:after="0" w:line="240" w:lineRule="auto"/>
+            </w:pPr>
+          </w:p>
+          <w:p>
+            <w:pPr>
+              <w:spacing w:after="0" w:line="240" w:lineRule="auto"/>
+            </w:pPr>
+          </w:p>
+        </w:tc>
+        <w:tc>
+          <w:tcPr>
+            <w:tcW w:w="22" w:type="dxa"/>
+          </w:tcPr>
+          <w:p>
+            <w:pPr>
+              <w:spacing w:after="0" w:line="240" w:lineRule="auto"/>
+            </w:pPr>
+          </w:p>
+        </w:tc>
+      </w:tr>
+      <w:tr>
+        <w:tc>
+          <w:tcPr>
+            <w:tcW w:w="215" w:type="dxa"/>
+            <w:gridSpan w:val="2"/>
+          </w:tcPr>
+          <w:p>
+            <w:pPr>
+              <w:spacing w:after="0" w:line="240" w:lineRule="auto"/>
+            </w:pPr>
+          </w:p>
+        </w:tc>
+        <w:tc>
+          <w:tcPr>
+            <w:tcW w:w="22" w:type="dxa"/>
+          </w:tcPr>
+          <w:p>
+            <w:pPr>
+              <w:spacing w:after="0" w:line="240" w:lineRule="auto"/>
+            </w:pPr>
+          </w:p>
+        </w:tc>
+      </w:tr>
+    </w:tbl>
+    <w:p/>
+    <w:p>
       <w:r>
         <w:br w:type="page"/>
       </w:r>

</xml_diff>

<commit_message>
Elimina la sección "Rutina de Servicio de Mantención Preventiva" de la plantilla
Registro fotográfico pasa a ser la sección 5 y Registro de hoja de trabajo la
6; el informe queda de 7 páginas.

Co-Authored-By: Claude Opus 5.5 <noreply@anthropic.com>
</commit_message>
<xml_diff>
--- a/backend/plantillas/fricke_mantencion.docx
+++ b/backend/plantillas/fricke_mantencion.docx
@@ -3489,79 +3489,6 @@
         <w:rPr>
           <w:noProof/>
         </w:rPr>
-        <w:t>Rutina de Servicio de Mantención Preventiva</w:t>
-      </w:r>
-      <w:r>
-        <w:rPr>
-          <w:noProof/>
-        </w:rPr>
-        <w:tab/>
-      </w:r>
-      <w:r>
-        <w:rPr>
-          <w:noProof/>
-        </w:rPr>
-        <w:fldChar w:fldCharType="begin"/>
-      </w:r>
-      <w:r>
-        <w:rPr>
-          <w:noProof/>
-        </w:rPr>
-        <w:instrText xml:space="preserve"> PAGEREF _Toc59616377 \h </w:instrText>
-      </w:r>
-      <w:r>
-        <w:rPr>
-          <w:noProof/>
-        </w:rPr>
-      </w:r>
-      <w:r>
-        <w:rPr>
-          <w:noProof/>
-        </w:rPr>
-        <w:fldChar w:fldCharType="separate"/>
-      </w:r>
-      <w:r>
-        <w:rPr>
-          <w:noProof/>
-        </w:rPr>
-        <w:t>6</w:t>
-      </w:r>
-      <w:r>
-        <w:rPr>
-          <w:noProof/>
-        </w:rPr>
-        <w:fldChar w:fldCharType="end"/>
-      </w:r>
-    </w:p>
-    <w:p>
-      <w:pPr>
-        <w:pStyle w:val="TDC1"/>
-        <w:rPr>
-          <w:rFonts w:asciiTheme="minorHAnsi" w:eastAsiaTheme="minorEastAsia" w:hAnsiTheme="minorHAnsi" w:cstheme="minorBidi"/>
-          <w:noProof/>
-          <w:szCs w:val="22"/>
-          <w:lang w:val="es-CL" w:eastAsia="es-CL"/>
-        </w:rPr>
-      </w:pPr>
-      <w:r>
-        <w:rPr>
-          <w:noProof/>
-        </w:rPr>
-        <w:t>6</w:t>
-      </w:r>
-      <w:r>
-        <w:rPr>
-          <w:rFonts w:asciiTheme="minorHAnsi" w:eastAsiaTheme="minorEastAsia" w:hAnsiTheme="minorHAnsi" w:cstheme="minorBidi"/>
-          <w:noProof/>
-          <w:szCs w:val="22"/>
-          <w:lang w:val="es-CL" w:eastAsia="es-CL"/>
-        </w:rPr>
-        <w:tab/>
-      </w:r>
-      <w:r>
-        <w:rPr>
-          <w:noProof/>
-        </w:rPr>
         <w:t>Registro fotográfico</w:t>
       </w:r>
       <w:r>
@@ -3597,7 +3524,7 @@
         <w:rPr>
           <w:noProof/>
         </w:rPr>
-        <w:t>8</w:t>
+        <w:t>6</w:t>
       </w:r>
       <w:r>
         <w:rPr>
@@ -3620,7 +3547,7 @@
         <w:rPr>
           <w:noProof/>
         </w:rPr>
-        <w:t>7</w:t>
+        <w:t>6</w:t>
       </w:r>
       <w:r>
         <w:rPr>
@@ -3670,7 +3597,7 @@
         <w:rPr>
           <w:noProof/>
         </w:rPr>
-        <w:t>9</w:t>
+        <w:t>7</w:t>
       </w:r>
       <w:r>
         <w:rPr>
@@ -6908,454 +6835,6 @@
       <w:pPr>
         <w:pStyle w:val="Ttulo1"/>
       </w:pPr>
-      <w:bookmarkStart w:id="8" w:name="_Toc59616377"/>
-      <w:r>
-        <w:lastRenderedPageBreak/>
-        <w:t>Rutina de Servicio de Mantención Preventiva</w:t>
-      </w:r>
-      <w:bookmarkEnd w:id="8"/>
-    </w:p>
-    <w:p>
-      <w:pPr>
-        <w:pStyle w:val="Ttulo2"/>
-      </w:pPr>
-      <w:r>
-        <w:t xml:space="preserve">Manutención. </w:t>
-      </w:r>
-    </w:p>
-    <w:p>
-      <w:pPr>
-        <w:pStyle w:val="Prrafodelista"/>
-        <w:numPr>
-          <w:ilvl w:val="0"/>
-          <w:numId w:val="22"/>
-        </w:numPr>
-      </w:pPr>
-      <w:r>
-        <w:t xml:space="preserve">Limpieza de partes y piezas de la unidad, aspiración y lavado con alcohol isopropílico. </w:t>
-      </w:r>
-    </w:p>
-    <w:p>
-      <w:pPr>
-        <w:pStyle w:val="Prrafodelista"/>
-        <w:numPr>
-          <w:ilvl w:val="0"/>
-          <w:numId w:val="22"/>
-        </w:numPr>
-      </w:pPr>
-      <w:r>
-        <w:t xml:space="preserve">Test de aislación y continuidad de acuerdo con rutina de partida lenta. </w:t>
-      </w:r>
-    </w:p>
-    <w:p>
-      <w:pPr>
-        <w:pStyle w:val="Prrafodelista"/>
-        <w:numPr>
-          <w:ilvl w:val="0"/>
-          <w:numId w:val="22"/>
-        </w:numPr>
-      </w:pPr>
-      <w:r>
-        <w:t xml:space="preserve">Limpieza de módulos rectificadores, inversor y By- Pass estático, gabinetes y distribuidores. </w:t>
-      </w:r>
-    </w:p>
-    <w:p>
-      <w:pPr>
-        <w:pStyle w:val="Prrafodelista"/>
-        <w:numPr>
-          <w:ilvl w:val="0"/>
-          <w:numId w:val="22"/>
-        </w:numPr>
-      </w:pPr>
-      <w:r>
-        <w:t xml:space="preserve">Reapriete a Tablero de Comando (Alimentación de UPS) </w:t>
-      </w:r>
-    </w:p>
-    <w:p>
-      <w:pPr>
-        <w:pStyle w:val="Prrafodelista"/>
-        <w:numPr>
-          <w:ilvl w:val="0"/>
-          <w:numId w:val="22"/>
-        </w:numPr>
-      </w:pPr>
-      <w:r>
-        <w:t xml:space="preserve">Verificación de cableado y operación de By-Pass externo </w:t>
-      </w:r>
-    </w:p>
-    <w:p>
-      <w:pPr>
-        <w:pStyle w:val="Prrafodelista"/>
-        <w:numPr>
-          <w:ilvl w:val="0"/>
-          <w:numId w:val="22"/>
-        </w:numPr>
-      </w:pPr>
-      <w:r>
-        <w:t xml:space="preserve">Limpieza de filtros de aire. </w:t>
-      </w:r>
-    </w:p>
-    <w:p>
-      <w:pPr>
-        <w:pStyle w:val="Prrafodelista"/>
-        <w:numPr>
-          <w:ilvl w:val="0"/>
-          <w:numId w:val="22"/>
-        </w:numPr>
-      </w:pPr>
-      <w:r>
-        <w:t xml:space="preserve">Reapriete de borneras, conectores a torque especificado por el Fabricante </w:t>
-      </w:r>
-    </w:p>
-    <w:p>
-      <w:pPr>
-        <w:pStyle w:val="Prrafodelista"/>
-        <w:numPr>
-          <w:ilvl w:val="0"/>
-          <w:numId w:val="22"/>
-        </w:numPr>
-      </w:pPr>
-      <w:r>
-        <w:t xml:space="preserve">Reapriete de cables de potencia, barras, módulos. </w:t>
-      </w:r>
-    </w:p>
-    <w:p>
-      <w:pPr>
-        <w:pStyle w:val="Prrafodelista"/>
-        <w:numPr>
-          <w:ilvl w:val="0"/>
-          <w:numId w:val="22"/>
-        </w:numPr>
-      </w:pPr>
-      <w:r>
-        <w:t>Pruebas de funcionamiento con carga (del cliente) y pruebas de respaldo</w:t>
-      </w:r>
-    </w:p>
-    <w:p>
-      <w:pPr>
-        <w:pStyle w:val="Ttulo2"/>
-      </w:pPr>
-      <w:r>
-        <w:t>Pruebas por etapas y verificación de los siguientes parámetros.</w:t>
-      </w:r>
-    </w:p>
-    <w:p>
-      <w:pPr>
-        <w:spacing w:line="240" w:lineRule="auto"/>
-      </w:pPr>
-      <w:r>
-        <w:t xml:space="preserve">A nivel de Rectificador; </w:t>
-      </w:r>
-    </w:p>
-    <w:p>
-      <w:pPr>
-        <w:pStyle w:val="Prrafodelista"/>
-        <w:numPr>
-          <w:ilvl w:val="1"/>
-          <w:numId w:val="20"/>
-        </w:numPr>
-        <w:tabs>
-          <w:tab w:val="left" w:pos="426"/>
-        </w:tabs>
-        <w:ind w:left="284" w:hanging="284"/>
-      </w:pPr>
-      <w:r>
-        <w:t xml:space="preserve">Verificación de niveles de sobre y baja tensión de red. </w:t>
-      </w:r>
-    </w:p>
-    <w:p>
-      <w:pPr>
-        <w:pStyle w:val="Prrafodelista"/>
-        <w:numPr>
-          <w:ilvl w:val="1"/>
-          <w:numId w:val="20"/>
-        </w:numPr>
-        <w:tabs>
-          <w:tab w:val="left" w:pos="426"/>
-        </w:tabs>
-        <w:ind w:left="284" w:hanging="284"/>
-      </w:pPr>
-      <w:r>
-        <w:t xml:space="preserve">Verificación de alarmas </w:t>
-      </w:r>
-    </w:p>
-    <w:p>
-      <w:pPr>
-        <w:pStyle w:val="Prrafodelista"/>
-        <w:numPr>
-          <w:ilvl w:val="1"/>
-          <w:numId w:val="20"/>
-        </w:numPr>
-        <w:tabs>
-          <w:tab w:val="left" w:pos="426"/>
-        </w:tabs>
-        <w:ind w:left="284" w:hanging="284"/>
-      </w:pPr>
-      <w:r>
-        <w:t xml:space="preserve">Verificación de condiciones de carga de baterías, estos es flote, ripley, limitación de corriente de recarga de baterías. </w:t>
-      </w:r>
-    </w:p>
-    <w:p>
-      <w:pPr>
-        <w:pStyle w:val="Prrafodelista"/>
-        <w:numPr>
-          <w:ilvl w:val="1"/>
-          <w:numId w:val="20"/>
-        </w:numPr>
-        <w:tabs>
-          <w:tab w:val="left" w:pos="426"/>
-        </w:tabs>
-        <w:ind w:left="284" w:hanging="284"/>
-      </w:pPr>
-      <w:r>
-        <w:t xml:space="preserve">Verificación de tarjetas driver, pulsos de disparo. </w:t>
-      </w:r>
-    </w:p>
-    <w:p>
-      <w:pPr>
-        <w:spacing w:line="240" w:lineRule="auto"/>
-      </w:pPr>
-      <w:r>
-        <w:t xml:space="preserve">A nivel de Inversor; </w:t>
-      </w:r>
-    </w:p>
-    <w:p>
-      <w:pPr>
-        <w:pStyle w:val="Prrafodelista"/>
-        <w:numPr>
-          <w:ilvl w:val="0"/>
-          <w:numId w:val="23"/>
-        </w:numPr>
-      </w:pPr>
-      <w:r>
-        <w:t xml:space="preserve">Niveles de tensión por fase de salida </w:t>
-      </w:r>
-    </w:p>
-    <w:p>
-      <w:pPr>
-        <w:pStyle w:val="Prrafodelista"/>
-        <w:numPr>
-          <w:ilvl w:val="0"/>
-          <w:numId w:val="23"/>
-        </w:numPr>
-      </w:pPr>
-      <w:r>
-        <w:t xml:space="preserve">Alarmas por falla de inversor </w:t>
-      </w:r>
-    </w:p>
-    <w:p>
-      <w:pPr>
-        <w:pStyle w:val="Prrafodelista"/>
-        <w:numPr>
-          <w:ilvl w:val="0"/>
-          <w:numId w:val="23"/>
-        </w:numPr>
-      </w:pPr>
-      <w:r>
-        <w:t xml:space="preserve">Sincronismo con línea de By-Pass </w:t>
-      </w:r>
-    </w:p>
-    <w:p>
-      <w:pPr>
-        <w:pStyle w:val="Prrafodelista"/>
-        <w:numPr>
-          <w:ilvl w:val="0"/>
-          <w:numId w:val="23"/>
-        </w:numPr>
-      </w:pPr>
-      <w:r>
-        <w:t xml:space="preserve">Operación por baterías </w:t>
-      </w:r>
-    </w:p>
-    <w:p>
-      <w:pPr>
-        <w:pStyle w:val="Prrafodelista"/>
-        <w:numPr>
-          <w:ilvl w:val="0"/>
-          <w:numId w:val="23"/>
-        </w:numPr>
-      </w:pPr>
-      <w:r>
-        <w:t>Verificación de tarjetas driver, pulsos de disparo</w:t>
-      </w:r>
-    </w:p>
-    <w:p>
-      <w:pPr>
-        <w:spacing w:line="240" w:lineRule="auto"/>
-      </w:pPr>
-      <w:r>
-        <w:t xml:space="preserve"> A nivel de By-Pass; </w:t>
-      </w:r>
-    </w:p>
-    <w:p>
-      <w:pPr>
-        <w:pStyle w:val="Prrafodelista"/>
-        <w:numPr>
-          <w:ilvl w:val="0"/>
-          <w:numId w:val="24"/>
-        </w:numPr>
-      </w:pPr>
-      <w:r>
-        <w:t xml:space="preserve">Verificación de operación de transferencia y </w:t>
-      </w:r>
-      <w:r>
-        <w:t>retransferencia</w:t>
-      </w:r>
-      <w:r>
-        <w:t xml:space="preserve"> con Inversor </w:t>
-      </w:r>
-    </w:p>
-    <w:p>
-      <w:pPr>
-        <w:pStyle w:val="Prrafodelista"/>
-        <w:numPr>
-          <w:ilvl w:val="0"/>
-          <w:numId w:val="24"/>
-        </w:numPr>
-      </w:pPr>
-      <w:r>
-        <w:t xml:space="preserve">Verificación de transferencia y By-Pass de Mantención </w:t>
-      </w:r>
-    </w:p>
-    <w:p>
-      <w:pPr>
-        <w:pStyle w:val="Prrafodelista"/>
-        <w:numPr>
-          <w:ilvl w:val="0"/>
-          <w:numId w:val="24"/>
-        </w:numPr>
-      </w:pPr>
-      <w:r>
-        <w:t xml:space="preserve">Verificación de niveles de aceptación de Voltaje de entrada </w:t>
-      </w:r>
-    </w:p>
-    <w:p>
-      <w:pPr>
-        <w:pStyle w:val="Prrafodelista"/>
-        <w:numPr>
-          <w:ilvl w:val="0"/>
-          <w:numId w:val="24"/>
-        </w:numPr>
-      </w:pPr>
-      <w:r>
-        <w:t xml:space="preserve">Verificación de tarjetas driver, pulsos de disparo </w:t>
-      </w:r>
-    </w:p>
-    <w:p>
-      <w:pPr>
-        <w:spacing w:line="240" w:lineRule="auto"/>
-      </w:pPr>
-    </w:p>
-    <w:p>
-      <w:pPr>
-        <w:spacing w:line="240" w:lineRule="auto"/>
-      </w:pPr>
-    </w:p>
-    <w:p>
-      <w:pPr>
-        <w:spacing w:line="240" w:lineRule="auto"/>
-      </w:pPr>
-    </w:p>
-    <w:p>
-      <w:pPr>
-        <w:pStyle w:val="Ttulo2"/>
-      </w:pPr>
-      <w:r>
-        <w:lastRenderedPageBreak/>
-        <w:t xml:space="preserve">Test Generales; </w:t>
-      </w:r>
-    </w:p>
-    <w:p>
-      <w:pPr>
-        <w:pStyle w:val="Prrafodelista"/>
-        <w:numPr>
-          <w:ilvl w:val="0"/>
-          <w:numId w:val="25"/>
-        </w:numPr>
-      </w:pPr>
-      <w:r>
-        <w:t xml:space="preserve">Verificación de voltajes en fuentes de poder. </w:t>
-      </w:r>
-    </w:p>
-    <w:p>
-      <w:pPr>
-        <w:pStyle w:val="Prrafodelista"/>
-        <w:numPr>
-          <w:ilvl w:val="0"/>
-          <w:numId w:val="25"/>
-        </w:numPr>
-      </w:pPr>
-      <w:r>
-        <w:t xml:space="preserve">Verificación de alarmas en panel sinóptico </w:t>
-      </w:r>
-    </w:p>
-    <w:p>
-      <w:pPr>
-        <w:pStyle w:val="Prrafodelista"/>
-        <w:numPr>
-          <w:ilvl w:val="0"/>
-          <w:numId w:val="25"/>
-        </w:numPr>
-      </w:pPr>
-      <w:r>
-        <w:t xml:space="preserve">Accionamiento de sensores de temperatura (Si Corresponde) </w:t>
-      </w:r>
-    </w:p>
-    <w:p>
-      <w:pPr>
-        <w:pStyle w:val="Prrafodelista"/>
-        <w:numPr>
-          <w:ilvl w:val="0"/>
-          <w:numId w:val="25"/>
-        </w:numPr>
-      </w:pPr>
-      <w:r>
-        <w:t xml:space="preserve">Reapriete de cables de potencia, barras, </w:t>
-      </w:r>
-      <w:r>
-        <w:t>módulos</w:t>
-      </w:r>
-      <w:r>
-        <w:t xml:space="preserve"> </w:t>
-      </w:r>
-    </w:p>
-    <w:p>
-      <w:pPr>
-        <w:pStyle w:val="Prrafodelista"/>
-        <w:numPr>
-          <w:ilvl w:val="0"/>
-          <w:numId w:val="25"/>
-        </w:numPr>
-      </w:pPr>
-      <w:r>
-        <w:t xml:space="preserve">Limpieza de ventiladores </w:t>
-      </w:r>
-    </w:p>
-    <w:p>
-      <w:pPr>
-        <w:pStyle w:val="Prrafodelista"/>
-        <w:numPr>
-          <w:ilvl w:val="0"/>
-          <w:numId w:val="25"/>
-        </w:numPr>
-      </w:pPr>
-      <w:r>
-        <w:t xml:space="preserve">Limpieza de filtros de aire </w:t>
-      </w:r>
-    </w:p>
-    <w:p>
-      <w:pPr>
-        <w:spacing w:after="0" w:line="240" w:lineRule="auto"/>
-        <w:jc w:val="left"/>
-      </w:pPr>
-      <w:r>
-        <w:br w:type="page"/>
-      </w:r>
-    </w:p>
-    <w:p>
-      <w:pPr>
-        <w:pStyle w:val="Ttulo1"/>
-      </w:pPr>
       <w:bookmarkStart w:id="9" w:name="_Toc59616378"/>
       <w:bookmarkEnd w:id="7"/>
       <w:r>

</xml_diff>